<commit_message>
hardware: revise P1-LV with E24 resistors and selection guide
</commit_message>
<xml_diff>
--- a/docs/guides/motortester-input-guide-ru.docx
+++ b/docs/guides/motortester-input-guide-ru.docx
@@ -17,7 +17,7 @@
     </w:p>
     <w:p>
       <w:r>
-        <w:t>Редакция 1 от 20 октября 2026 года. Основание — схемы и расчёты V2 на версии c283631. Для Александра, знакомого с резисторами, конденсаторами, диодами и питанием, но впервые работающего с измерительными усилителями.</w:t>
+        <w:t>Редакция 2 от 21 октября 2026 года. Схема P1-LV r2 с распространёнными номиналами E24 и раздельными требованиями к резисторам 1% и 5%. Для Александра, знакомого с резисторами, конденсаторами, диодами и питанием, но впервые работающего с измерительными усилителями.</w:t>
       </w:r>
     </w:p>
     <w:p>
@@ -40,7 +40,7 @@
     </w:p>
     <w:p>
       <w:r>
-        <w:t>Сначала прочитайте разделы 1–4: они дают основу для понимания схем. Разделы 5–10 объясняют P1-LV и его соединения. Разделы 11–13 показывают, чем будущий датчик и старые варианты отличаются от этого макета. Разделы 14–17 посвящены проверке, калибровке и работе с приложением. В конце есть словарь и источники.</w:t>
+        <w:t>Сначала прочитайте разделы 1–4: они дают основу для понимания схем. Разделы 5–10 объясняют P1-LV и его соединения, а новые 6а/6б — резисторы и их отбор. Разделы 11–13 показывают будущий датчик и старые варианты. Разделы 14–17 посвящены проверке, калибровке и приложению. В конце есть словарь и источники.</w:t>
       </w:r>
     </w:p>
     <w:p>
@@ -779,7 +779,7 @@
     </w:p>
     <w:p>
       <w:r>
-        <w:t>Предположим, питание и опора АЦП равны 3,3 В. Он не измеряет отрицательную часть сигнала напрямую. Чтобы перенести сигнал в положительную область, схема уменьшает его и добавляет постоянный уровень около 1,65 В.</w:t>
+        <w:t>Предположим, питание и опора АЦП равны 3,3 В. Он не измеряет отрицательную часть сигнала напрямую. Чтобы перенести сигнал в положительную область, схема уменьшает его и добавляет постоянный уровень около середины питания.</w:t>
       </w:r>
     </w:p>
     <w:p>
@@ -792,12 +792,12 @@
         <w:rPr>
           <w:b/>
         </w:rPr>
-        <w:t>U_ADC = 0,1247808 × U_CH1 + 1,650413 В</w:t>
+        <w:t>U_ADC = 0,1198910 × U_CH1 + 1,681471 В</w:t>
       </w:r>
     </w:p>
     <w:p>
       <w:r>
-        <w:t>Это расчёт при V_A = 3,300 В. Число 0,1247808 означает ослабление примерно в восемь раз. Слагаемое 1,650413 В — смещение. Оба действия выполняются физическими резисторами до первого буфера.</w:t>
+        <w:t>Это расчёт при V_A = 3,300 В. Число 0,1198910 означает ослабление примерно в 8,34 раза. Слагаемое 1,681471 В — смещение. Оба действия выполняются физическими резисторами до первого буфера.</w:t>
       </w:r>
     </w:p>
     <w:p>
@@ -997,7 +997,7 @@
               <w:rPr>
                 <w:sz w:val="19"/>
               </w:rPr>
-              <w:t>1,6504 В</w:t>
+              <w:t>1,6815 В</w:t>
             </w:r>
           </w:p>
         </w:tc>
@@ -1074,7 +1074,7 @@
               <w:rPr>
                 <w:sz w:val="19"/>
               </w:rPr>
-              <w:t>1,7003 В</w:t>
+              <w:t>1,7294 В</w:t>
             </w:r>
           </w:p>
         </w:tc>
@@ -1098,7 +1098,7 @@
               <w:rPr>
                 <w:sz w:val="19"/>
               </w:rPr>
-              <w:t>Увеличение входа на 0,4 В дало около 0,0499 В на АЦП</w:t>
+              <w:t>Увеличение входа на 0,4 В дало около 0,0480 В на АЦП</w:t>
             </w:r>
           </w:p>
         </w:tc>
@@ -1151,7 +1151,7 @@
               <w:rPr>
                 <w:sz w:val="19"/>
               </w:rPr>
-              <w:t>1,7502 В</w:t>
+              <w:t>1,7774 В</w:t>
             </w:r>
           </w:p>
         </w:tc>
@@ -1298,7 +1298,7 @@
     </w:p>
     <w:p>
       <w:r>
-        <w:t>Сигнальная цепь начинается так: CH1 → R1 499 кОм → IN_MID → R2 499 кОм → SUM. К SUM также подключены R3 249 кОм от V_A и R4 332 кОм к AGND. R1 и R2 вместе дают 998 кОм. Их разбиение на две детали не означает подтверждённую защиту от высокого напряжения.</w:t>
+        <w:t>Сигнальная цепь начинается так: CH1 → R1 510 кОм → IN_MID → R2 510 кОм → SUM. К SUM также подключены R3 240 кОм от V_A и R4 330 кОм к AGND. R1 и R2 вместе дают 1,02 МОм. Их разбиение на две детали не означает подтверждённую защиту от высокого напряжения.</w:t>
       </w:r>
     </w:p>
     <w:p>
@@ -1356,7 +1356,7 @@
     </w:p>
     <w:p>
       <w:r>
-        <w:t>Если хочется проверить формулу, сначала объедините R1 + R2 в Rs = 998 кОм, а затем запишите:</w:t>
+        <w:t>Если хочется проверить формулу, сначала объедините R1 + R2 в Rs = 1,02 МОм, а затем запишите:</w:t>
       </w:r>
     </w:p>
     <w:p>
@@ -1369,7 +1369,7 @@
     </w:p>
     <w:p>
       <w:r>
-        <w:t>Сопротивления подставляются в одинаковых единицах. Член от земли равен нулю. Отношения сопротивлений определяют масштаб; поэтому для R1–R4 предусмотрены допуск 0,1% и малый температурный коэффициент. Калибровка может уточнить масштаб и ноль, но не исправляет любое изменение параметров при нагреве.</w:t>
+        <w:t>Сопротивления подставляются в одинаковых единицах. Член от земли равен нулю. Отношения сопротивлений определяют масштаб; поэтому для R1–R4 предусмотрены допуск 1% и температурный коэффициент не более 25 ppm/°C. Калибровка может уточнить масштаб и ноль, но не исправляет любое изменение параметров при нагреве.</w:t>
       </w:r>
     </w:p>
     <w:p>
@@ -1385,12 +1385,845 @@
         <w:t>Что происходит с открытым входом.</w:t>
       </w:r>
       <w:r>
-        <w:t xml:space="preserve"> Если CH1 никуда не подключён, цепь R3/R4 подтягивает его примерно к 1,886 В при V_A = 3,3 В. Поэтому «снять провод» не означает «подать ноль». Для нуля в лабораторном опыте CH1 соединяется с AGND через выбор ZERO.</w:t>
+        <w:t xml:space="preserve"> Если CH1 никуда не подключён, цепь R3/R4 подтягивает его примерно к 1,911 В при V_A = 3,3 В. Поэтому «снять провод» не означает «подать ноль». Для нуля в лабораторном опыте CH1 соединяется с AGND через выбор ZERO.</w:t>
       </w:r>
     </w:p>
     <w:p>
       <w:r>
-        <w:t>Со стороны CH1 схема похожа на источник около 1,886 В с последовательным сопротивлением около 1,14 МОм. Она подаёт небольшой ток в подключённый источник и может существенно изменить слабый ёмкостный сигнал. Именно поэтому P1 выделен в самостоятельный учебный макет.</w:t>
+        <w:t>Со стороны CH1 схема похожа на источник около 1,911 В с последовательным сопротивлением около 1,159 МОм. Она подаёт небольшой ток в подключённый источник и может существенно изменить слабый ёмкостный сигнал. Именно поэтому P1 выделен в самостоятельный учебный макет.</w:t>
+      </w:r>
+    </w:p>
+    <w:p>
+      <w:pPr>
+        <w:pStyle w:val="Heading1"/>
+        <w:pageBreakBefore/>
+      </w:pPr>
+      <w:r>
+        <w:t>6а Какие резисторы покупать</w:t>
+      </w:r>
+    </w:p>
+    <w:p>
+      <w:r>
+        <w:t>В r2 используем распространённые номиналы E24. Ряд номиналов отвечает на вопрос «какое сопротивление указано на детали», а допуск — «насколько фактическое сопротивление может отличаться». Поэтому обычные 510 кОм можно купить с допуском 1%; для них не обязательно выбирать 5%.</w:t>
+      </w:r>
+    </w:p>
+    <w:tbl>
+      <w:tblPr>
+        <w:tblW w:type="auto" w:w="0"/>
+        <w:jc w:val="center"/>
+        <w:tblLayout w:type="fixed"/>
+        <w:tblLook w:firstColumn="1" w:firstRow="1" w:lastColumn="0" w:lastRow="0" w:noHBand="0" w:noVBand="1" w:val="04A0"/>
+        <w:tblBorders>
+          <w:top w:val="single" w:sz="4" w:color="D9D9D9"/>
+          <w:left w:val="single" w:sz="4" w:color="D9D9D9"/>
+          <w:bottom w:val="single" w:sz="4" w:color="D9D9D9"/>
+          <w:right w:val="single" w:sz="4" w:color="D9D9D9"/>
+          <w:insideH w:val="single" w:sz="4" w:color="D9D9D9"/>
+          <w:insideV w:val="single" w:sz="4" w:color="D9D9D9"/>
+        </w:tblBorders>
+      </w:tblPr>
+      <w:tblGrid>
+        <w:gridCol w:w="2324"/>
+        <w:gridCol w:w="3231"/>
+        <w:gridCol w:w="3798"/>
+      </w:tblGrid>
+      <w:tr>
+        <w:trPr>
+          <w:cantSplit/>
+          <w:tblHeader/>
+        </w:trPr>
+        <w:tc>
+          <w:tcPr>
+            <w:tcW w:type="dxa" w:w="2324"/>
+            <w:vAlign w:val="center"/>
+            <w:tcMar>
+              <w:top w:w="85" w:type="dxa"/>
+              <w:left w:w="85" w:type="dxa"/>
+              <w:bottom w:w="85" w:type="dxa"/>
+              <w:right w:w="85" w:type="dxa"/>
+            </w:tcMar>
+            <w:shd w:fill="DFEAF0"/>
+          </w:tcPr>
+          <w:p>
+            <w:pPr>
+              <w:spacing w:after="0" w:before="0" w:line="240" w:lineRule="auto"/>
+            </w:pPr>
+            <w:r>
+              <w:rPr>
+                <w:b/>
+                <w:sz w:val="19"/>
+              </w:rPr>
+              <w:t>Где стоят резисторы</w:t>
+            </w:r>
+          </w:p>
+        </w:tc>
+        <w:tc>
+          <w:tcPr>
+            <w:tcW w:type="dxa" w:w="3231"/>
+            <w:vAlign w:val="center"/>
+            <w:tcMar>
+              <w:top w:w="85" w:type="dxa"/>
+              <w:left w:w="85" w:type="dxa"/>
+              <w:bottom w:w="85" w:type="dxa"/>
+              <w:right w:w="85" w:type="dxa"/>
+            </w:tcMar>
+            <w:shd w:fill="DFEAF0"/>
+          </w:tcPr>
+          <w:p>
+            <w:pPr>
+              <w:spacing w:after="0" w:before="0" w:line="240" w:lineRule="auto"/>
+            </w:pPr>
+            <w:r>
+              <w:rPr>
+                <w:b/>
+                <w:sz w:val="19"/>
+              </w:rPr>
+              <w:t>Что требуется</w:t>
+            </w:r>
+          </w:p>
+        </w:tc>
+        <w:tc>
+          <w:tcPr>
+            <w:tcW w:type="dxa" w:w="3798"/>
+            <w:vAlign w:val="center"/>
+            <w:tcMar>
+              <w:top w:w="85" w:type="dxa"/>
+              <w:left w:w="85" w:type="dxa"/>
+              <w:bottom w:w="85" w:type="dxa"/>
+              <w:right w:w="85" w:type="dxa"/>
+            </w:tcMar>
+            <w:shd w:fill="DFEAF0"/>
+          </w:tcPr>
+          <w:p>
+            <w:pPr>
+              <w:spacing w:after="0" w:before="0" w:line="240" w:lineRule="auto"/>
+            </w:pPr>
+            <w:r>
+              <w:rPr>
+                <w:b/>
+                <w:sz w:val="19"/>
+              </w:rPr>
+              <w:t>Почему</w:t>
+            </w:r>
+          </w:p>
+        </w:tc>
+      </w:tr>
+      <w:tr>
+        <w:trPr>
+          <w:cantSplit/>
+        </w:trPr>
+        <w:tc>
+          <w:tcPr>
+            <w:tcW w:type="dxa" w:w="2324"/>
+            <w:vAlign w:val="center"/>
+            <w:tcMar>
+              <w:top w:w="85" w:type="dxa"/>
+              <w:left w:w="85" w:type="dxa"/>
+              <w:bottom w:w="85" w:type="dxa"/>
+              <w:right w:w="85" w:type="dxa"/>
+            </w:tcMar>
+            <w:shd w:fill="FFFFFF"/>
+          </w:tcPr>
+          <w:p>
+            <w:pPr>
+              <w:spacing w:after="0" w:before="0" w:line="240" w:lineRule="auto"/>
+            </w:pPr>
+            <w:r>
+              <w:rPr>
+                <w:sz w:val="19"/>
+              </w:rPr>
+              <w:t>R1 и R2 по 510 кОм, R3 240 кОм, R4 330 кОм</w:t>
+            </w:r>
+          </w:p>
+        </w:tc>
+        <w:tc>
+          <w:tcPr>
+            <w:tcW w:type="dxa" w:w="3231"/>
+            <w:vAlign w:val="center"/>
+            <w:tcMar>
+              <w:top w:w="85" w:type="dxa"/>
+              <w:left w:w="85" w:type="dxa"/>
+              <w:bottom w:w="85" w:type="dxa"/>
+              <w:right w:w="85" w:type="dxa"/>
+            </w:tcMar>
+            <w:shd w:fill="FFFFFF"/>
+          </w:tcPr>
+          <w:p>
+            <w:pPr>
+              <w:spacing w:after="0" w:before="0" w:line="240" w:lineRule="auto"/>
+            </w:pPr>
+            <w:r>
+              <w:rPr>
+                <w:sz w:val="19"/>
+              </w:rPr>
+              <w:t>1%, TCR ≤25 ppm/°C</w:t>
+            </w:r>
+          </w:p>
+        </w:tc>
+        <w:tc>
+          <w:tcPr>
+            <w:tcW w:type="dxa" w:w="3798"/>
+            <w:vAlign w:val="center"/>
+            <w:tcMar>
+              <w:top w:w="85" w:type="dxa"/>
+              <w:left w:w="85" w:type="dxa"/>
+              <w:bottom w:w="85" w:type="dxa"/>
+              <w:right w:w="85" w:type="dxa"/>
+            </w:tcMar>
+            <w:shd w:fill="FFFFFF"/>
+          </w:tcPr>
+          <w:p>
+            <w:pPr>
+              <w:spacing w:after="0" w:before="0" w:line="240" w:lineRule="auto"/>
+            </w:pPr>
+            <w:r>
+              <w:rPr>
+                <w:sz w:val="19"/>
+              </w:rPr>
+              <w:t>Задают ослабление, смещение и нагрузку CH1</w:t>
+            </w:r>
+          </w:p>
+        </w:tc>
+      </w:tr>
+      <w:tr>
+        <w:trPr>
+          <w:cantSplit/>
+        </w:trPr>
+        <w:tc>
+          <w:tcPr>
+            <w:tcW w:type="dxa" w:w="2324"/>
+            <w:vAlign w:val="center"/>
+            <w:tcMar>
+              <w:top w:w="85" w:type="dxa"/>
+              <w:left w:w="85" w:type="dxa"/>
+              <w:bottom w:w="85" w:type="dxa"/>
+              <w:right w:w="85" w:type="dxa"/>
+            </w:tcMar>
+            <w:shd w:fill="F5F7F8"/>
+          </w:tcPr>
+          <w:p>
+            <w:pPr>
+              <w:spacing w:after="0" w:before="0" w:line="240" w:lineRule="auto"/>
+            </w:pPr>
+            <w:r>
+              <w:rPr>
+                <w:sz w:val="19"/>
+              </w:rPr>
+              <w:t>R5 и R6 по 4,7 кОм, R7 и R8 по 2 кОм</w:t>
+            </w:r>
+          </w:p>
+        </w:tc>
+        <w:tc>
+          <w:tcPr>
+            <w:tcW w:type="dxa" w:w="3231"/>
+            <w:vAlign w:val="center"/>
+            <w:tcMar>
+              <w:top w:w="85" w:type="dxa"/>
+              <w:left w:w="85" w:type="dxa"/>
+              <w:bottom w:w="85" w:type="dxa"/>
+              <w:right w:w="85" w:type="dxa"/>
+            </w:tcMar>
+            <w:shd w:fill="F5F7F8"/>
+          </w:tcPr>
+          <w:p>
+            <w:pPr>
+              <w:spacing w:after="0" w:before="0" w:line="240" w:lineRule="auto"/>
+            </w:pPr>
+            <w:r>
+              <w:rPr>
+                <w:sz w:val="19"/>
+              </w:rPr>
+              <w:t>1%</w:t>
+            </w:r>
+          </w:p>
+        </w:tc>
+        <w:tc>
+          <w:tcPr>
+            <w:tcW w:type="dxa" w:w="3798"/>
+            <w:vAlign w:val="center"/>
+            <w:tcMar>
+              <w:top w:w="85" w:type="dxa"/>
+              <w:left w:w="85" w:type="dxa"/>
+              <w:bottom w:w="85" w:type="dxa"/>
+              <w:right w:w="85" w:type="dxa"/>
+            </w:tcMar>
+            <w:shd w:fill="F5F7F8"/>
+          </w:tcPr>
+          <w:p>
+            <w:pPr>
+              <w:spacing w:after="0" w:before="0" w:line="240" w:lineRule="auto"/>
+            </w:pPr>
+            <w:r>
+              <w:rPr>
+                <w:sz w:val="19"/>
+              </w:rPr>
+              <w:t>Определяют частотную характеристику фильтра</w:t>
+            </w:r>
+          </w:p>
+        </w:tc>
+      </w:tr>
+      <w:tr>
+        <w:trPr>
+          <w:cantSplit/>
+        </w:trPr>
+        <w:tc>
+          <w:tcPr>
+            <w:tcW w:type="dxa" w:w="2324"/>
+            <w:vAlign w:val="center"/>
+            <w:tcMar>
+              <w:top w:w="85" w:type="dxa"/>
+              <w:left w:w="85" w:type="dxa"/>
+              <w:bottom w:w="85" w:type="dxa"/>
+              <w:right w:w="85" w:type="dxa"/>
+            </w:tcMar>
+            <w:shd w:fill="FFFFFF"/>
+          </w:tcPr>
+          <w:p>
+            <w:pPr>
+              <w:spacing w:after="0" w:before="0" w:line="240" w:lineRule="auto"/>
+            </w:pPr>
+            <w:r>
+              <w:rPr>
+                <w:sz w:val="19"/>
+              </w:rPr>
+              <w:t>R9 330 Ом</w:t>
+            </w:r>
+          </w:p>
+        </w:tc>
+        <w:tc>
+          <w:tcPr>
+            <w:tcW w:type="dxa" w:w="3231"/>
+            <w:vAlign w:val="center"/>
+            <w:tcMar>
+              <w:top w:w="85" w:type="dxa"/>
+              <w:left w:w="85" w:type="dxa"/>
+              <w:bottom w:w="85" w:type="dxa"/>
+              <w:right w:w="85" w:type="dxa"/>
+            </w:tcMar>
+            <w:shd w:fill="FFFFFF"/>
+          </w:tcPr>
+          <w:p>
+            <w:pPr>
+              <w:spacing w:after="0" w:before="0" w:line="240" w:lineRule="auto"/>
+            </w:pPr>
+            <w:r>
+              <w:rPr>
+                <w:sz w:val="19"/>
+              </w:rPr>
+              <w:t>1%</w:t>
+            </w:r>
+          </w:p>
+        </w:tc>
+        <w:tc>
+          <w:tcPr>
+            <w:tcW w:type="dxa" w:w="3798"/>
+            <w:vAlign w:val="center"/>
+            <w:tcMar>
+              <w:top w:w="85" w:type="dxa"/>
+              <w:left w:w="85" w:type="dxa"/>
+              <w:bottom w:w="85" w:type="dxa"/>
+              <w:right w:w="85" w:type="dxa"/>
+            </w:tcMar>
+            <w:shd w:fill="FFFFFF"/>
+          </w:tcPr>
+          <w:p>
+            <w:pPr>
+              <w:spacing w:after="0" w:before="0" w:line="240" w:lineRule="auto"/>
+            </w:pPr>
+            <w:r>
+              <w:rPr>
+                <w:sz w:val="19"/>
+              </w:rPr>
+              <w:t>Участвует в выходной цепи перед АЦП</w:t>
+            </w:r>
+          </w:p>
+        </w:tc>
+      </w:tr>
+      <w:tr>
+        <w:trPr>
+          <w:cantSplit/>
+        </w:trPr>
+        <w:tc>
+          <w:tcPr>
+            <w:tcW w:type="dxa" w:w="2324"/>
+            <w:vAlign w:val="center"/>
+            <w:tcMar>
+              <w:top w:w="85" w:type="dxa"/>
+              <w:left w:w="85" w:type="dxa"/>
+              <w:bottom w:w="85" w:type="dxa"/>
+              <w:right w:w="85" w:type="dxa"/>
+            </w:tcMar>
+            <w:shd w:fill="F5F7F8"/>
+          </w:tcPr>
+          <w:p>
+            <w:pPr>
+              <w:spacing w:after="0" w:before="0" w:line="240" w:lineRule="auto"/>
+            </w:pPr>
+            <w:r>
+              <w:rPr>
+                <w:sz w:val="19"/>
+              </w:rPr>
+              <w:t>R10 33 кОм, R11 1 кОм, R12 10 кОм</w:t>
+            </w:r>
+          </w:p>
+        </w:tc>
+        <w:tc>
+          <w:tcPr>
+            <w:tcW w:type="dxa" w:w="3231"/>
+            <w:vAlign w:val="center"/>
+            <w:tcMar>
+              <w:top w:w="85" w:type="dxa"/>
+              <w:left w:w="85" w:type="dxa"/>
+              <w:bottom w:w="85" w:type="dxa"/>
+              <w:right w:w="85" w:type="dxa"/>
+            </w:tcMar>
+            <w:shd w:fill="F5F7F8"/>
+          </w:tcPr>
+          <w:p>
+            <w:pPr>
+              <w:spacing w:after="0" w:before="0" w:line="240" w:lineRule="auto"/>
+            </w:pPr>
+            <w:r>
+              <w:rPr>
+                <w:sz w:val="19"/>
+              </w:rPr>
+              <w:t>5% с отбором или готовые 1%</w:t>
+            </w:r>
+          </w:p>
+        </w:tc>
+        <w:tc>
+          <w:tcPr>
+            <w:tcW w:type="dxa" w:w="3798"/>
+            <w:vAlign w:val="center"/>
+            <w:tcMar>
+              <w:top w:w="85" w:type="dxa"/>
+              <w:left w:w="85" w:type="dxa"/>
+              <w:bottom w:w="85" w:type="dxa"/>
+              <w:right w:w="85" w:type="dxa"/>
+            </w:tcMar>
+            <w:shd w:fill="F5F7F8"/>
+          </w:tcPr>
+          <w:p>
+            <w:pPr>
+              <w:spacing w:after="0" w:before="0" w:line="240" w:lineRule="auto"/>
+            </w:pPr>
+            <w:r>
+              <w:rPr>
+                <w:sz w:val="19"/>
+              </w:rPr>
+              <w:t>TEST всё равно измеряется отдельно; R12 — вспомогательная нагрузка</w:t>
+            </w:r>
+          </w:p>
+        </w:tc>
+      </w:tr>
+    </w:tbl>
+    <w:p>
+      <w:pPr>
+        <w:spacing w:after="0"/>
+      </w:pPr>
+    </w:p>
+    <w:p>
+      <w:r>
+        <w:t>У всех постоянных резисторов выбраны металлоплёночное исполнение и мощность 0,25 Вт. Для первой группы важен также малый температурный коэффициент: 25 ppm/°C означает относительное изменение около 0,0025% на один градус в условиях паспорта. Проверка омметром при одной температуре этого свойства не устанавливает.</w:t>
+      </w:r>
+    </w:p>
+    <w:p>
+      <w:r>
+        <w:t>В основной сборке 12 постоянных резисторов и один RV1. Набирать 499 кОм из последовательных пар теперь не требуется: схема пересчитана под новые значения. Если составная замена позже окажется удобнее по наличию, её сначала проверяют как отдельную замену. Два резистора по 5% не превращаются автоматически в эквивалент 1%.</w:t>
+      </w:r>
+    </w:p>
+    <w:p>
+      <w:r>
+        <w:rPr>
+          <w:b/>
+        </w:rPr>
+        <w:t>Конденсаторы не упрощаем вслед за резисторами.</w:t>
+      </w:r>
+      <w:r>
+        <w:t xml:space="preserve"> C1a, C1b, C2, C3 и C4 остаются C0G/NP0 либо плёночными, до 2%, от 25 В. C5 — C0G/NP0, до 2%, от 25 В. Развязка питания C6/C7 имеет другие требования. Полный список корпусов и количеств находится в materials-ru.md.</w:t>
+      </w:r>
+    </w:p>
+    <w:p>
+      <w:pPr>
+        <w:pStyle w:val="Heading1"/>
+        <w:pageBreakBefore/>
+      </w:pPr>
+      <w:r>
+        <w:t>6б Как отобрать резисторы 5 процентов</w:t>
+      </w:r>
+    </w:p>
+    <w:p>
+      <w:r>
+        <w:t>Подбор нужен только для R10–R12. Покупаем или берём исправные резисторы нужного номинала и измеряем до пайки, по отдельности. Цель — получить показание в пределах ±3% от номинала; схема при этом всё равно рассчитана на полный исходный допуск ±5%.</w:t>
+      </w:r>
+    </w:p>
+    <w:tbl>
+      <w:tblPr>
+        <w:tblW w:type="auto" w:w="0"/>
+        <w:jc w:val="center"/>
+        <w:tblLayout w:type="fixed"/>
+        <w:tblLook w:firstColumn="1" w:firstRow="1" w:lastColumn="0" w:lastRow="0" w:noHBand="0" w:noVBand="1" w:val="04A0"/>
+        <w:tblBorders>
+          <w:top w:val="single" w:sz="4" w:color="D9D9D9"/>
+          <w:left w:val="single" w:sz="4" w:color="D9D9D9"/>
+          <w:bottom w:val="single" w:sz="4" w:color="D9D9D9"/>
+          <w:right w:val="single" w:sz="4" w:color="D9D9D9"/>
+          <w:insideH w:val="single" w:sz="4" w:color="D9D9D9"/>
+          <w:insideV w:val="single" w:sz="4" w:color="D9D9D9"/>
+        </w:tblBorders>
+      </w:tblPr>
+      <w:tblGrid>
+        <w:gridCol w:w="2324"/>
+        <w:gridCol w:w="3231"/>
+        <w:gridCol w:w="3798"/>
+      </w:tblGrid>
+      <w:tr>
+        <w:trPr>
+          <w:cantSplit/>
+          <w:tblHeader/>
+        </w:trPr>
+        <w:tc>
+          <w:tcPr>
+            <w:tcW w:type="dxa" w:w="2324"/>
+            <w:vAlign w:val="center"/>
+            <w:tcMar>
+              <w:top w:w="85" w:type="dxa"/>
+              <w:left w:w="85" w:type="dxa"/>
+              <w:bottom w:w="85" w:type="dxa"/>
+              <w:right w:w="85" w:type="dxa"/>
+            </w:tcMar>
+            <w:shd w:fill="DFEAF0"/>
+          </w:tcPr>
+          <w:p>
+            <w:pPr>
+              <w:spacing w:after="0" w:before="0" w:line="240" w:lineRule="auto"/>
+            </w:pPr>
+            <w:r>
+              <w:rPr>
+                <w:b/>
+                <w:sz w:val="19"/>
+              </w:rPr>
+              <w:t>Деталь</w:t>
+            </w:r>
+          </w:p>
+        </w:tc>
+        <w:tc>
+          <w:tcPr>
+            <w:tcW w:type="dxa" w:w="3231"/>
+            <w:vAlign w:val="center"/>
+            <w:tcMar>
+              <w:top w:w="85" w:type="dxa"/>
+              <w:left w:w="85" w:type="dxa"/>
+              <w:bottom w:w="85" w:type="dxa"/>
+              <w:right w:w="85" w:type="dxa"/>
+            </w:tcMar>
+            <w:shd w:fill="DFEAF0"/>
+          </w:tcPr>
+          <w:p>
+            <w:pPr>
+              <w:spacing w:after="0" w:before="0" w:line="240" w:lineRule="auto"/>
+            </w:pPr>
+            <w:r>
+              <w:rPr>
+                <w:b/>
+                <w:sz w:val="19"/>
+              </w:rPr>
+              <w:t>Диапазон RM102</w:t>
+            </w:r>
+          </w:p>
+        </w:tc>
+        <w:tc>
+          <w:tcPr>
+            <w:tcW w:type="dxa" w:w="3798"/>
+            <w:vAlign w:val="center"/>
+            <w:tcMar>
+              <w:top w:w="85" w:type="dxa"/>
+              <w:left w:w="85" w:type="dxa"/>
+              <w:bottom w:w="85" w:type="dxa"/>
+              <w:right w:w="85" w:type="dxa"/>
+            </w:tcMar>
+            <w:shd w:fill="DFEAF0"/>
+          </w:tcPr>
+          <w:p>
+            <w:pPr>
+              <w:spacing w:after="0" w:before="0" w:line="240" w:lineRule="auto"/>
+            </w:pPr>
+            <w:r>
+              <w:rPr>
+                <w:b/>
+                <w:sz w:val="19"/>
+              </w:rPr>
+              <w:t>Принимаемое показание</w:t>
+            </w:r>
+          </w:p>
+        </w:tc>
+      </w:tr>
+      <w:tr>
+        <w:trPr>
+          <w:cantSplit/>
+        </w:trPr>
+        <w:tc>
+          <w:tcPr>
+            <w:tcW w:type="dxa" w:w="2324"/>
+            <w:vAlign w:val="center"/>
+            <w:tcMar>
+              <w:top w:w="85" w:type="dxa"/>
+              <w:left w:w="85" w:type="dxa"/>
+              <w:bottom w:w="85" w:type="dxa"/>
+              <w:right w:w="85" w:type="dxa"/>
+            </w:tcMar>
+            <w:shd w:fill="FFFFFF"/>
+          </w:tcPr>
+          <w:p>
+            <w:pPr>
+              <w:spacing w:after="0" w:before="0" w:line="240" w:lineRule="auto"/>
+            </w:pPr>
+            <w:r>
+              <w:rPr>
+                <w:sz w:val="19"/>
+              </w:rPr>
+              <w:t>R10 33 кОм</w:t>
+            </w:r>
+          </w:p>
+        </w:tc>
+        <w:tc>
+          <w:tcPr>
+            <w:tcW w:type="dxa" w:w="3231"/>
+            <w:vAlign w:val="center"/>
+            <w:tcMar>
+              <w:top w:w="85" w:type="dxa"/>
+              <w:left w:w="85" w:type="dxa"/>
+              <w:bottom w:w="85" w:type="dxa"/>
+              <w:right w:w="85" w:type="dxa"/>
+            </w:tcMar>
+            <w:shd w:fill="FFFFFF"/>
+          </w:tcPr>
+          <w:p>
+            <w:pPr>
+              <w:spacing w:after="0" w:before="0" w:line="240" w:lineRule="auto"/>
+            </w:pPr>
+            <w:r>
+              <w:rPr>
+                <w:sz w:val="19"/>
+              </w:rPr>
+              <w:t>60,00 кОм</w:t>
+            </w:r>
+          </w:p>
+        </w:tc>
+        <w:tc>
+          <w:tcPr>
+            <w:tcW w:type="dxa" w:w="3798"/>
+            <w:vAlign w:val="center"/>
+            <w:tcMar>
+              <w:top w:w="85" w:type="dxa"/>
+              <w:left w:w="85" w:type="dxa"/>
+              <w:bottom w:w="85" w:type="dxa"/>
+              <w:right w:w="85" w:type="dxa"/>
+            </w:tcMar>
+            <w:shd w:fill="FFFFFF"/>
+          </w:tcPr>
+          <w:p>
+            <w:pPr>
+              <w:spacing w:after="0" w:before="0" w:line="240" w:lineRule="auto"/>
+            </w:pPr>
+            <w:r>
+              <w:rPr>
+                <w:sz w:val="19"/>
+              </w:rPr>
+              <w:t>32,01…33,99 кОм</w:t>
+            </w:r>
+          </w:p>
+        </w:tc>
+      </w:tr>
+      <w:tr>
+        <w:trPr>
+          <w:cantSplit/>
+        </w:trPr>
+        <w:tc>
+          <w:tcPr>
+            <w:tcW w:type="dxa" w:w="2324"/>
+            <w:vAlign w:val="center"/>
+            <w:tcMar>
+              <w:top w:w="85" w:type="dxa"/>
+              <w:left w:w="85" w:type="dxa"/>
+              <w:bottom w:w="85" w:type="dxa"/>
+              <w:right w:w="85" w:type="dxa"/>
+            </w:tcMar>
+            <w:shd w:fill="F5F7F8"/>
+          </w:tcPr>
+          <w:p>
+            <w:pPr>
+              <w:spacing w:after="0" w:before="0" w:line="240" w:lineRule="auto"/>
+            </w:pPr>
+            <w:r>
+              <w:rPr>
+                <w:sz w:val="19"/>
+              </w:rPr>
+              <w:t>R11 1 кОм</w:t>
+            </w:r>
+          </w:p>
+        </w:tc>
+        <w:tc>
+          <w:tcPr>
+            <w:tcW w:type="dxa" w:w="3231"/>
+            <w:vAlign w:val="center"/>
+            <w:tcMar>
+              <w:top w:w="85" w:type="dxa"/>
+              <w:left w:w="85" w:type="dxa"/>
+              <w:bottom w:w="85" w:type="dxa"/>
+              <w:right w:w="85" w:type="dxa"/>
+            </w:tcMar>
+            <w:shd w:fill="F5F7F8"/>
+          </w:tcPr>
+          <w:p>
+            <w:pPr>
+              <w:spacing w:after="0" w:before="0" w:line="240" w:lineRule="auto"/>
+            </w:pPr>
+            <w:r>
+              <w:rPr>
+                <w:sz w:val="19"/>
+              </w:rPr>
+              <w:t>6,000 кОм</w:t>
+            </w:r>
+          </w:p>
+        </w:tc>
+        <w:tc>
+          <w:tcPr>
+            <w:tcW w:type="dxa" w:w="3798"/>
+            <w:vAlign w:val="center"/>
+            <w:tcMar>
+              <w:top w:w="85" w:type="dxa"/>
+              <w:left w:w="85" w:type="dxa"/>
+              <w:bottom w:w="85" w:type="dxa"/>
+              <w:right w:w="85" w:type="dxa"/>
+            </w:tcMar>
+            <w:shd w:fill="F5F7F8"/>
+          </w:tcPr>
+          <w:p>
+            <w:pPr>
+              <w:spacing w:after="0" w:before="0" w:line="240" w:lineRule="auto"/>
+            </w:pPr>
+            <w:r>
+              <w:rPr>
+                <w:sz w:val="19"/>
+              </w:rPr>
+              <w:t>0,970…1,030 кОм</w:t>
+            </w:r>
+          </w:p>
+        </w:tc>
+      </w:tr>
+      <w:tr>
+        <w:trPr>
+          <w:cantSplit/>
+        </w:trPr>
+        <w:tc>
+          <w:tcPr>
+            <w:tcW w:type="dxa" w:w="2324"/>
+            <w:vAlign w:val="center"/>
+            <w:tcMar>
+              <w:top w:w="85" w:type="dxa"/>
+              <w:left w:w="85" w:type="dxa"/>
+              <w:bottom w:w="85" w:type="dxa"/>
+              <w:right w:w="85" w:type="dxa"/>
+            </w:tcMar>
+            <w:shd w:fill="FFFFFF"/>
+          </w:tcPr>
+          <w:p>
+            <w:pPr>
+              <w:spacing w:after="0" w:before="0" w:line="240" w:lineRule="auto"/>
+            </w:pPr>
+            <w:r>
+              <w:rPr>
+                <w:sz w:val="19"/>
+              </w:rPr>
+              <w:t>R12 10 кОм</w:t>
+            </w:r>
+          </w:p>
+        </w:tc>
+        <w:tc>
+          <w:tcPr>
+            <w:tcW w:type="dxa" w:w="3231"/>
+            <w:vAlign w:val="center"/>
+            <w:tcMar>
+              <w:top w:w="85" w:type="dxa"/>
+              <w:left w:w="85" w:type="dxa"/>
+              <w:bottom w:w="85" w:type="dxa"/>
+              <w:right w:w="85" w:type="dxa"/>
+            </w:tcMar>
+            <w:shd w:fill="FFFFFF"/>
+          </w:tcPr>
+          <w:p>
+            <w:pPr>
+              <w:spacing w:after="0" w:before="0" w:line="240" w:lineRule="auto"/>
+            </w:pPr>
+            <w:r>
+              <w:rPr>
+                <w:sz w:val="19"/>
+              </w:rPr>
+              <w:t>60,00 кОм</w:t>
+            </w:r>
+          </w:p>
+        </w:tc>
+        <w:tc>
+          <w:tcPr>
+            <w:tcW w:type="dxa" w:w="3798"/>
+            <w:vAlign w:val="center"/>
+            <w:tcMar>
+              <w:top w:w="85" w:type="dxa"/>
+              <w:left w:w="85" w:type="dxa"/>
+              <w:bottom w:w="85" w:type="dxa"/>
+              <w:right w:w="85" w:type="dxa"/>
+            </w:tcMar>
+            <w:shd w:fill="FFFFFF"/>
+          </w:tcPr>
+          <w:p>
+            <w:pPr>
+              <w:spacing w:after="0" w:before="0" w:line="240" w:lineRule="auto"/>
+            </w:pPr>
+            <w:r>
+              <w:rPr>
+                <w:sz w:val="19"/>
+              </w:rPr>
+              <w:t>9,70…10,30 кОм</w:t>
+            </w:r>
+          </w:p>
+        </w:tc>
+      </w:tr>
+    </w:tbl>
+    <w:p>
+      <w:pPr>
+        <w:spacing w:after="0"/>
+      </w:pPr>
+    </w:p>
+    <w:p>
+      <w:r>
+        <w:t>Порядок простой: обесточить и отделить деталь от схемы; дать остыть после пайки; установить чёрный щуп в COM, красный в VΩHz и включить измерение сопротивления. RM102 выбирает диапазон автоматически: проверить единицы и разряды, дождаться устойчивого показания. Пальцами не держать одновременно оба металлических вывода. Записать обозначение, номинал, показание и диапазон. На собранной плате параллельные цепи могут занизить результат.</w:t>
+      </w:r>
+    </w:p>
+    <w:p>
+      <w:r>
+        <w:t>В найденной инструкции RM101/RM102 погрешность сопротивления до 6 МОм указана как ±(0,5% показания + 3 единицы младшего разряда) [8]. Например, для 33,00 кОм на диапазоне 60,00 кОм это ±0,195 кОм: 0,165 кОм плюс 0,03 кОм. Последние цифры дисплея не означают такую же точность.</w:t>
+      </w:r>
+    </w:p>
+    <w:p>
+      <w:r>
+        <w:t>Правило отбора оставляет запас относительно 5%: даже на краю приведённого окна сумма отклонения показания и паспортной ошибки меньше 4%. Это справедливо, только если инструкция соответствует именно вашему исправному прибору и соблюдены её условия. При другом диапазоне или другой точности границы надо проверить заново.</w:t>
+      </w:r>
+    </w:p>
+    <w:p>
+      <w:r>
+        <w:rPr>
+          <w:b/>
+        </w:rPr>
+        <w:t>Отобранный резистор остаётся деталью 5%.</w:t>
+      </w:r>
+      <w:r>
+        <w:t xml:space="preserve"> Он не получает паспортного допуска 1%, малый температурный коэффициент или подтверждённую долговременную стабильность. R1–R9 таким подбором не заменяем. Если R10–R12 не попали в окно, выбираем другие детали либо ставим готовые 1% тех же номиналов; их также проверяем на явную ошибку маркировки.</w:t>
+      </w:r>
+    </w:p>
+    <w:p>
+      <w:r>
+        <w:t>Измерение сопротивления не проверяет форму импульса, самовозбуждение ОУ или поведение при выключении питания. Эти проверки относятся к готовому макету и выполняются отдельно.</w:t>
       </w:r>
     </w:p>
     <w:p>
@@ -1420,7 +2253,7 @@
     </w:p>
     <w:p>
       <w:r>
-        <w:t>В P1 две активные RC-секции Sallen–Key: резисторы, конденсаторы и ОУ-повторитель [4]. Две секции дают фильтр четвёртого порядка, то есть более сильное ослабление высоких частот, чем одна простая RC-цепь. Номинальные значения дают характеристику, близкую к Butterworth около 3 кГц: плавную в полосе, но не сохраняющую произвольно быстрые фронты.</w:t>
+        <w:t>В P1 две активные RC-секции Sallen–Key: резисторы, конденсаторы и ОУ-повторитель [4]. Вместе они дают фильтр четвёртого порядка и сильнее ослабляют высокие частоты, чем одна RC-цепь. Новые номиналы дают частоту −3 дБ двух идеальных секций около 3,086 кГц. Это небольшое изменение относительно r1 сохраняет задачу фильтра около 3 кГц; произвольно быстрые фронты он не передаёт.</w:t>
       </w:r>
     </w:p>
     <w:tbl>
@@ -1602,7 +2435,7 @@
               <w:rPr>
                 <w:sz w:val="19"/>
               </w:rPr>
-              <w:t>R5 и R6 по 4,87 кОм</w:t>
+              <w:t>R5 и R6 по 4,7 кОм</w:t>
             </w:r>
           </w:p>
         </w:tc>
@@ -1705,7 +2538,7 @@
               <w:rPr>
                 <w:sz w:val="19"/>
               </w:rPr>
-              <w:t>R7 и R8 по 2,03 кОм</w:t>
+              <w:t>R7 и R8 по 2 кОм</w:t>
             </w:r>
           </w:p>
         </w:tc>
@@ -4226,7 +5059,7 @@
               <w:rPr>
                 <w:sz w:val="19"/>
               </w:rPr>
-              <w:t>499 кОм</w:t>
+              <w:t>510 кОм · 1%</w:t>
             </w:r>
           </w:p>
         </w:tc>
@@ -4329,7 +5162,7 @@
               <w:rPr>
                 <w:sz w:val="19"/>
               </w:rPr>
-              <w:t>499 кОм</w:t>
+              <w:t>510 кОм · 1%</w:t>
             </w:r>
           </w:p>
         </w:tc>
@@ -4432,7 +5265,7 @@
               <w:rPr>
                 <w:sz w:val="19"/>
               </w:rPr>
-              <w:t>249 кОм</w:t>
+              <w:t>240 кОм · 1%</w:t>
             </w:r>
           </w:p>
         </w:tc>
@@ -4535,7 +5368,7 @@
               <w:rPr>
                 <w:sz w:val="19"/>
               </w:rPr>
-              <w:t>332 кОм</w:t>
+              <w:t>330 кОм · 1%</w:t>
             </w:r>
           </w:p>
         </w:tc>
@@ -4638,7 +5471,7 @@
               <w:rPr>
                 <w:sz w:val="19"/>
               </w:rPr>
-              <w:t>4,87 кОм</w:t>
+              <w:t>4,7 кОм · 1%</w:t>
             </w:r>
           </w:p>
         </w:tc>
@@ -4741,7 +5574,7 @@
               <w:rPr>
                 <w:sz w:val="19"/>
               </w:rPr>
-              <w:t>4,87 кОм</w:t>
+              <w:t>4,7 кОм · 1%</w:t>
             </w:r>
           </w:p>
         </w:tc>
@@ -5050,7 +5883,7 @@
               <w:rPr>
                 <w:sz w:val="19"/>
               </w:rPr>
-              <w:t>2,03 кОм</w:t>
+              <w:t>2 кОм · 1%</w:t>
             </w:r>
           </w:p>
         </w:tc>
@@ -5153,7 +5986,7 @@
               <w:rPr>
                 <w:sz w:val="19"/>
               </w:rPr>
-              <w:t>2,03 кОм</w:t>
+              <w:t>2 кОм · 1%</w:t>
             </w:r>
           </w:p>
         </w:tc>
@@ -5462,7 +6295,7 @@
               <w:rPr>
                 <w:sz w:val="19"/>
               </w:rPr>
-              <w:t>330 Ом</w:t>
+              <w:t>330 Ом · 1%</w:t>
             </w:r>
           </w:p>
         </w:tc>
@@ -5668,7 +6501,7 @@
               <w:rPr>
                 <w:sz w:val="19"/>
               </w:rPr>
-              <w:t>33 кОм</w:t>
+              <w:t>33 кОм · 5%*</w:t>
             </w:r>
           </w:p>
         </w:tc>
@@ -5874,7 +6707,7 @@
               <w:rPr>
                 <w:sz w:val="19"/>
               </w:rPr>
-              <w:t>1 кОм</w:t>
+              <w:t>1 кОм · 5%*</w:t>
             </w:r>
           </w:p>
         </w:tc>
@@ -5977,7 +6810,7 @@
               <w:rPr>
                 <w:sz w:val="19"/>
               </w:rPr>
-              <w:t>10 кОм</w:t>
+              <w:t>10 кОм · 5%*</w:t>
             </w:r>
           </w:p>
         </w:tc>
@@ -6141,6 +6974,11 @@
     </w:p>
     <w:p>
       <w:r>
+        <w:t>*R10–R12 отбираются по разделу 6б; готовые 1% тех же номиналов также подходят. RV1 — 10 кОм, многооборотный линейный, до 20%; он не входит в 12 постоянных резисторов.</w:t>
+      </w:r>
+    </w:p>
+    <w:p>
+      <w:r>
         <w:t>Контрольные точки: TP0 — AGND; TP1 — CH1; TP2 — SUM; TP3 — BUF; TP4 — LP1; TP5 — LP2; TP6 — ADC_NODE; TP7 — V_A.</w:t>
       </w:r>
     </w:p>
@@ -6175,7 +7013,7 @@
     </w:p>
     <w:p>
       <w:r>
-        <w:t>Для простого объяснения можно взять условные ёмкости связи 1 пФ и нагрузки 200 пФ. Это вымышленные параметры модели, не измерения будущего датчика. При нагрузке 100 МОм характерное время разряда получается около 20 мс; при 1,14 МОм — около 0,23 мс. За несколько миллисекунд формы заметно разойдутся. Полный реальный датчик сложнее этой RC-модели.</w:t>
+        <w:t>Для простого объяснения можно взять условные ёмкости связи 1 пФ и нагрузки 200 пФ. Это вымышленные параметры модели, не измерения будущего датчика. При нагрузке 100 МОм характерное время разряда получается около 20 мс; при 1,159 МОм — около 0,23 мс. За несколько миллисекунд формы заметно разойдутся. Полный реальный датчик сложнее этой RC-модели.</w:t>
       </w:r>
     </w:p>
     <w:p>
@@ -6336,7 +7174,7 @@
     </w:p>
     <w:p>
       <w:r>
-        <w:t>После усиления идут те же две секции Sallen–Key и выход 330 Ом / 1 нФ. У P0 они занимают U2C/U2D. Связи деталей приведены в отдельном netlist P0; номера выводов не переносятся из таблицы P1 без проверки конкретного корпуса.</w:t>
+        <w:t>После усиления идут две секции Sallen–Key той же топологии и выход 330 Ом / 1 нФ. У P0 они занимают U2C/U2D и сохраняют собственные номиналы: по 4,87 кОм и по 2,03 кОм. Связи деталей приведены в отдельном netlist P0; новые номиналы P1 r2 и его номера выводов сюда не переносятся.</w:t>
       </w:r>
     </w:p>
     <w:p>
@@ -6422,7 +7260,7 @@
         <w:t>Подготовка деталей и монтажа.</w:t>
       </w:r>
       <w:r>
-        <w:t xml:space="preserve"> Сверяем конкретные модели, корпус TLV9064, допуски и диэлектрики. Переносим соединения в редактируемую электрическую схему, проверяем выводы и соединения, затем готовим монтаж. Формальная электрическая проверка схемы называется ERC; она обнаруживает часть ошибок соединений, но не доказывает правильную аналоговую характеристику.</w:t>
+        <w:t xml:space="preserve"> Сверяем конкретные модели, корпус TLV9064, допуски и диэлектрики. R10–R12 с допуском 5% отбираем до пайки по разделу 6б. Переносим соединения в редактируемую электрическую схему, проверяем выводы и соединения, затем готовим монтаж. Формальная электрическая проверка схемы называется ERC; она обнаруживает часть ошибок соединений, но не доказывает правильную аналоговую характеристику.</w:t>
       </w:r>
     </w:p>
     <w:p>
@@ -6455,7 +7293,7 @@
         <w:t>Первое включение без связи с ADC.</w:t>
       </w:r>
       <w:r>
-        <w:t xml:space="preserve"> При разрешённом питании и пустом внешнем J1 измеряем V_A, ток потребления и уровни ZERO/TEST. Неожиданный нагрев, ток или напряжение — причина выключить питание и найти ошибку. Появление около 1,65 В на выходе при нуле CH1 — только проверка правдоподобия DC.</w:t>
+        <w:t xml:space="preserve"> При разрешённом питании и пустом внешнем J1 измеряем V_A, ток потребления и уровни ZERO/TEST. Неожиданный нагрев, ток или напряжение — причина выключить питание и найти ошибку. Появление около 1,68 В на выходе при нуле CH1 и питании 3,3 В — только проверка правдоподобия DC.</w:t>
       </w:r>
     </w:p>
     <w:p>
@@ -7105,12 +7943,12 @@
     </w:p>
     <w:p>
       <w:r>
-        <w:t>При условной опоре 3,3 В один шаг составляет около 0,806 мВ на выводе АЦП. P1 предварительно уменьшает сигнал, поэтому на CH1 одному коду соответствует примерно 6,46 мВ. Это цена широкого масштаба. Размер шага не равен точности: прибор может иметь смещение, шум и другие ошибки.</w:t>
+        <w:t>При условной опоре 3,3 В один шаг составляет около 0,806 мВ на выводе АЦП. P1 предварительно уменьшает сигнал, поэтому на CH1 одному коду соответствует примерно 6,72 мВ. Это цена широкого масштаба. Размер шага не равен точности: прибор может иметь смещение, шум и другие ошибки.</w:t>
       </w:r>
     </w:p>
     <w:p>
       <w:r>
-        <w:t>Точки 0 / 0,4 / 0,8 В на CH1 дают в идеальной арифметике координаты около 2048,5 / 2110,5 / 2172,4. Половинки кодов здесь лишь результат формулы. Настоящий АЦП их не выдаёт. Автоматически считать код 2048 точным нулём CH1 нельзя.</w:t>
+        <w:t>Точки 0 / 0,4 / 0,8 В на CH1 дают в идеальной арифметике координаты около 2087,1 / 2146,6 / 2206,1. Дробные коды здесь лишь результат формулы. Настоящий АЦП их не выдаёт. Автоматически считать код 2048 точным нулём CH1 нельзя.</w:t>
       </w:r>
     </w:p>
     <w:p>
@@ -7239,7 +8077,7 @@
     </w:p>
     <w:p>
       <w:r>
-        <w:t>Для продолжения понадобятся точные товары TLV9064IDR и переходника, доступные резисторы и конденсаторы, инструкция мультиметра RICHMETERS 102 и сведения о конкретной STM32-плате. После этого можно выпускать монтажное руководство с расположением контактов и конкретным питанием.</w:t>
+        <w:t>Для продолжения понадобятся точные товары TLV9064IDR и переходника, доступные резисторы и конденсаторы, сверка найденной инструкции с вашим RICHMETERS 102 и сведения о конкретной STM32-плате. Для R10–R12 запишите результаты отбора. После этого можно выпускать монтажное руководство с расположением контактов и конкретным питанием.</w:t>
       </w:r>
     </w:p>
     <w:p>
@@ -8237,6 +9075,19 @@
       </w:hyperlink>
     </w:p>
     <w:p>
+      <w:r>
+        <w:t xml:space="preserve">8. RM101/RM102 User Manual. Пределы и погрешность измерения сопротивления; публичная копия инструкции. Применимость к конкретному прибору пользователя требуется сверить. </w:t>
+      </w:r>
+      <w:hyperlink r:id="rId25">
+        <w:r>
+          <w:rPr>
+            <w:color w:val="006A76"/>
+          </w:rPr>
+          <w:t>Открыть источник</w:t>
+        </w:r>
+      </w:hyperlink>
+    </w:p>
+    <w:p>
       <w:pPr>
         <w:pStyle w:val="Heading1"/>
       </w:pPr>
@@ -8883,7 +9734,7 @@
       <w:rPr>
         <w:sz w:val="18"/>
       </w:rPr>
-      <w:t xml:space="preserve">Редакция 1   •   </w:t>
+      <w:t xml:space="preserve">Редакция 2   •   </w:t>
     </w:r>
     <w:fldSimple w:instr="PAGE"/>
   </w:p>

</xml_diff>

<commit_message>
hardware: consolidate P1-LV r3 for TLV9064-Q1 and film capacitors
</commit_message>
<xml_diff>
--- a/docs/guides/motortester-input-guide-ru.docx
+++ b/docs/guides/motortester-input-guide-ru.docx
@@ -17,7 +17,7 @@
     </w:p>
     <w:p>
       <w:r>
-        <w:t>Редакция 2 от 21 октября 2026 года. Схема P1-LV r2 с распространёнными номиналами E24 и раздельными требованиями к резисторам 1% и 5%. Для Александра, знакомого с резисторами, конденсаторами, диодами и питанием, но впервые работающего с измерительными усилителями.</w:t>
+        <w:t>Редакция 3 от 22 октября 2026 года. Схема P1-LV r3 на TLV9064QDRQ1, все постоянные резисторы 1%, конденсаторы фильтра MKP 5%. Здесь собраны полная схема, список материалов, соединения и объяснение будущих работ. Руководство написано для Александра, знакомого с базовыми электронными элементами, но впервые работающего с измерительными усилителями.</w:t>
       </w:r>
     </w:p>
     <w:p>
@@ -40,7 +40,7 @@
     </w:p>
     <w:p>
       <w:r>
-        <w:t>Сначала прочитайте разделы 1–4: они дают основу для понимания схем. Разделы 5–10 объясняют P1-LV и его соединения, а новые 6а/6б — резисторы и их отбор. Разделы 11–13 показывают будущий датчик и старые варианты. Разделы 14–17 посвящены проверке, калибровке и приложению. В конце есть словарь и источники.</w:t>
+        <w:t>Сначала прочитайте разделы 1–4: они дают основу для понимания схем. Разделы 5–10 объясняют P1-LV; в 6а–6г собраны детали и материалы, в 10 — полная схема и соединения. Разделы 11–13 показывают будущий датчик и старые варианты. Разделы 14–17 посвящены проверке, калибровке и приложению. В конце есть словарь и источники.</w:t>
       </w:r>
     </w:p>
     <w:p>
@@ -765,7 +765,7 @@
     </w:p>
     <w:p>
       <w:r>
-        <w:t>В P1 выбран TLV9064: четыре ОУ в одном SOIC-14, работа от одной низкой шины, пригодность для повторителя и фильтров. Три секции выполняют основной тракт, четвёртая подключена определённым образом, чтобы не оставить её входы плавающими. LM358 или другой знакомый ОУ нельзя подставить без проверки питания, входов, выхода и устойчивости.</w:t>
+        <w:t>В P1 выбран TLV9064QDRQ1: четыре ОУ в одном SOIC-14, работа от одной низкой шины, пригодность для повторителя и фильтров. По паспорту питание составляет 1,8…5,5 В; у нашего макета проектная общая шина около 3,3 В [1]. Три секции выполняют основной тракт, четвёртая подключена определённым образом, чтобы не оставить её входы плавающими. LM358 или другой знакомый ОУ нельзя подставить без проверки питания, входов, выхода и устойчивости.</w:t>
       </w:r>
     </w:p>
     <w:p>
@@ -1404,7 +1404,7 @@
     </w:p>
     <w:p>
       <w:r>
-        <w:t>В r2 используем распространённые номиналы E24. Ряд номиналов отвечает на вопрос «какое сопротивление указано на детали», а допуск — «насколько фактическое сопротивление может отличаться». Поэтому обычные 510 кОм можно купить с допуском 1%; для них не обязательно выбирать 5%.</w:t>
+        <w:t>В r3 все 12 постоянных резисторов имеют заводской допуск 1% и распространённые номиналы E24. Ряд номиналов отвечает на вопрос «какое сопротивление указано на детали», а допуск — «насколько фактическое сопротивление может отличаться». Например, 510 кОм при допуске 1% означает 504,9…515,1 кОм в условиях паспорта.</w:t>
       </w:r>
     </w:p>
     <w:tbl>
@@ -1787,7 +1787,7 @@
               <w:rPr>
                 <w:sz w:val="19"/>
               </w:rPr>
-              <w:t>5% с отбором или готовые 1%</w:t>
+              <w:t>1%</w:t>
             </w:r>
           </w:p>
         </w:tc>
@@ -1811,7 +1811,7 @@
               <w:rPr>
                 <w:sz w:val="19"/>
               </w:rPr>
-              <w:t>TEST всё равно измеряется отдельно; R12 — вспомогательная нагрузка</w:t>
+              <w:t>Единый допуск всей сборки; фактический TEST всё равно измеряется отдельно</w:t>
             </w:r>
           </w:p>
         </w:tc>
@@ -1829,7 +1829,7 @@
     </w:p>
     <w:p>
       <w:r>
-        <w:t>В основной сборке 12 постоянных резисторов и один RV1. Набирать 499 кОм из последовательных пар теперь не требуется: схема пересчитана под новые значения. Если составная замена позже окажется удобнее по наличию, её сначала проверяют как отдельную замену. Два резистора по 5% не превращаются автоматически в эквивалент 1%.</w:t>
+        <w:t>В основной сборке 12 постоянных резисторов и один RV1. Набирать редкие значения из последовательных пар не требуется: схема рассчитана под одиночные детали. RV1 — отдельный регулируемый резистор 10 кОм, многооборотный и линейный, с допуском полного сопротивления до 20%; требование 1% на него не распространяется.</w:t>
       </w:r>
     </w:p>
     <w:p>
@@ -1837,10 +1837,10 @@
         <w:rPr>
           <w:b/>
         </w:rPr>
-        <w:t>Конденсаторы не упрощаем вслед за резисторами.</w:t>
+        <w:t>Проверка перед пайкой.</w:t>
       </w:r>
       <w:r>
-        <w:t xml:space="preserve"> C1a, C1b, C2, C3 и C4 остаются C0G/NP0 либо плёночными, до 2%, от 25 В. C5 — C0G/NP0, до 2%, от 25 В. Развязка питания C6/C7 имеет другие требования. Полный список корпусов и количеств находится в materials-ru.md.</w:t>
+        <w:t xml:space="preserve"> Измеряйте отдельную обесточенную деталь, не держась одновременно за оба металлических вывода. Записывайте номинал, показание и диапазон. Омметр помогает обнаружить перепутанную деталь, но сам имеет погрешность и не подтверждает заводские 1% или TCR. Сообщённые пользователем резисторы 1% и 0,25 Вт ещё не определяют их серию и температурный коэффициент; для R1–R4 это уточняется по паспорту.</w:t>
       </w:r>
     </w:p>
     <w:p>
@@ -1849,12 +1849,26 @@
         <w:pageBreakBefore/>
       </w:pPr>
       <w:r>
-        <w:t>6б Как отобрать резисторы 5 процентов</w:t>
+        <w:t>6б Какие конденсаторы нужны</w:t>
       </w:r>
     </w:p>
     <w:p>
       <w:r>
-        <w:t>Подбор нужен только для R10–R12. Покупаем или берём исправные резисторы нужного номинала и измеряем до пайки, по отдельности. Цель — получить показание в пределах ±3% от номинала; схема при этом всё равно рассчитана на полный исходный допуск ±5%.</w:t>
+        <w:t>C1–C4 выбраны плёночными MKP с допуском 5% и паспортным рабочим напряжением 50 В. MKP означает полипропиленовую плёнку. Это неполярные детали: электрически их выводы можно менять местами. Пользователь сообщил такое исполнение; конкретные серии, габариты и шаг выводов ещё надо записать перед монтажом.</w:t>
+      </w:r>
+    </w:p>
+    <w:p>
+      <w:r>
+        <w:t xml:space="preserve">Обозначение C1 в фильтре соответствует суммарным 11,8 нФ. Физически это </w:t>
+      </w:r>
+      <w:r>
+        <w:rPr>
+          <w:b/>
+        </w:rPr>
+        <w:t>две детали параллельно: C1a 10 нФ и C1b 1,8 нФ</w:t>
+      </w:r>
+      <w:r>
+        <w:t>. Один конец обеих подключается к X1, другой — к LP1. Ёмкости складываются; их гарантированный суммарный допуск остаётся 5%, а не становится меньше только из-за двух деталей.</w:t>
       </w:r>
     </w:p>
     <w:tbl>
@@ -1903,7 +1917,7 @@
                 <w:b/>
                 <w:sz w:val="19"/>
               </w:rPr>
-              <w:t>Деталь</w:t>
+              <w:t>Где стоит</w:t>
             </w:r>
           </w:p>
         </w:tc>
@@ -1928,7 +1942,7 @@
                 <w:b/>
                 <w:sz w:val="19"/>
               </w:rPr>
-              <w:t>Диапазон RM102</w:t>
+              <w:t>Исполнение</w:t>
             </w:r>
           </w:p>
         </w:tc>
@@ -1953,7 +1967,7 @@
                 <w:b/>
                 <w:sz w:val="19"/>
               </w:rPr>
-              <w:t>Принимаемое показание</w:t>
+              <w:t>Почему выбрано</w:t>
             </w:r>
           </w:p>
         </w:tc>
@@ -1982,7 +1996,7 @@
               <w:rPr>
                 <w:sz w:val="19"/>
               </w:rPr>
-              <w:t>R10 33 кОм</w:t>
+              <w:t>C1a, C1b, C2, C3, C4</w:t>
             </w:r>
           </w:p>
         </w:tc>
@@ -2006,7 +2020,7 @@
               <w:rPr>
                 <w:sz w:val="19"/>
               </w:rPr>
-              <w:t>60,00 кОм</w:t>
+              <w:t>MKP, 5%, 50 В, выводные</w:t>
             </w:r>
           </w:p>
         </w:tc>
@@ -2030,7 +2044,7 @@
               <w:rPr>
                 <w:sz w:val="19"/>
               </w:rPr>
-              <w:t>32,01…33,99 кОм</w:t>
+              <w:t>Определяют частотную характеристику и реакцию фильтра</w:t>
             </w:r>
           </w:p>
         </w:tc>
@@ -2059,7 +2073,7 @@
               <w:rPr>
                 <w:sz w:val="19"/>
               </w:rPr>
-              <w:t>R11 1 кОм</w:t>
+              <w:t>C5</w:t>
             </w:r>
           </w:p>
         </w:tc>
@@ -2083,7 +2097,7 @@
               <w:rPr>
                 <w:sz w:val="19"/>
               </w:rPr>
-              <w:t>6,000 кОм</w:t>
+              <w:t>1 нФ, C0G/NP0, 0805, 5%, не менее 25 В</w:t>
             </w:r>
           </w:p>
         </w:tc>
@@ -2107,7 +2121,7 @@
               <w:rPr>
                 <w:sz w:val="19"/>
               </w:rPr>
-              <w:t>0,970…1,030 кОм</w:t>
+              <w:t>Стабильная небольшая ёмкость у входа АЦП; это керамика, а не плёнка</w:t>
             </w:r>
           </w:p>
         </w:tc>
@@ -2136,7 +2150,7 @@
               <w:rPr>
                 <w:sz w:val="19"/>
               </w:rPr>
-              <w:t>R12 10 кОм</w:t>
+              <w:t>C6</w:t>
             </w:r>
           </w:p>
         </w:tc>
@@ -2160,7 +2174,7 @@
               <w:rPr>
                 <w:sz w:val="19"/>
               </w:rPr>
-              <w:t>60,00 кОм</w:t>
+              <w:t>100 нФ, X7R, 0805, 25 В</w:t>
             </w:r>
           </w:p>
         </w:tc>
@@ -2184,7 +2198,84 @@
               <w:rPr>
                 <w:sz w:val="19"/>
               </w:rPr>
-              <w:t>9,70…10,30 кОм</w:t>
+              <w:t>Быстрая местная развязка питания U1</w:t>
+            </w:r>
+          </w:p>
+        </w:tc>
+      </w:tr>
+      <w:tr>
+        <w:trPr>
+          <w:cantSplit/>
+        </w:trPr>
+        <w:tc>
+          <w:tcPr>
+            <w:tcW w:type="dxa" w:w="2324"/>
+            <w:vAlign w:val="center"/>
+            <w:tcMar>
+              <w:top w:w="85" w:type="dxa"/>
+              <w:left w:w="85" w:type="dxa"/>
+              <w:bottom w:w="85" w:type="dxa"/>
+              <w:right w:w="85" w:type="dxa"/>
+            </w:tcMar>
+            <w:shd w:fill="F5F7F8"/>
+          </w:tcPr>
+          <w:p>
+            <w:pPr>
+              <w:spacing w:after="0" w:before="0" w:line="240" w:lineRule="auto"/>
+            </w:pPr>
+            <w:r>
+              <w:rPr>
+                <w:sz w:val="19"/>
+              </w:rPr>
+              <w:t>C7</w:t>
+            </w:r>
+          </w:p>
+        </w:tc>
+        <w:tc>
+          <w:tcPr>
+            <w:tcW w:type="dxa" w:w="3231"/>
+            <w:vAlign w:val="center"/>
+            <w:tcMar>
+              <w:top w:w="85" w:type="dxa"/>
+              <w:left w:w="85" w:type="dxa"/>
+              <w:bottom w:w="85" w:type="dxa"/>
+              <w:right w:w="85" w:type="dxa"/>
+            </w:tcMar>
+            <w:shd w:fill="F5F7F8"/>
+          </w:tcPr>
+          <w:p>
+            <w:pPr>
+              <w:spacing w:after="0" w:before="0" w:line="240" w:lineRule="auto"/>
+            </w:pPr>
+            <w:r>
+              <w:rPr>
+                <w:sz w:val="19"/>
+              </w:rPr>
+              <w:t>1 мкФ, X7R, 1206, 25 В</w:t>
+            </w:r>
+          </w:p>
+        </w:tc>
+        <w:tc>
+          <w:tcPr>
+            <w:tcW w:type="dxa" w:w="3798"/>
+            <w:vAlign w:val="center"/>
+            <w:tcMar>
+              <w:top w:w="85" w:type="dxa"/>
+              <w:left w:w="85" w:type="dxa"/>
+              <w:bottom w:w="85" w:type="dxa"/>
+              <w:right w:w="85" w:type="dxa"/>
+            </w:tcMar>
+            <w:shd w:fill="F5F7F8"/>
+          </w:tcPr>
+          <w:p>
+            <w:pPr>
+              <w:spacing w:after="0" w:before="0" w:line="240" w:lineRule="auto"/>
+            </w:pPr>
+            <w:r>
+              <w:rPr>
+                <w:sz w:val="19"/>
+              </w:rPr>
+              <w:t>Дополнительная местная ёмкость питания U1</w:t>
             </w:r>
           </w:p>
         </w:tc>
@@ -2197,17 +2288,7 @@
     </w:p>
     <w:p>
       <w:r>
-        <w:t>Порядок простой: обесточить и отделить деталь от схемы; дать остыть после пайки; установить чёрный щуп в COM, красный в VΩHz и включить измерение сопротивления. RM102 выбирает диапазон автоматически: проверить единицы и разряды, дождаться устойчивого показания. Пальцами не держать одновременно оба металлических вывода. Записать обозначение, номинал, показание и диапазон. На собранной плате параллельные цепи могут занизить результат.</w:t>
-      </w:r>
-    </w:p>
-    <w:p>
-      <w:r>
-        <w:t>В найденной инструкции RM101/RM102 погрешность сопротивления до 6 МОм указана как ±(0,5% показания + 3 единицы младшего разряда) [8]. Например, для 33,00 кОм на диапазоне 60,00 кОм это ±0,195 кОм: 0,165 кОм плюс 0,03 кОм. Последние цифры дисплея не означают такую же точность.</w:t>
-      </w:r>
-    </w:p>
-    <w:p>
-      <w:r>
-        <w:t>Правило отбора оставляет запас относительно 5%: даже на краю приведённого окна сумма отклонения показания и паспортной ошибки меньше 4%. Это справедливо, только если инструкция соответствует именно вашему исправному прибору и соблюдены её условия. При другом диапазоне или другой точности границы надо проверить заново.</w:t>
+        <w:t>C5 пользователь сообщил как C0G в корпусе 0805. Для расчёта r3 принят допуск 5%; точный допуск, напряжение и артикул конкретной детали требуется подтвердить. Деталь на 50 В удовлетворяет требованию не менее 25 В. Для C6/C7 минимум по схеме 10 В, для закупки выбран номинал 25 В; допустим начальный допуск 10% или 20%. Эффективную ёмкость при 3,3 В нужно проверить по паспорту выбранной серии.</w:t>
       </w:r>
     </w:p>
     <w:p>
@@ -2215,15 +2296,2857 @@
         <w:rPr>
           <w:b/>
         </w:rPr>
-        <w:t>Отобранный резистор остаётся деталью 5%.</w:t>
+        <w:t>Почему не X7R в C1–C5.</w:t>
       </w:r>
       <w:r>
-        <w:t xml:space="preserve"> Он не получает паспортного допуска 1%, малый температурный коэффициент или подтверждённую долговременную стабильность. R1–R9 таким подбором не заменяем. Если R10–R12 не попали в окно, выбираем другие детали либо ставим готовые 1% тех же номиналов; их также проверяем на явную ошибку маркировки.</w:t>
+        <w:t xml:space="preserve"> C0G и X7R — оба керамические диэлектрики, но у X7R ёмкость зависит от напряжения, температуры и времени. Подбор прибором при одном напряжении этого не исправляет [9]. В r3 X7R оставлен в питании; фильтр рассчитан под MKP, а C5 — под C0G. При изменении типа требуется отдельная проверка.</w:t>
       </w:r>
     </w:p>
     <w:p>
       <w:r>
-        <w:t>Измерение сопротивления не проверяет форму импульса, самовозбуждение ОУ или поведение при выключении питания. Эти проверки относятся к готовому макету и выполняются отдельно.</w:t>
+        <w:t>Измеритель ёмкости помогает найти ошибочный номинал и записать исходные значения. Он не превращает деталь 5% в 2% и не проверяет самовозбуждение схемы. Надпись 50 В относится к конденсатору, а не к разрешённому напряжению на разъёме CH1.</w:t>
+      </w:r>
+    </w:p>
+    <w:p>
+      <w:pPr>
+        <w:pStyle w:val="Heading1"/>
+        <w:pageBreakBefore/>
+      </w:pPr>
+      <w:r>
+        <w:t>6в Полный список электронных деталей P1</w:t>
+      </w:r>
+    </w:p>
+    <w:p>
+      <w:r>
+        <w:t>Количество ниже нужно на один макет r3, без запасных деталей. Все постоянные резисторы — металлоплёночные, 0,25 Вт, 1%. Обозначения совпадают со схемой в разделе 10 и картой соединений. RV1 считается отдельно.</w:t>
+      </w:r>
+    </w:p>
+    <w:tbl>
+      <w:tblPr>
+        <w:tblW w:type="auto" w:w="0"/>
+        <w:jc w:val="center"/>
+        <w:tblLayout w:type="fixed"/>
+        <w:tblLook w:firstColumn="1" w:firstRow="1" w:lastColumn="0" w:lastRow="0" w:noHBand="0" w:noVBand="1" w:val="04A0"/>
+        <w:tblBorders>
+          <w:top w:val="single" w:sz="4" w:color="D9D9D9"/>
+          <w:left w:val="single" w:sz="4" w:color="D9D9D9"/>
+          <w:bottom w:val="single" w:sz="4" w:color="D9D9D9"/>
+          <w:right w:val="single" w:sz="4" w:color="D9D9D9"/>
+          <w:insideH w:val="single" w:sz="4" w:color="D9D9D9"/>
+          <w:insideV w:val="single" w:sz="4" w:color="D9D9D9"/>
+        </w:tblBorders>
+      </w:tblPr>
+      <w:tblGrid>
+        <w:gridCol w:w="1587"/>
+        <w:gridCol w:w="737"/>
+        <w:gridCol w:w="2268"/>
+        <w:gridCol w:w="4762"/>
+      </w:tblGrid>
+      <w:tr>
+        <w:trPr>
+          <w:cantSplit/>
+          <w:tblHeader/>
+        </w:trPr>
+        <w:tc>
+          <w:tcPr>
+            <w:tcW w:type="dxa" w:w="1587"/>
+            <w:vAlign w:val="center"/>
+            <w:tcMar>
+              <w:top w:w="85" w:type="dxa"/>
+              <w:left w:w="85" w:type="dxa"/>
+              <w:bottom w:w="85" w:type="dxa"/>
+              <w:right w:w="85" w:type="dxa"/>
+            </w:tcMar>
+            <w:shd w:fill="DFEAF0"/>
+          </w:tcPr>
+          <w:p>
+            <w:pPr>
+              <w:spacing w:after="0" w:before="0" w:line="240" w:lineRule="auto"/>
+              <w:jc w:val="center"/>
+            </w:pPr>
+            <w:r>
+              <w:rPr>
+                <w:b/>
+                <w:sz w:val="19"/>
+              </w:rPr>
+              <w:t>Обозначение</w:t>
+            </w:r>
+          </w:p>
+        </w:tc>
+        <w:tc>
+          <w:tcPr>
+            <w:tcW w:type="dxa" w:w="737"/>
+            <w:vAlign w:val="center"/>
+            <w:tcMar>
+              <w:top w:w="85" w:type="dxa"/>
+              <w:left w:w="85" w:type="dxa"/>
+              <w:bottom w:w="85" w:type="dxa"/>
+              <w:right w:w="85" w:type="dxa"/>
+            </w:tcMar>
+            <w:shd w:fill="DFEAF0"/>
+          </w:tcPr>
+          <w:p>
+            <w:pPr>
+              <w:spacing w:after="0" w:before="0" w:line="240" w:lineRule="auto"/>
+              <w:jc w:val="center"/>
+            </w:pPr>
+            <w:r>
+              <w:rPr>
+                <w:b/>
+                <w:sz w:val="19"/>
+              </w:rPr>
+              <w:t>Штук</w:t>
+            </w:r>
+          </w:p>
+        </w:tc>
+        <w:tc>
+          <w:tcPr>
+            <w:tcW w:type="dxa" w:w="2268"/>
+            <w:vAlign w:val="center"/>
+            <w:tcMar>
+              <w:top w:w="85" w:type="dxa"/>
+              <w:left w:w="85" w:type="dxa"/>
+              <w:bottom w:w="85" w:type="dxa"/>
+              <w:right w:w="85" w:type="dxa"/>
+            </w:tcMar>
+            <w:shd w:fill="DFEAF0"/>
+          </w:tcPr>
+          <w:p>
+            <w:pPr>
+              <w:spacing w:after="0" w:before="0" w:line="240" w:lineRule="auto"/>
+            </w:pPr>
+            <w:r>
+              <w:rPr>
+                <w:b/>
+                <w:sz w:val="19"/>
+              </w:rPr>
+              <w:t>Номинал или модель</w:t>
+            </w:r>
+          </w:p>
+        </w:tc>
+        <w:tc>
+          <w:tcPr>
+            <w:tcW w:type="dxa" w:w="4762"/>
+            <w:vAlign w:val="center"/>
+            <w:tcMar>
+              <w:top w:w="85" w:type="dxa"/>
+              <w:left w:w="85" w:type="dxa"/>
+              <w:bottom w:w="85" w:type="dxa"/>
+              <w:right w:w="85" w:type="dxa"/>
+            </w:tcMar>
+            <w:shd w:fill="DFEAF0"/>
+          </w:tcPr>
+          <w:p>
+            <w:pPr>
+              <w:spacing w:after="0" w:before="0" w:line="240" w:lineRule="auto"/>
+            </w:pPr>
+            <w:r>
+              <w:rPr>
+                <w:b/>
+                <w:sz w:val="19"/>
+              </w:rPr>
+              <w:t>Требования к детали</w:t>
+            </w:r>
+          </w:p>
+        </w:tc>
+      </w:tr>
+      <w:tr>
+        <w:trPr>
+          <w:cantSplit/>
+        </w:trPr>
+        <w:tc>
+          <w:tcPr>
+            <w:tcW w:type="dxa" w:w="1587"/>
+            <w:vAlign w:val="center"/>
+            <w:tcMar>
+              <w:top w:w="85" w:type="dxa"/>
+              <w:left w:w="85" w:type="dxa"/>
+              <w:bottom w:w="85" w:type="dxa"/>
+              <w:right w:w="85" w:type="dxa"/>
+            </w:tcMar>
+            <w:shd w:fill="FFFFFF"/>
+          </w:tcPr>
+          <w:p>
+            <w:pPr>
+              <w:spacing w:after="0" w:before="0" w:line="240" w:lineRule="auto"/>
+              <w:jc w:val="center"/>
+            </w:pPr>
+            <w:r>
+              <w:rPr>
+                <w:sz w:val="19"/>
+              </w:rPr>
+              <w:t>U1</w:t>
+            </w:r>
+          </w:p>
+        </w:tc>
+        <w:tc>
+          <w:tcPr>
+            <w:tcW w:type="dxa" w:w="737"/>
+            <w:vAlign w:val="center"/>
+            <w:tcMar>
+              <w:top w:w="85" w:type="dxa"/>
+              <w:left w:w="85" w:type="dxa"/>
+              <w:bottom w:w="85" w:type="dxa"/>
+              <w:right w:w="85" w:type="dxa"/>
+            </w:tcMar>
+            <w:shd w:fill="FFFFFF"/>
+          </w:tcPr>
+          <w:p>
+            <w:pPr>
+              <w:spacing w:after="0" w:before="0" w:line="240" w:lineRule="auto"/>
+              <w:jc w:val="center"/>
+            </w:pPr>
+            <w:r>
+              <w:rPr>
+                <w:sz w:val="19"/>
+              </w:rPr>
+              <w:t>1</w:t>
+            </w:r>
+          </w:p>
+        </w:tc>
+        <w:tc>
+          <w:tcPr>
+            <w:tcW w:type="dxa" w:w="2268"/>
+            <w:vAlign w:val="center"/>
+            <w:tcMar>
+              <w:top w:w="85" w:type="dxa"/>
+              <w:left w:w="85" w:type="dxa"/>
+              <w:bottom w:w="85" w:type="dxa"/>
+              <w:right w:w="85" w:type="dxa"/>
+            </w:tcMar>
+            <w:shd w:fill="FFFFFF"/>
+          </w:tcPr>
+          <w:p>
+            <w:pPr>
+              <w:spacing w:after="0" w:before="0" w:line="240" w:lineRule="auto"/>
+            </w:pPr>
+            <w:r>
+              <w:rPr>
+                <w:sz w:val="19"/>
+              </w:rPr>
+              <w:t>TLV9064QDRQ1</w:t>
+            </w:r>
+          </w:p>
+        </w:tc>
+        <w:tc>
+          <w:tcPr>
+            <w:tcW w:type="dxa" w:w="4762"/>
+            <w:vAlign w:val="center"/>
+            <w:tcMar>
+              <w:top w:w="85" w:type="dxa"/>
+              <w:left w:w="85" w:type="dxa"/>
+              <w:bottom w:w="85" w:type="dxa"/>
+              <w:right w:w="85" w:type="dxa"/>
+            </w:tcMar>
+            <w:shd w:fill="FFFFFF"/>
+          </w:tcPr>
+          <w:p>
+            <w:pPr>
+              <w:spacing w:after="0" w:before="0" w:line="240" w:lineRule="auto"/>
+            </w:pPr>
+            <w:r>
+              <w:rPr>
+                <w:sz w:val="19"/>
+              </w:rPr>
+              <w:t>TI, SOIC-14 D, шаг 1,27 мм; четыре ОУ</w:t>
+            </w:r>
+          </w:p>
+        </w:tc>
+      </w:tr>
+      <w:tr>
+        <w:trPr>
+          <w:cantSplit/>
+        </w:trPr>
+        <w:tc>
+          <w:tcPr>
+            <w:tcW w:type="dxa" w:w="1587"/>
+            <w:vAlign w:val="center"/>
+            <w:tcMar>
+              <w:top w:w="85" w:type="dxa"/>
+              <w:left w:w="85" w:type="dxa"/>
+              <w:bottom w:w="85" w:type="dxa"/>
+              <w:right w:w="85" w:type="dxa"/>
+            </w:tcMar>
+            <w:shd w:fill="F5F7F8"/>
+          </w:tcPr>
+          <w:p>
+            <w:pPr>
+              <w:spacing w:after="0" w:before="0" w:line="240" w:lineRule="auto"/>
+              <w:jc w:val="center"/>
+            </w:pPr>
+            <w:r>
+              <w:rPr>
+                <w:sz w:val="19"/>
+              </w:rPr>
+              <w:t>R1, R2</w:t>
+            </w:r>
+          </w:p>
+        </w:tc>
+        <w:tc>
+          <w:tcPr>
+            <w:tcW w:type="dxa" w:w="737"/>
+            <w:vAlign w:val="center"/>
+            <w:tcMar>
+              <w:top w:w="85" w:type="dxa"/>
+              <w:left w:w="85" w:type="dxa"/>
+              <w:bottom w:w="85" w:type="dxa"/>
+              <w:right w:w="85" w:type="dxa"/>
+            </w:tcMar>
+            <w:shd w:fill="F5F7F8"/>
+          </w:tcPr>
+          <w:p>
+            <w:pPr>
+              <w:spacing w:after="0" w:before="0" w:line="240" w:lineRule="auto"/>
+              <w:jc w:val="center"/>
+            </w:pPr>
+            <w:r>
+              <w:rPr>
+                <w:sz w:val="19"/>
+              </w:rPr>
+              <w:t>2</w:t>
+            </w:r>
+          </w:p>
+        </w:tc>
+        <w:tc>
+          <w:tcPr>
+            <w:tcW w:type="dxa" w:w="2268"/>
+            <w:vAlign w:val="center"/>
+            <w:tcMar>
+              <w:top w:w="85" w:type="dxa"/>
+              <w:left w:w="85" w:type="dxa"/>
+              <w:bottom w:w="85" w:type="dxa"/>
+              <w:right w:w="85" w:type="dxa"/>
+            </w:tcMar>
+            <w:shd w:fill="F5F7F8"/>
+          </w:tcPr>
+          <w:p>
+            <w:pPr>
+              <w:spacing w:after="0" w:before="0" w:line="240" w:lineRule="auto"/>
+            </w:pPr>
+            <w:r>
+              <w:rPr>
+                <w:sz w:val="19"/>
+              </w:rPr>
+              <w:t>510 кОм</w:t>
+            </w:r>
+          </w:p>
+        </w:tc>
+        <w:tc>
+          <w:tcPr>
+            <w:tcW w:type="dxa" w:w="4762"/>
+            <w:vAlign w:val="center"/>
+            <w:tcMar>
+              <w:top w:w="85" w:type="dxa"/>
+              <w:left w:w="85" w:type="dxa"/>
+              <w:bottom w:w="85" w:type="dxa"/>
+              <w:right w:w="85" w:type="dxa"/>
+            </w:tcMar>
+            <w:shd w:fill="F5F7F8"/>
+          </w:tcPr>
+          <w:p>
+            <w:pPr>
+              <w:spacing w:after="0" w:before="0" w:line="240" w:lineRule="auto"/>
+            </w:pPr>
+            <w:r>
+              <w:rPr>
+                <w:sz w:val="19"/>
+              </w:rPr>
+              <w:t>1%, TCR ≤25 ppm/°C</w:t>
+            </w:r>
+          </w:p>
+        </w:tc>
+      </w:tr>
+      <w:tr>
+        <w:trPr>
+          <w:cantSplit/>
+        </w:trPr>
+        <w:tc>
+          <w:tcPr>
+            <w:tcW w:type="dxa" w:w="1587"/>
+            <w:vAlign w:val="center"/>
+            <w:tcMar>
+              <w:top w:w="85" w:type="dxa"/>
+              <w:left w:w="85" w:type="dxa"/>
+              <w:bottom w:w="85" w:type="dxa"/>
+              <w:right w:w="85" w:type="dxa"/>
+            </w:tcMar>
+            <w:shd w:fill="FFFFFF"/>
+          </w:tcPr>
+          <w:p>
+            <w:pPr>
+              <w:spacing w:after="0" w:before="0" w:line="240" w:lineRule="auto"/>
+              <w:jc w:val="center"/>
+            </w:pPr>
+            <w:r>
+              <w:rPr>
+                <w:sz w:val="19"/>
+              </w:rPr>
+              <w:t>R3</w:t>
+            </w:r>
+          </w:p>
+        </w:tc>
+        <w:tc>
+          <w:tcPr>
+            <w:tcW w:type="dxa" w:w="737"/>
+            <w:vAlign w:val="center"/>
+            <w:tcMar>
+              <w:top w:w="85" w:type="dxa"/>
+              <w:left w:w="85" w:type="dxa"/>
+              <w:bottom w:w="85" w:type="dxa"/>
+              <w:right w:w="85" w:type="dxa"/>
+            </w:tcMar>
+            <w:shd w:fill="FFFFFF"/>
+          </w:tcPr>
+          <w:p>
+            <w:pPr>
+              <w:spacing w:after="0" w:before="0" w:line="240" w:lineRule="auto"/>
+              <w:jc w:val="center"/>
+            </w:pPr>
+            <w:r>
+              <w:rPr>
+                <w:sz w:val="19"/>
+              </w:rPr>
+              <w:t>1</w:t>
+            </w:r>
+          </w:p>
+        </w:tc>
+        <w:tc>
+          <w:tcPr>
+            <w:tcW w:type="dxa" w:w="2268"/>
+            <w:vAlign w:val="center"/>
+            <w:tcMar>
+              <w:top w:w="85" w:type="dxa"/>
+              <w:left w:w="85" w:type="dxa"/>
+              <w:bottom w:w="85" w:type="dxa"/>
+              <w:right w:w="85" w:type="dxa"/>
+            </w:tcMar>
+            <w:shd w:fill="FFFFFF"/>
+          </w:tcPr>
+          <w:p>
+            <w:pPr>
+              <w:spacing w:after="0" w:before="0" w:line="240" w:lineRule="auto"/>
+            </w:pPr>
+            <w:r>
+              <w:rPr>
+                <w:sz w:val="19"/>
+              </w:rPr>
+              <w:t>240 кОм</w:t>
+            </w:r>
+          </w:p>
+        </w:tc>
+        <w:tc>
+          <w:tcPr>
+            <w:tcW w:type="dxa" w:w="4762"/>
+            <w:vAlign w:val="center"/>
+            <w:tcMar>
+              <w:top w:w="85" w:type="dxa"/>
+              <w:left w:w="85" w:type="dxa"/>
+              <w:bottom w:w="85" w:type="dxa"/>
+              <w:right w:w="85" w:type="dxa"/>
+            </w:tcMar>
+            <w:shd w:fill="FFFFFF"/>
+          </w:tcPr>
+          <w:p>
+            <w:pPr>
+              <w:spacing w:after="0" w:before="0" w:line="240" w:lineRule="auto"/>
+            </w:pPr>
+            <w:r>
+              <w:rPr>
+                <w:sz w:val="19"/>
+              </w:rPr>
+              <w:t>1%, TCR ≤25 ppm/°C</w:t>
+            </w:r>
+          </w:p>
+        </w:tc>
+      </w:tr>
+      <w:tr>
+        <w:trPr>
+          <w:cantSplit/>
+        </w:trPr>
+        <w:tc>
+          <w:tcPr>
+            <w:tcW w:type="dxa" w:w="1587"/>
+            <w:vAlign w:val="center"/>
+            <w:tcMar>
+              <w:top w:w="85" w:type="dxa"/>
+              <w:left w:w="85" w:type="dxa"/>
+              <w:bottom w:w="85" w:type="dxa"/>
+              <w:right w:w="85" w:type="dxa"/>
+            </w:tcMar>
+            <w:shd w:fill="F5F7F8"/>
+          </w:tcPr>
+          <w:p>
+            <w:pPr>
+              <w:spacing w:after="0" w:before="0" w:line="240" w:lineRule="auto"/>
+              <w:jc w:val="center"/>
+            </w:pPr>
+            <w:r>
+              <w:rPr>
+                <w:sz w:val="19"/>
+              </w:rPr>
+              <w:t>R4</w:t>
+            </w:r>
+          </w:p>
+        </w:tc>
+        <w:tc>
+          <w:tcPr>
+            <w:tcW w:type="dxa" w:w="737"/>
+            <w:vAlign w:val="center"/>
+            <w:tcMar>
+              <w:top w:w="85" w:type="dxa"/>
+              <w:left w:w="85" w:type="dxa"/>
+              <w:bottom w:w="85" w:type="dxa"/>
+              <w:right w:w="85" w:type="dxa"/>
+            </w:tcMar>
+            <w:shd w:fill="F5F7F8"/>
+          </w:tcPr>
+          <w:p>
+            <w:pPr>
+              <w:spacing w:after="0" w:before="0" w:line="240" w:lineRule="auto"/>
+              <w:jc w:val="center"/>
+            </w:pPr>
+            <w:r>
+              <w:rPr>
+                <w:sz w:val="19"/>
+              </w:rPr>
+              <w:t>1</w:t>
+            </w:r>
+          </w:p>
+        </w:tc>
+        <w:tc>
+          <w:tcPr>
+            <w:tcW w:type="dxa" w:w="2268"/>
+            <w:vAlign w:val="center"/>
+            <w:tcMar>
+              <w:top w:w="85" w:type="dxa"/>
+              <w:left w:w="85" w:type="dxa"/>
+              <w:bottom w:w="85" w:type="dxa"/>
+              <w:right w:w="85" w:type="dxa"/>
+            </w:tcMar>
+            <w:shd w:fill="F5F7F8"/>
+          </w:tcPr>
+          <w:p>
+            <w:pPr>
+              <w:spacing w:after="0" w:before="0" w:line="240" w:lineRule="auto"/>
+            </w:pPr>
+            <w:r>
+              <w:rPr>
+                <w:sz w:val="19"/>
+              </w:rPr>
+              <w:t>330 кОм</w:t>
+            </w:r>
+          </w:p>
+        </w:tc>
+        <w:tc>
+          <w:tcPr>
+            <w:tcW w:type="dxa" w:w="4762"/>
+            <w:vAlign w:val="center"/>
+            <w:tcMar>
+              <w:top w:w="85" w:type="dxa"/>
+              <w:left w:w="85" w:type="dxa"/>
+              <w:bottom w:w="85" w:type="dxa"/>
+              <w:right w:w="85" w:type="dxa"/>
+            </w:tcMar>
+            <w:shd w:fill="F5F7F8"/>
+          </w:tcPr>
+          <w:p>
+            <w:pPr>
+              <w:spacing w:after="0" w:before="0" w:line="240" w:lineRule="auto"/>
+            </w:pPr>
+            <w:r>
+              <w:rPr>
+                <w:sz w:val="19"/>
+              </w:rPr>
+              <w:t>1%, TCR ≤25 ppm/°C</w:t>
+            </w:r>
+          </w:p>
+        </w:tc>
+      </w:tr>
+      <w:tr>
+        <w:trPr>
+          <w:cantSplit/>
+        </w:trPr>
+        <w:tc>
+          <w:tcPr>
+            <w:tcW w:type="dxa" w:w="1587"/>
+            <w:vAlign w:val="center"/>
+            <w:tcMar>
+              <w:top w:w="85" w:type="dxa"/>
+              <w:left w:w="85" w:type="dxa"/>
+              <w:bottom w:w="85" w:type="dxa"/>
+              <w:right w:w="85" w:type="dxa"/>
+            </w:tcMar>
+            <w:shd w:fill="FFFFFF"/>
+          </w:tcPr>
+          <w:p>
+            <w:pPr>
+              <w:spacing w:after="0" w:before="0" w:line="240" w:lineRule="auto"/>
+              <w:jc w:val="center"/>
+            </w:pPr>
+            <w:r>
+              <w:rPr>
+                <w:sz w:val="19"/>
+              </w:rPr>
+              <w:t>R5, R6</w:t>
+            </w:r>
+          </w:p>
+        </w:tc>
+        <w:tc>
+          <w:tcPr>
+            <w:tcW w:type="dxa" w:w="737"/>
+            <w:vAlign w:val="center"/>
+            <w:tcMar>
+              <w:top w:w="85" w:type="dxa"/>
+              <w:left w:w="85" w:type="dxa"/>
+              <w:bottom w:w="85" w:type="dxa"/>
+              <w:right w:w="85" w:type="dxa"/>
+            </w:tcMar>
+            <w:shd w:fill="FFFFFF"/>
+          </w:tcPr>
+          <w:p>
+            <w:pPr>
+              <w:spacing w:after="0" w:before="0" w:line="240" w:lineRule="auto"/>
+              <w:jc w:val="center"/>
+            </w:pPr>
+            <w:r>
+              <w:rPr>
+                <w:sz w:val="19"/>
+              </w:rPr>
+              <w:t>2</w:t>
+            </w:r>
+          </w:p>
+        </w:tc>
+        <w:tc>
+          <w:tcPr>
+            <w:tcW w:type="dxa" w:w="2268"/>
+            <w:vAlign w:val="center"/>
+            <w:tcMar>
+              <w:top w:w="85" w:type="dxa"/>
+              <w:left w:w="85" w:type="dxa"/>
+              <w:bottom w:w="85" w:type="dxa"/>
+              <w:right w:w="85" w:type="dxa"/>
+            </w:tcMar>
+            <w:shd w:fill="FFFFFF"/>
+          </w:tcPr>
+          <w:p>
+            <w:pPr>
+              <w:spacing w:after="0" w:before="0" w:line="240" w:lineRule="auto"/>
+            </w:pPr>
+            <w:r>
+              <w:rPr>
+                <w:sz w:val="19"/>
+              </w:rPr>
+              <w:t>4,7 кОм</w:t>
+            </w:r>
+          </w:p>
+        </w:tc>
+        <w:tc>
+          <w:tcPr>
+            <w:tcW w:type="dxa" w:w="4762"/>
+            <w:vAlign w:val="center"/>
+            <w:tcMar>
+              <w:top w:w="85" w:type="dxa"/>
+              <w:left w:w="85" w:type="dxa"/>
+              <w:bottom w:w="85" w:type="dxa"/>
+              <w:right w:w="85" w:type="dxa"/>
+            </w:tcMar>
+            <w:shd w:fill="FFFFFF"/>
+          </w:tcPr>
+          <w:p>
+            <w:pPr>
+              <w:spacing w:after="0" w:before="0" w:line="240" w:lineRule="auto"/>
+            </w:pPr>
+            <w:r>
+              <w:rPr>
+                <w:sz w:val="19"/>
+              </w:rPr>
+              <w:t>1%</w:t>
+            </w:r>
+          </w:p>
+        </w:tc>
+      </w:tr>
+      <w:tr>
+        <w:trPr>
+          <w:cantSplit/>
+        </w:trPr>
+        <w:tc>
+          <w:tcPr>
+            <w:tcW w:type="dxa" w:w="1587"/>
+            <w:vAlign w:val="center"/>
+            <w:tcMar>
+              <w:top w:w="85" w:type="dxa"/>
+              <w:left w:w="85" w:type="dxa"/>
+              <w:bottom w:w="85" w:type="dxa"/>
+              <w:right w:w="85" w:type="dxa"/>
+            </w:tcMar>
+            <w:shd w:fill="F5F7F8"/>
+          </w:tcPr>
+          <w:p>
+            <w:pPr>
+              <w:spacing w:after="0" w:before="0" w:line="240" w:lineRule="auto"/>
+              <w:jc w:val="center"/>
+            </w:pPr>
+            <w:r>
+              <w:rPr>
+                <w:sz w:val="19"/>
+              </w:rPr>
+              <w:t>R7, R8</w:t>
+            </w:r>
+          </w:p>
+        </w:tc>
+        <w:tc>
+          <w:tcPr>
+            <w:tcW w:type="dxa" w:w="737"/>
+            <w:vAlign w:val="center"/>
+            <w:tcMar>
+              <w:top w:w="85" w:type="dxa"/>
+              <w:left w:w="85" w:type="dxa"/>
+              <w:bottom w:w="85" w:type="dxa"/>
+              <w:right w:w="85" w:type="dxa"/>
+            </w:tcMar>
+            <w:shd w:fill="F5F7F8"/>
+          </w:tcPr>
+          <w:p>
+            <w:pPr>
+              <w:spacing w:after="0" w:before="0" w:line="240" w:lineRule="auto"/>
+              <w:jc w:val="center"/>
+            </w:pPr>
+            <w:r>
+              <w:rPr>
+                <w:sz w:val="19"/>
+              </w:rPr>
+              <w:t>2</w:t>
+            </w:r>
+          </w:p>
+        </w:tc>
+        <w:tc>
+          <w:tcPr>
+            <w:tcW w:type="dxa" w:w="2268"/>
+            <w:vAlign w:val="center"/>
+            <w:tcMar>
+              <w:top w:w="85" w:type="dxa"/>
+              <w:left w:w="85" w:type="dxa"/>
+              <w:bottom w:w="85" w:type="dxa"/>
+              <w:right w:w="85" w:type="dxa"/>
+            </w:tcMar>
+            <w:shd w:fill="F5F7F8"/>
+          </w:tcPr>
+          <w:p>
+            <w:pPr>
+              <w:spacing w:after="0" w:before="0" w:line="240" w:lineRule="auto"/>
+            </w:pPr>
+            <w:r>
+              <w:rPr>
+                <w:sz w:val="19"/>
+              </w:rPr>
+              <w:t>2 кОм</w:t>
+            </w:r>
+          </w:p>
+        </w:tc>
+        <w:tc>
+          <w:tcPr>
+            <w:tcW w:type="dxa" w:w="4762"/>
+            <w:vAlign w:val="center"/>
+            <w:tcMar>
+              <w:top w:w="85" w:type="dxa"/>
+              <w:left w:w="85" w:type="dxa"/>
+              <w:bottom w:w="85" w:type="dxa"/>
+              <w:right w:w="85" w:type="dxa"/>
+            </w:tcMar>
+            <w:shd w:fill="F5F7F8"/>
+          </w:tcPr>
+          <w:p>
+            <w:pPr>
+              <w:spacing w:after="0" w:before="0" w:line="240" w:lineRule="auto"/>
+            </w:pPr>
+            <w:r>
+              <w:rPr>
+                <w:sz w:val="19"/>
+              </w:rPr>
+              <w:t>1%</w:t>
+            </w:r>
+          </w:p>
+        </w:tc>
+      </w:tr>
+      <w:tr>
+        <w:trPr>
+          <w:cantSplit/>
+        </w:trPr>
+        <w:tc>
+          <w:tcPr>
+            <w:tcW w:type="dxa" w:w="1587"/>
+            <w:vAlign w:val="center"/>
+            <w:tcMar>
+              <w:top w:w="85" w:type="dxa"/>
+              <w:left w:w="85" w:type="dxa"/>
+              <w:bottom w:w="85" w:type="dxa"/>
+              <w:right w:w="85" w:type="dxa"/>
+            </w:tcMar>
+            <w:shd w:fill="FFFFFF"/>
+          </w:tcPr>
+          <w:p>
+            <w:pPr>
+              <w:spacing w:after="0" w:before="0" w:line="240" w:lineRule="auto"/>
+              <w:jc w:val="center"/>
+            </w:pPr>
+            <w:r>
+              <w:rPr>
+                <w:sz w:val="19"/>
+              </w:rPr>
+              <w:t>R9</w:t>
+            </w:r>
+          </w:p>
+        </w:tc>
+        <w:tc>
+          <w:tcPr>
+            <w:tcW w:type="dxa" w:w="737"/>
+            <w:vAlign w:val="center"/>
+            <w:tcMar>
+              <w:top w:w="85" w:type="dxa"/>
+              <w:left w:w="85" w:type="dxa"/>
+              <w:bottom w:w="85" w:type="dxa"/>
+              <w:right w:w="85" w:type="dxa"/>
+            </w:tcMar>
+            <w:shd w:fill="FFFFFF"/>
+          </w:tcPr>
+          <w:p>
+            <w:pPr>
+              <w:spacing w:after="0" w:before="0" w:line="240" w:lineRule="auto"/>
+              <w:jc w:val="center"/>
+            </w:pPr>
+            <w:r>
+              <w:rPr>
+                <w:sz w:val="19"/>
+              </w:rPr>
+              <w:t>1</w:t>
+            </w:r>
+          </w:p>
+        </w:tc>
+        <w:tc>
+          <w:tcPr>
+            <w:tcW w:type="dxa" w:w="2268"/>
+            <w:vAlign w:val="center"/>
+            <w:tcMar>
+              <w:top w:w="85" w:type="dxa"/>
+              <w:left w:w="85" w:type="dxa"/>
+              <w:bottom w:w="85" w:type="dxa"/>
+              <w:right w:w="85" w:type="dxa"/>
+            </w:tcMar>
+            <w:shd w:fill="FFFFFF"/>
+          </w:tcPr>
+          <w:p>
+            <w:pPr>
+              <w:spacing w:after="0" w:before="0" w:line="240" w:lineRule="auto"/>
+            </w:pPr>
+            <w:r>
+              <w:rPr>
+                <w:sz w:val="19"/>
+              </w:rPr>
+              <w:t>330 Ом</w:t>
+            </w:r>
+          </w:p>
+        </w:tc>
+        <w:tc>
+          <w:tcPr>
+            <w:tcW w:type="dxa" w:w="4762"/>
+            <w:vAlign w:val="center"/>
+            <w:tcMar>
+              <w:top w:w="85" w:type="dxa"/>
+              <w:left w:w="85" w:type="dxa"/>
+              <w:bottom w:w="85" w:type="dxa"/>
+              <w:right w:w="85" w:type="dxa"/>
+            </w:tcMar>
+            <w:shd w:fill="FFFFFF"/>
+          </w:tcPr>
+          <w:p>
+            <w:pPr>
+              <w:spacing w:after="0" w:before="0" w:line="240" w:lineRule="auto"/>
+            </w:pPr>
+            <w:r>
+              <w:rPr>
+                <w:sz w:val="19"/>
+              </w:rPr>
+              <w:t>1%</w:t>
+            </w:r>
+          </w:p>
+        </w:tc>
+      </w:tr>
+      <w:tr>
+        <w:trPr>
+          <w:cantSplit/>
+        </w:trPr>
+        <w:tc>
+          <w:tcPr>
+            <w:tcW w:type="dxa" w:w="1587"/>
+            <w:vAlign w:val="center"/>
+            <w:tcMar>
+              <w:top w:w="85" w:type="dxa"/>
+              <w:left w:w="85" w:type="dxa"/>
+              <w:bottom w:w="85" w:type="dxa"/>
+              <w:right w:w="85" w:type="dxa"/>
+            </w:tcMar>
+            <w:shd w:fill="F5F7F8"/>
+          </w:tcPr>
+          <w:p>
+            <w:pPr>
+              <w:spacing w:after="0" w:before="0" w:line="240" w:lineRule="auto"/>
+              <w:jc w:val="center"/>
+            </w:pPr>
+            <w:r>
+              <w:rPr>
+                <w:sz w:val="19"/>
+              </w:rPr>
+              <w:t>R10</w:t>
+            </w:r>
+          </w:p>
+        </w:tc>
+        <w:tc>
+          <w:tcPr>
+            <w:tcW w:type="dxa" w:w="737"/>
+            <w:vAlign w:val="center"/>
+            <w:tcMar>
+              <w:top w:w="85" w:type="dxa"/>
+              <w:left w:w="85" w:type="dxa"/>
+              <w:bottom w:w="85" w:type="dxa"/>
+              <w:right w:w="85" w:type="dxa"/>
+            </w:tcMar>
+            <w:shd w:fill="F5F7F8"/>
+          </w:tcPr>
+          <w:p>
+            <w:pPr>
+              <w:spacing w:after="0" w:before="0" w:line="240" w:lineRule="auto"/>
+              <w:jc w:val="center"/>
+            </w:pPr>
+            <w:r>
+              <w:rPr>
+                <w:sz w:val="19"/>
+              </w:rPr>
+              <w:t>1</w:t>
+            </w:r>
+          </w:p>
+        </w:tc>
+        <w:tc>
+          <w:tcPr>
+            <w:tcW w:type="dxa" w:w="2268"/>
+            <w:vAlign w:val="center"/>
+            <w:tcMar>
+              <w:top w:w="85" w:type="dxa"/>
+              <w:left w:w="85" w:type="dxa"/>
+              <w:bottom w:w="85" w:type="dxa"/>
+              <w:right w:w="85" w:type="dxa"/>
+            </w:tcMar>
+            <w:shd w:fill="F5F7F8"/>
+          </w:tcPr>
+          <w:p>
+            <w:pPr>
+              <w:spacing w:after="0" w:before="0" w:line="240" w:lineRule="auto"/>
+            </w:pPr>
+            <w:r>
+              <w:rPr>
+                <w:sz w:val="19"/>
+              </w:rPr>
+              <w:t>33 кОм</w:t>
+            </w:r>
+          </w:p>
+        </w:tc>
+        <w:tc>
+          <w:tcPr>
+            <w:tcW w:type="dxa" w:w="4762"/>
+            <w:vAlign w:val="center"/>
+            <w:tcMar>
+              <w:top w:w="85" w:type="dxa"/>
+              <w:left w:w="85" w:type="dxa"/>
+              <w:bottom w:w="85" w:type="dxa"/>
+              <w:right w:w="85" w:type="dxa"/>
+            </w:tcMar>
+            <w:shd w:fill="F5F7F8"/>
+          </w:tcPr>
+          <w:p>
+            <w:pPr>
+              <w:spacing w:after="0" w:before="0" w:line="240" w:lineRule="auto"/>
+            </w:pPr>
+            <w:r>
+              <w:rPr>
+                <w:sz w:val="19"/>
+              </w:rPr>
+              <w:t>1%</w:t>
+            </w:r>
+          </w:p>
+        </w:tc>
+      </w:tr>
+      <w:tr>
+        <w:trPr>
+          <w:cantSplit/>
+        </w:trPr>
+        <w:tc>
+          <w:tcPr>
+            <w:tcW w:type="dxa" w:w="1587"/>
+            <w:vAlign w:val="center"/>
+            <w:tcMar>
+              <w:top w:w="85" w:type="dxa"/>
+              <w:left w:w="85" w:type="dxa"/>
+              <w:bottom w:w="85" w:type="dxa"/>
+              <w:right w:w="85" w:type="dxa"/>
+            </w:tcMar>
+            <w:shd w:fill="FFFFFF"/>
+          </w:tcPr>
+          <w:p>
+            <w:pPr>
+              <w:spacing w:after="0" w:before="0" w:line="240" w:lineRule="auto"/>
+              <w:jc w:val="center"/>
+            </w:pPr>
+            <w:r>
+              <w:rPr>
+                <w:sz w:val="19"/>
+              </w:rPr>
+              <w:t>R11</w:t>
+            </w:r>
+          </w:p>
+        </w:tc>
+        <w:tc>
+          <w:tcPr>
+            <w:tcW w:type="dxa" w:w="737"/>
+            <w:vAlign w:val="center"/>
+            <w:tcMar>
+              <w:top w:w="85" w:type="dxa"/>
+              <w:left w:w="85" w:type="dxa"/>
+              <w:bottom w:w="85" w:type="dxa"/>
+              <w:right w:w="85" w:type="dxa"/>
+            </w:tcMar>
+            <w:shd w:fill="FFFFFF"/>
+          </w:tcPr>
+          <w:p>
+            <w:pPr>
+              <w:spacing w:after="0" w:before="0" w:line="240" w:lineRule="auto"/>
+              <w:jc w:val="center"/>
+            </w:pPr>
+            <w:r>
+              <w:rPr>
+                <w:sz w:val="19"/>
+              </w:rPr>
+              <w:t>1</w:t>
+            </w:r>
+          </w:p>
+        </w:tc>
+        <w:tc>
+          <w:tcPr>
+            <w:tcW w:type="dxa" w:w="2268"/>
+            <w:vAlign w:val="center"/>
+            <w:tcMar>
+              <w:top w:w="85" w:type="dxa"/>
+              <w:left w:w="85" w:type="dxa"/>
+              <w:bottom w:w="85" w:type="dxa"/>
+              <w:right w:w="85" w:type="dxa"/>
+            </w:tcMar>
+            <w:shd w:fill="FFFFFF"/>
+          </w:tcPr>
+          <w:p>
+            <w:pPr>
+              <w:spacing w:after="0" w:before="0" w:line="240" w:lineRule="auto"/>
+            </w:pPr>
+            <w:r>
+              <w:rPr>
+                <w:sz w:val="19"/>
+              </w:rPr>
+              <w:t>1 кОм</w:t>
+            </w:r>
+          </w:p>
+        </w:tc>
+        <w:tc>
+          <w:tcPr>
+            <w:tcW w:type="dxa" w:w="4762"/>
+            <w:vAlign w:val="center"/>
+            <w:tcMar>
+              <w:top w:w="85" w:type="dxa"/>
+              <w:left w:w="85" w:type="dxa"/>
+              <w:bottom w:w="85" w:type="dxa"/>
+              <w:right w:w="85" w:type="dxa"/>
+            </w:tcMar>
+            <w:shd w:fill="FFFFFF"/>
+          </w:tcPr>
+          <w:p>
+            <w:pPr>
+              <w:spacing w:after="0" w:before="0" w:line="240" w:lineRule="auto"/>
+            </w:pPr>
+            <w:r>
+              <w:rPr>
+                <w:sz w:val="19"/>
+              </w:rPr>
+              <w:t>1%</w:t>
+            </w:r>
+          </w:p>
+        </w:tc>
+      </w:tr>
+      <w:tr>
+        <w:trPr>
+          <w:cantSplit/>
+        </w:trPr>
+        <w:tc>
+          <w:tcPr>
+            <w:tcW w:type="dxa" w:w="1587"/>
+            <w:vAlign w:val="center"/>
+            <w:tcMar>
+              <w:top w:w="85" w:type="dxa"/>
+              <w:left w:w="85" w:type="dxa"/>
+              <w:bottom w:w="85" w:type="dxa"/>
+              <w:right w:w="85" w:type="dxa"/>
+            </w:tcMar>
+            <w:shd w:fill="F5F7F8"/>
+          </w:tcPr>
+          <w:p>
+            <w:pPr>
+              <w:spacing w:after="0" w:before="0" w:line="240" w:lineRule="auto"/>
+              <w:jc w:val="center"/>
+            </w:pPr>
+            <w:r>
+              <w:rPr>
+                <w:sz w:val="19"/>
+              </w:rPr>
+              <w:t>R12</w:t>
+            </w:r>
+          </w:p>
+        </w:tc>
+        <w:tc>
+          <w:tcPr>
+            <w:tcW w:type="dxa" w:w="737"/>
+            <w:vAlign w:val="center"/>
+            <w:tcMar>
+              <w:top w:w="85" w:type="dxa"/>
+              <w:left w:w="85" w:type="dxa"/>
+              <w:bottom w:w="85" w:type="dxa"/>
+              <w:right w:w="85" w:type="dxa"/>
+            </w:tcMar>
+            <w:shd w:fill="F5F7F8"/>
+          </w:tcPr>
+          <w:p>
+            <w:pPr>
+              <w:spacing w:after="0" w:before="0" w:line="240" w:lineRule="auto"/>
+              <w:jc w:val="center"/>
+            </w:pPr>
+            <w:r>
+              <w:rPr>
+                <w:sz w:val="19"/>
+              </w:rPr>
+              <w:t>1</w:t>
+            </w:r>
+          </w:p>
+        </w:tc>
+        <w:tc>
+          <w:tcPr>
+            <w:tcW w:type="dxa" w:w="2268"/>
+            <w:vAlign w:val="center"/>
+            <w:tcMar>
+              <w:top w:w="85" w:type="dxa"/>
+              <w:left w:w="85" w:type="dxa"/>
+              <w:bottom w:w="85" w:type="dxa"/>
+              <w:right w:w="85" w:type="dxa"/>
+            </w:tcMar>
+            <w:shd w:fill="F5F7F8"/>
+          </w:tcPr>
+          <w:p>
+            <w:pPr>
+              <w:spacing w:after="0" w:before="0" w:line="240" w:lineRule="auto"/>
+            </w:pPr>
+            <w:r>
+              <w:rPr>
+                <w:sz w:val="19"/>
+              </w:rPr>
+              <w:t>10 кОм</w:t>
+            </w:r>
+          </w:p>
+        </w:tc>
+        <w:tc>
+          <w:tcPr>
+            <w:tcW w:type="dxa" w:w="4762"/>
+            <w:vAlign w:val="center"/>
+            <w:tcMar>
+              <w:top w:w="85" w:type="dxa"/>
+              <w:left w:w="85" w:type="dxa"/>
+              <w:bottom w:w="85" w:type="dxa"/>
+              <w:right w:w="85" w:type="dxa"/>
+            </w:tcMar>
+            <w:shd w:fill="F5F7F8"/>
+          </w:tcPr>
+          <w:p>
+            <w:pPr>
+              <w:spacing w:after="0" w:before="0" w:line="240" w:lineRule="auto"/>
+            </w:pPr>
+            <w:r>
+              <w:rPr>
+                <w:sz w:val="19"/>
+              </w:rPr>
+              <w:t>1%</w:t>
+            </w:r>
+          </w:p>
+        </w:tc>
+      </w:tr>
+      <w:tr>
+        <w:trPr>
+          <w:cantSplit/>
+        </w:trPr>
+        <w:tc>
+          <w:tcPr>
+            <w:tcW w:type="dxa" w:w="1587"/>
+            <w:vAlign w:val="center"/>
+            <w:tcMar>
+              <w:top w:w="85" w:type="dxa"/>
+              <w:left w:w="85" w:type="dxa"/>
+              <w:bottom w:w="85" w:type="dxa"/>
+              <w:right w:w="85" w:type="dxa"/>
+            </w:tcMar>
+            <w:shd w:fill="FFFFFF"/>
+          </w:tcPr>
+          <w:p>
+            <w:pPr>
+              <w:spacing w:after="0" w:before="0" w:line="240" w:lineRule="auto"/>
+              <w:jc w:val="center"/>
+            </w:pPr>
+            <w:r>
+              <w:rPr>
+                <w:sz w:val="19"/>
+              </w:rPr>
+              <w:t>RV1</w:t>
+            </w:r>
+          </w:p>
+        </w:tc>
+        <w:tc>
+          <w:tcPr>
+            <w:tcW w:type="dxa" w:w="737"/>
+            <w:vAlign w:val="center"/>
+            <w:tcMar>
+              <w:top w:w="85" w:type="dxa"/>
+              <w:left w:w="85" w:type="dxa"/>
+              <w:bottom w:w="85" w:type="dxa"/>
+              <w:right w:w="85" w:type="dxa"/>
+            </w:tcMar>
+            <w:shd w:fill="FFFFFF"/>
+          </w:tcPr>
+          <w:p>
+            <w:pPr>
+              <w:spacing w:after="0" w:before="0" w:line="240" w:lineRule="auto"/>
+              <w:jc w:val="center"/>
+            </w:pPr>
+            <w:r>
+              <w:rPr>
+                <w:sz w:val="19"/>
+              </w:rPr>
+              <w:t>1</w:t>
+            </w:r>
+          </w:p>
+        </w:tc>
+        <w:tc>
+          <w:tcPr>
+            <w:tcW w:type="dxa" w:w="2268"/>
+            <w:vAlign w:val="center"/>
+            <w:tcMar>
+              <w:top w:w="85" w:type="dxa"/>
+              <w:left w:w="85" w:type="dxa"/>
+              <w:bottom w:w="85" w:type="dxa"/>
+              <w:right w:w="85" w:type="dxa"/>
+            </w:tcMar>
+            <w:shd w:fill="FFFFFF"/>
+          </w:tcPr>
+          <w:p>
+            <w:pPr>
+              <w:spacing w:after="0" w:before="0" w:line="240" w:lineRule="auto"/>
+            </w:pPr>
+            <w:r>
+              <w:rPr>
+                <w:sz w:val="19"/>
+              </w:rPr>
+              <w:t>10 кОм</w:t>
+            </w:r>
+          </w:p>
+        </w:tc>
+        <w:tc>
+          <w:tcPr>
+            <w:tcW w:type="dxa" w:w="4762"/>
+            <w:vAlign w:val="center"/>
+            <w:tcMar>
+              <w:top w:w="85" w:type="dxa"/>
+              <w:left w:w="85" w:type="dxa"/>
+              <w:bottom w:w="85" w:type="dxa"/>
+              <w:right w:w="85" w:type="dxa"/>
+            </w:tcMar>
+            <w:shd w:fill="FFFFFF"/>
+          </w:tcPr>
+          <w:p>
+            <w:pPr>
+              <w:spacing w:after="0" w:before="0" w:line="240" w:lineRule="auto"/>
+            </w:pPr>
+            <w:r>
+              <w:rPr>
+                <w:sz w:val="19"/>
+              </w:rPr>
+              <w:t>Многооборотный, линейный, допуск полного сопротивления ≤20%; сверить вывод движка</w:t>
+            </w:r>
+          </w:p>
+        </w:tc>
+      </w:tr>
+      <w:tr>
+        <w:trPr>
+          <w:cantSplit/>
+        </w:trPr>
+        <w:tc>
+          <w:tcPr>
+            <w:tcW w:type="dxa" w:w="1587"/>
+            <w:vAlign w:val="center"/>
+            <w:tcMar>
+              <w:top w:w="85" w:type="dxa"/>
+              <w:left w:w="85" w:type="dxa"/>
+              <w:bottom w:w="85" w:type="dxa"/>
+              <w:right w:w="85" w:type="dxa"/>
+            </w:tcMar>
+            <w:shd w:fill="F5F7F8"/>
+          </w:tcPr>
+          <w:p>
+            <w:pPr>
+              <w:spacing w:after="0" w:before="0" w:line="240" w:lineRule="auto"/>
+              <w:jc w:val="center"/>
+            </w:pPr>
+            <w:r>
+              <w:rPr>
+                <w:sz w:val="19"/>
+              </w:rPr>
+              <w:t>C1a, C2, C4</w:t>
+            </w:r>
+          </w:p>
+        </w:tc>
+        <w:tc>
+          <w:tcPr>
+            <w:tcW w:type="dxa" w:w="737"/>
+            <w:vAlign w:val="center"/>
+            <w:tcMar>
+              <w:top w:w="85" w:type="dxa"/>
+              <w:left w:w="85" w:type="dxa"/>
+              <w:bottom w:w="85" w:type="dxa"/>
+              <w:right w:w="85" w:type="dxa"/>
+            </w:tcMar>
+            <w:shd w:fill="F5F7F8"/>
+          </w:tcPr>
+          <w:p>
+            <w:pPr>
+              <w:spacing w:after="0" w:before="0" w:line="240" w:lineRule="auto"/>
+              <w:jc w:val="center"/>
+            </w:pPr>
+            <w:r>
+              <w:rPr>
+                <w:sz w:val="19"/>
+              </w:rPr>
+              <w:t>3</w:t>
+            </w:r>
+          </w:p>
+        </w:tc>
+        <w:tc>
+          <w:tcPr>
+            <w:tcW w:type="dxa" w:w="2268"/>
+            <w:vAlign w:val="center"/>
+            <w:tcMar>
+              <w:top w:w="85" w:type="dxa"/>
+              <w:left w:w="85" w:type="dxa"/>
+              <w:bottom w:w="85" w:type="dxa"/>
+              <w:right w:w="85" w:type="dxa"/>
+            </w:tcMar>
+            <w:shd w:fill="F5F7F8"/>
+          </w:tcPr>
+          <w:p>
+            <w:pPr>
+              <w:spacing w:after="0" w:before="0" w:line="240" w:lineRule="auto"/>
+            </w:pPr>
+            <w:r>
+              <w:rPr>
+                <w:sz w:val="19"/>
+              </w:rPr>
+              <w:t>10 нФ</w:t>
+            </w:r>
+          </w:p>
+        </w:tc>
+        <w:tc>
+          <w:tcPr>
+            <w:tcW w:type="dxa" w:w="4762"/>
+            <w:vAlign w:val="center"/>
+            <w:tcMar>
+              <w:top w:w="85" w:type="dxa"/>
+              <w:left w:w="85" w:type="dxa"/>
+              <w:bottom w:w="85" w:type="dxa"/>
+              <w:right w:w="85" w:type="dxa"/>
+            </w:tcMar>
+            <w:shd w:fill="F5F7F8"/>
+          </w:tcPr>
+          <w:p>
+            <w:pPr>
+              <w:spacing w:after="0" w:before="0" w:line="240" w:lineRule="auto"/>
+            </w:pPr>
+            <w:r>
+              <w:rPr>
+                <w:sz w:val="19"/>
+              </w:rPr>
+              <w:t>MKP, 5%, 50 В, выводные</w:t>
+            </w:r>
+          </w:p>
+        </w:tc>
+      </w:tr>
+      <w:tr>
+        <w:trPr>
+          <w:cantSplit/>
+        </w:trPr>
+        <w:tc>
+          <w:tcPr>
+            <w:tcW w:type="dxa" w:w="1587"/>
+            <w:vAlign w:val="center"/>
+            <w:tcMar>
+              <w:top w:w="85" w:type="dxa"/>
+              <w:left w:w="85" w:type="dxa"/>
+              <w:bottom w:w="85" w:type="dxa"/>
+              <w:right w:w="85" w:type="dxa"/>
+            </w:tcMar>
+            <w:shd w:fill="FFFFFF"/>
+          </w:tcPr>
+          <w:p>
+            <w:pPr>
+              <w:spacing w:after="0" w:before="0" w:line="240" w:lineRule="auto"/>
+              <w:jc w:val="center"/>
+            </w:pPr>
+            <w:r>
+              <w:rPr>
+                <w:sz w:val="19"/>
+              </w:rPr>
+              <w:t>C1b</w:t>
+            </w:r>
+          </w:p>
+        </w:tc>
+        <w:tc>
+          <w:tcPr>
+            <w:tcW w:type="dxa" w:w="737"/>
+            <w:vAlign w:val="center"/>
+            <w:tcMar>
+              <w:top w:w="85" w:type="dxa"/>
+              <w:left w:w="85" w:type="dxa"/>
+              <w:bottom w:w="85" w:type="dxa"/>
+              <w:right w:w="85" w:type="dxa"/>
+            </w:tcMar>
+            <w:shd w:fill="FFFFFF"/>
+          </w:tcPr>
+          <w:p>
+            <w:pPr>
+              <w:spacing w:after="0" w:before="0" w:line="240" w:lineRule="auto"/>
+              <w:jc w:val="center"/>
+            </w:pPr>
+            <w:r>
+              <w:rPr>
+                <w:sz w:val="19"/>
+              </w:rPr>
+              <w:t>1</w:t>
+            </w:r>
+          </w:p>
+        </w:tc>
+        <w:tc>
+          <w:tcPr>
+            <w:tcW w:type="dxa" w:w="2268"/>
+            <w:vAlign w:val="center"/>
+            <w:tcMar>
+              <w:top w:w="85" w:type="dxa"/>
+              <w:left w:w="85" w:type="dxa"/>
+              <w:bottom w:w="85" w:type="dxa"/>
+              <w:right w:w="85" w:type="dxa"/>
+            </w:tcMar>
+            <w:shd w:fill="FFFFFF"/>
+          </w:tcPr>
+          <w:p>
+            <w:pPr>
+              <w:spacing w:after="0" w:before="0" w:line="240" w:lineRule="auto"/>
+            </w:pPr>
+            <w:r>
+              <w:rPr>
+                <w:sz w:val="19"/>
+              </w:rPr>
+              <w:t>1,8 нФ</w:t>
+            </w:r>
+          </w:p>
+        </w:tc>
+        <w:tc>
+          <w:tcPr>
+            <w:tcW w:type="dxa" w:w="4762"/>
+            <w:vAlign w:val="center"/>
+            <w:tcMar>
+              <w:top w:w="85" w:type="dxa"/>
+              <w:left w:w="85" w:type="dxa"/>
+              <w:bottom w:w="85" w:type="dxa"/>
+              <w:right w:w="85" w:type="dxa"/>
+            </w:tcMar>
+            <w:shd w:fill="FFFFFF"/>
+          </w:tcPr>
+          <w:p>
+            <w:pPr>
+              <w:spacing w:after="0" w:before="0" w:line="240" w:lineRule="auto"/>
+            </w:pPr>
+            <w:r>
+              <w:rPr>
+                <w:sz w:val="19"/>
+              </w:rPr>
+              <w:t>MKP, 5%, 50 В, выводной</w:t>
+            </w:r>
+          </w:p>
+        </w:tc>
+      </w:tr>
+      <w:tr>
+        <w:trPr>
+          <w:cantSplit/>
+        </w:trPr>
+        <w:tc>
+          <w:tcPr>
+            <w:tcW w:type="dxa" w:w="1587"/>
+            <w:vAlign w:val="center"/>
+            <w:tcMar>
+              <w:top w:w="85" w:type="dxa"/>
+              <w:left w:w="85" w:type="dxa"/>
+              <w:bottom w:w="85" w:type="dxa"/>
+              <w:right w:w="85" w:type="dxa"/>
+            </w:tcMar>
+            <w:shd w:fill="F5F7F8"/>
+          </w:tcPr>
+          <w:p>
+            <w:pPr>
+              <w:spacing w:after="0" w:before="0" w:line="240" w:lineRule="auto"/>
+              <w:jc w:val="center"/>
+            </w:pPr>
+            <w:r>
+              <w:rPr>
+                <w:sz w:val="19"/>
+              </w:rPr>
+              <w:t>C3</w:t>
+            </w:r>
+          </w:p>
+        </w:tc>
+        <w:tc>
+          <w:tcPr>
+            <w:tcW w:type="dxa" w:w="737"/>
+            <w:vAlign w:val="center"/>
+            <w:tcMar>
+              <w:top w:w="85" w:type="dxa"/>
+              <w:left w:w="85" w:type="dxa"/>
+              <w:bottom w:w="85" w:type="dxa"/>
+              <w:right w:w="85" w:type="dxa"/>
+            </w:tcMar>
+            <w:shd w:fill="F5F7F8"/>
+          </w:tcPr>
+          <w:p>
+            <w:pPr>
+              <w:spacing w:after="0" w:before="0" w:line="240" w:lineRule="auto"/>
+              <w:jc w:val="center"/>
+            </w:pPr>
+            <w:r>
+              <w:rPr>
+                <w:sz w:val="19"/>
+              </w:rPr>
+              <w:t>1</w:t>
+            </w:r>
+          </w:p>
+        </w:tc>
+        <w:tc>
+          <w:tcPr>
+            <w:tcW w:type="dxa" w:w="2268"/>
+            <w:vAlign w:val="center"/>
+            <w:tcMar>
+              <w:top w:w="85" w:type="dxa"/>
+              <w:left w:w="85" w:type="dxa"/>
+              <w:bottom w:w="85" w:type="dxa"/>
+              <w:right w:w="85" w:type="dxa"/>
+            </w:tcMar>
+            <w:shd w:fill="F5F7F8"/>
+          </w:tcPr>
+          <w:p>
+            <w:pPr>
+              <w:spacing w:after="0" w:before="0" w:line="240" w:lineRule="auto"/>
+            </w:pPr>
+            <w:r>
+              <w:rPr>
+                <w:sz w:val="19"/>
+              </w:rPr>
+              <w:t>68 нФ</w:t>
+            </w:r>
+          </w:p>
+        </w:tc>
+        <w:tc>
+          <w:tcPr>
+            <w:tcW w:type="dxa" w:w="4762"/>
+            <w:vAlign w:val="center"/>
+            <w:tcMar>
+              <w:top w:w="85" w:type="dxa"/>
+              <w:left w:w="85" w:type="dxa"/>
+              <w:bottom w:w="85" w:type="dxa"/>
+              <w:right w:w="85" w:type="dxa"/>
+            </w:tcMar>
+            <w:shd w:fill="F5F7F8"/>
+          </w:tcPr>
+          <w:p>
+            <w:pPr>
+              <w:spacing w:after="0" w:before="0" w:line="240" w:lineRule="auto"/>
+            </w:pPr>
+            <w:r>
+              <w:rPr>
+                <w:sz w:val="19"/>
+              </w:rPr>
+              <w:t>MKP, 5%, 50 В, выводной</w:t>
+            </w:r>
+          </w:p>
+        </w:tc>
+      </w:tr>
+      <w:tr>
+        <w:trPr>
+          <w:cantSplit/>
+        </w:trPr>
+        <w:tc>
+          <w:tcPr>
+            <w:tcW w:type="dxa" w:w="1587"/>
+            <w:vAlign w:val="center"/>
+            <w:tcMar>
+              <w:top w:w="85" w:type="dxa"/>
+              <w:left w:w="85" w:type="dxa"/>
+              <w:bottom w:w="85" w:type="dxa"/>
+              <w:right w:w="85" w:type="dxa"/>
+            </w:tcMar>
+            <w:shd w:fill="FFFFFF"/>
+          </w:tcPr>
+          <w:p>
+            <w:pPr>
+              <w:spacing w:after="0" w:before="0" w:line="240" w:lineRule="auto"/>
+              <w:jc w:val="center"/>
+            </w:pPr>
+            <w:r>
+              <w:rPr>
+                <w:sz w:val="19"/>
+              </w:rPr>
+              <w:t>C5</w:t>
+            </w:r>
+          </w:p>
+        </w:tc>
+        <w:tc>
+          <w:tcPr>
+            <w:tcW w:type="dxa" w:w="737"/>
+            <w:vAlign w:val="center"/>
+            <w:tcMar>
+              <w:top w:w="85" w:type="dxa"/>
+              <w:left w:w="85" w:type="dxa"/>
+              <w:bottom w:w="85" w:type="dxa"/>
+              <w:right w:w="85" w:type="dxa"/>
+            </w:tcMar>
+            <w:shd w:fill="FFFFFF"/>
+          </w:tcPr>
+          <w:p>
+            <w:pPr>
+              <w:spacing w:after="0" w:before="0" w:line="240" w:lineRule="auto"/>
+              <w:jc w:val="center"/>
+            </w:pPr>
+            <w:r>
+              <w:rPr>
+                <w:sz w:val="19"/>
+              </w:rPr>
+              <w:t>1</w:t>
+            </w:r>
+          </w:p>
+        </w:tc>
+        <w:tc>
+          <w:tcPr>
+            <w:tcW w:type="dxa" w:w="2268"/>
+            <w:vAlign w:val="center"/>
+            <w:tcMar>
+              <w:top w:w="85" w:type="dxa"/>
+              <w:left w:w="85" w:type="dxa"/>
+              <w:bottom w:w="85" w:type="dxa"/>
+              <w:right w:w="85" w:type="dxa"/>
+            </w:tcMar>
+            <w:shd w:fill="FFFFFF"/>
+          </w:tcPr>
+          <w:p>
+            <w:pPr>
+              <w:spacing w:after="0" w:before="0" w:line="240" w:lineRule="auto"/>
+            </w:pPr>
+            <w:r>
+              <w:rPr>
+                <w:sz w:val="19"/>
+              </w:rPr>
+              <w:t>1 нФ</w:t>
+            </w:r>
+          </w:p>
+        </w:tc>
+        <w:tc>
+          <w:tcPr>
+            <w:tcW w:type="dxa" w:w="4762"/>
+            <w:vAlign w:val="center"/>
+            <w:tcMar>
+              <w:top w:w="85" w:type="dxa"/>
+              <w:left w:w="85" w:type="dxa"/>
+              <w:bottom w:w="85" w:type="dxa"/>
+              <w:right w:w="85" w:type="dxa"/>
+            </w:tcMar>
+            <w:shd w:fill="FFFFFF"/>
+          </w:tcPr>
+          <w:p>
+            <w:pPr>
+              <w:spacing w:after="0" w:before="0" w:line="240" w:lineRule="auto"/>
+            </w:pPr>
+            <w:r>
+              <w:rPr>
+                <w:sz w:val="19"/>
+              </w:rPr>
+              <w:t>C0G/NP0, 0805, 5%, ≥25 В; подтвердить паспорт</w:t>
+            </w:r>
+          </w:p>
+        </w:tc>
+      </w:tr>
+      <w:tr>
+        <w:trPr>
+          <w:cantSplit/>
+        </w:trPr>
+        <w:tc>
+          <w:tcPr>
+            <w:tcW w:type="dxa" w:w="1587"/>
+            <w:vAlign w:val="center"/>
+            <w:tcMar>
+              <w:top w:w="85" w:type="dxa"/>
+              <w:left w:w="85" w:type="dxa"/>
+              <w:bottom w:w="85" w:type="dxa"/>
+              <w:right w:w="85" w:type="dxa"/>
+            </w:tcMar>
+            <w:shd w:fill="F5F7F8"/>
+          </w:tcPr>
+          <w:p>
+            <w:pPr>
+              <w:spacing w:after="0" w:before="0" w:line="240" w:lineRule="auto"/>
+              <w:jc w:val="center"/>
+            </w:pPr>
+            <w:r>
+              <w:rPr>
+                <w:sz w:val="19"/>
+              </w:rPr>
+              <w:t>C6</w:t>
+            </w:r>
+          </w:p>
+        </w:tc>
+        <w:tc>
+          <w:tcPr>
+            <w:tcW w:type="dxa" w:w="737"/>
+            <w:vAlign w:val="center"/>
+            <w:tcMar>
+              <w:top w:w="85" w:type="dxa"/>
+              <w:left w:w="85" w:type="dxa"/>
+              <w:bottom w:w="85" w:type="dxa"/>
+              <w:right w:w="85" w:type="dxa"/>
+            </w:tcMar>
+            <w:shd w:fill="F5F7F8"/>
+          </w:tcPr>
+          <w:p>
+            <w:pPr>
+              <w:spacing w:after="0" w:before="0" w:line="240" w:lineRule="auto"/>
+              <w:jc w:val="center"/>
+            </w:pPr>
+            <w:r>
+              <w:rPr>
+                <w:sz w:val="19"/>
+              </w:rPr>
+              <w:t>1</w:t>
+            </w:r>
+          </w:p>
+        </w:tc>
+        <w:tc>
+          <w:tcPr>
+            <w:tcW w:type="dxa" w:w="2268"/>
+            <w:vAlign w:val="center"/>
+            <w:tcMar>
+              <w:top w:w="85" w:type="dxa"/>
+              <w:left w:w="85" w:type="dxa"/>
+              <w:bottom w:w="85" w:type="dxa"/>
+              <w:right w:w="85" w:type="dxa"/>
+            </w:tcMar>
+            <w:shd w:fill="F5F7F8"/>
+          </w:tcPr>
+          <w:p>
+            <w:pPr>
+              <w:spacing w:after="0" w:before="0" w:line="240" w:lineRule="auto"/>
+            </w:pPr>
+            <w:r>
+              <w:rPr>
+                <w:sz w:val="19"/>
+              </w:rPr>
+              <w:t>100 нФ</w:t>
+            </w:r>
+          </w:p>
+        </w:tc>
+        <w:tc>
+          <w:tcPr>
+            <w:tcW w:type="dxa" w:w="4762"/>
+            <w:vAlign w:val="center"/>
+            <w:tcMar>
+              <w:top w:w="85" w:type="dxa"/>
+              <w:left w:w="85" w:type="dxa"/>
+              <w:bottom w:w="85" w:type="dxa"/>
+              <w:right w:w="85" w:type="dxa"/>
+            </w:tcMar>
+            <w:shd w:fill="F5F7F8"/>
+          </w:tcPr>
+          <w:p>
+            <w:pPr>
+              <w:spacing w:after="0" w:before="0" w:line="240" w:lineRule="auto"/>
+            </w:pPr>
+            <w:r>
+              <w:rPr>
+                <w:sz w:val="19"/>
+              </w:rPr>
+              <w:t>X7R, 0805, 25 В, допуск ≤20%</w:t>
+            </w:r>
+          </w:p>
+        </w:tc>
+      </w:tr>
+      <w:tr>
+        <w:trPr>
+          <w:cantSplit/>
+        </w:trPr>
+        <w:tc>
+          <w:tcPr>
+            <w:tcW w:type="dxa" w:w="1587"/>
+            <w:vAlign w:val="center"/>
+            <w:tcMar>
+              <w:top w:w="85" w:type="dxa"/>
+              <w:left w:w="85" w:type="dxa"/>
+              <w:bottom w:w="85" w:type="dxa"/>
+              <w:right w:w="85" w:type="dxa"/>
+            </w:tcMar>
+            <w:shd w:fill="FFFFFF"/>
+          </w:tcPr>
+          <w:p>
+            <w:pPr>
+              <w:spacing w:after="0" w:before="0" w:line="240" w:lineRule="auto"/>
+              <w:jc w:val="center"/>
+            </w:pPr>
+            <w:r>
+              <w:rPr>
+                <w:sz w:val="19"/>
+              </w:rPr>
+              <w:t>C7</w:t>
+            </w:r>
+          </w:p>
+        </w:tc>
+        <w:tc>
+          <w:tcPr>
+            <w:tcW w:type="dxa" w:w="737"/>
+            <w:vAlign w:val="center"/>
+            <w:tcMar>
+              <w:top w:w="85" w:type="dxa"/>
+              <w:left w:w="85" w:type="dxa"/>
+              <w:bottom w:w="85" w:type="dxa"/>
+              <w:right w:w="85" w:type="dxa"/>
+            </w:tcMar>
+            <w:shd w:fill="FFFFFF"/>
+          </w:tcPr>
+          <w:p>
+            <w:pPr>
+              <w:spacing w:after="0" w:before="0" w:line="240" w:lineRule="auto"/>
+              <w:jc w:val="center"/>
+            </w:pPr>
+            <w:r>
+              <w:rPr>
+                <w:sz w:val="19"/>
+              </w:rPr>
+              <w:t>1</w:t>
+            </w:r>
+          </w:p>
+        </w:tc>
+        <w:tc>
+          <w:tcPr>
+            <w:tcW w:type="dxa" w:w="2268"/>
+            <w:vAlign w:val="center"/>
+            <w:tcMar>
+              <w:top w:w="85" w:type="dxa"/>
+              <w:left w:w="85" w:type="dxa"/>
+              <w:bottom w:w="85" w:type="dxa"/>
+              <w:right w:w="85" w:type="dxa"/>
+            </w:tcMar>
+            <w:shd w:fill="FFFFFF"/>
+          </w:tcPr>
+          <w:p>
+            <w:pPr>
+              <w:spacing w:after="0" w:before="0" w:line="240" w:lineRule="auto"/>
+            </w:pPr>
+            <w:r>
+              <w:rPr>
+                <w:sz w:val="19"/>
+              </w:rPr>
+              <w:t>1 мкФ</w:t>
+            </w:r>
+          </w:p>
+        </w:tc>
+        <w:tc>
+          <w:tcPr>
+            <w:tcW w:type="dxa" w:w="4762"/>
+            <w:vAlign w:val="center"/>
+            <w:tcMar>
+              <w:top w:w="85" w:type="dxa"/>
+              <w:left w:w="85" w:type="dxa"/>
+              <w:bottom w:w="85" w:type="dxa"/>
+              <w:right w:w="85" w:type="dxa"/>
+            </w:tcMar>
+            <w:shd w:fill="FFFFFF"/>
+          </w:tcPr>
+          <w:p>
+            <w:pPr>
+              <w:spacing w:after="0" w:before="0" w:line="240" w:lineRule="auto"/>
+            </w:pPr>
+            <w:r>
+              <w:rPr>
+                <w:sz w:val="19"/>
+              </w:rPr>
+              <w:t>X7R, 1206, 25 В, допуск ≤20%</w:t>
+            </w:r>
+          </w:p>
+        </w:tc>
+      </w:tr>
+    </w:tbl>
+    <w:p>
+      <w:pPr>
+        <w:spacing w:after="0"/>
+      </w:pPr>
+    </w:p>
+    <w:p>
+      <w:r>
+        <w:t xml:space="preserve">Итого: </w:t>
+      </w:r>
+      <w:r>
+        <w:rPr>
+          <w:b/>
+        </w:rPr>
+        <w:t>1 микросхема + 12 постоянных резисторов + 1 RV1 + 8 конденсаторов = 22 электронные детали</w:t>
+      </w:r>
+      <w:r>
+        <w:t>. Восемь конденсаторов получаются потому, что C1 собран из C1a и C1b. C6 и C7 устанавливаются возле выводов питания U1.</w:t>
+      </w:r>
+    </w:p>
+    <w:p>
+      <w:r>
+        <w:t>Корпус TLV9064QDRQ1 — SOIC-14, а не DIP. Нужен переходник под узкий SOIC-14 с шириной корпуса около 3,9 мм и шагом 1,27 мм; внешний ряд переходника — 2,54 мм. Суффикс Q1 означает автомобильную квалификацию компонента, но не подтверждает пригодность всего нашего входа для автомобиля [1].</w:t>
+      </w:r>
+    </w:p>
+    <w:p>
+      <w:pPr>
+        <w:pStyle w:val="Heading1"/>
+        <w:pageBreakBefore/>
+      </w:pPr>
+      <w:r>
+        <w:t>6г Разъёмы монтаж и расходные материалы</w:t>
+      </w:r>
+    </w:p>
+    <w:p>
+      <w:r>
+        <w:t>Таблица дополняет предыдущую: без неё электронные детали не образуют макет. Выберите один согласованный тип двухконтактных разъёмов; разные варианты не нужно покупать одновременно.</w:t>
+      </w:r>
+    </w:p>
+    <w:tbl>
+      <w:tblPr>
+        <w:tblW w:type="auto" w:w="0"/>
+        <w:jc w:val="center"/>
+        <w:tblLayout w:type="fixed"/>
+        <w:tblLook w:firstColumn="1" w:firstRow="1" w:lastColumn="0" w:lastRow="0" w:noHBand="0" w:noVBand="1" w:val="04A0"/>
+        <w:tblBorders>
+          <w:top w:val="single" w:sz="4" w:color="D9D9D9"/>
+          <w:left w:val="single" w:sz="4" w:color="D9D9D9"/>
+          <w:bottom w:val="single" w:sz="4" w:color="D9D9D9"/>
+          <w:right w:val="single" w:sz="4" w:color="D9D9D9"/>
+          <w:insideH w:val="single" w:sz="4" w:color="D9D9D9"/>
+          <w:insideV w:val="single" w:sz="4" w:color="D9D9D9"/>
+        </w:tblBorders>
+      </w:tblPr>
+      <w:tblGrid>
+        <w:gridCol w:w="2551"/>
+        <w:gridCol w:w="1134"/>
+        <w:gridCol w:w="5669"/>
+      </w:tblGrid>
+      <w:tr>
+        <w:trPr>
+          <w:cantSplit/>
+          <w:tblHeader/>
+        </w:trPr>
+        <w:tc>
+          <w:tcPr>
+            <w:tcW w:type="dxa" w:w="2551"/>
+            <w:vAlign w:val="center"/>
+            <w:tcMar>
+              <w:top w:w="85" w:type="dxa"/>
+              <w:left w:w="85" w:type="dxa"/>
+              <w:bottom w:w="85" w:type="dxa"/>
+              <w:right w:w="85" w:type="dxa"/>
+            </w:tcMar>
+            <w:shd w:fill="DFEAF0"/>
+          </w:tcPr>
+          <w:p>
+            <w:pPr>
+              <w:spacing w:after="0" w:before="0" w:line="240" w:lineRule="auto"/>
+            </w:pPr>
+            <w:r>
+              <w:rPr>
+                <w:b/>
+                <w:sz w:val="19"/>
+              </w:rPr>
+              <w:t>Материал</w:t>
+            </w:r>
+          </w:p>
+        </w:tc>
+        <w:tc>
+          <w:tcPr>
+            <w:tcW w:type="dxa" w:w="1134"/>
+            <w:vAlign w:val="center"/>
+            <w:tcMar>
+              <w:top w:w="85" w:type="dxa"/>
+              <w:left w:w="85" w:type="dxa"/>
+              <w:bottom w:w="85" w:type="dxa"/>
+              <w:right w:w="85" w:type="dxa"/>
+            </w:tcMar>
+            <w:shd w:fill="DFEAF0"/>
+          </w:tcPr>
+          <w:p>
+            <w:pPr>
+              <w:spacing w:after="0" w:before="0" w:line="240" w:lineRule="auto"/>
+              <w:jc w:val="center"/>
+            </w:pPr>
+            <w:r>
+              <w:rPr>
+                <w:b/>
+                <w:sz w:val="19"/>
+              </w:rPr>
+              <w:t>Нужно</w:t>
+            </w:r>
+          </w:p>
+        </w:tc>
+        <w:tc>
+          <w:tcPr>
+            <w:tcW w:type="dxa" w:w="5669"/>
+            <w:vAlign w:val="center"/>
+            <w:tcMar>
+              <w:top w:w="85" w:type="dxa"/>
+              <w:left w:w="85" w:type="dxa"/>
+              <w:bottom w:w="85" w:type="dxa"/>
+              <w:right w:w="85" w:type="dxa"/>
+            </w:tcMar>
+            <w:shd w:fill="DFEAF0"/>
+          </w:tcPr>
+          <w:p>
+            <w:pPr>
+              <w:spacing w:after="0" w:before="0" w:line="240" w:lineRule="auto"/>
+            </w:pPr>
+            <w:r>
+              <w:rPr>
+                <w:b/>
+                <w:sz w:val="19"/>
+              </w:rPr>
+              <w:t>Как выбрать и для чего</w:t>
+            </w:r>
+          </w:p>
+        </w:tc>
+      </w:tr>
+      <w:tr>
+        <w:trPr>
+          <w:cantSplit/>
+        </w:trPr>
+        <w:tc>
+          <w:tcPr>
+            <w:tcW w:type="dxa" w:w="2551"/>
+            <w:vAlign w:val="center"/>
+            <w:tcMar>
+              <w:top w:w="85" w:type="dxa"/>
+              <w:left w:w="85" w:type="dxa"/>
+              <w:bottom w:w="85" w:type="dxa"/>
+              <w:right w:w="85" w:type="dxa"/>
+            </w:tcMar>
+            <w:shd w:fill="FFFFFF"/>
+          </w:tcPr>
+          <w:p>
+            <w:pPr>
+              <w:spacing w:after="0" w:before="0" w:line="240" w:lineRule="auto"/>
+            </w:pPr>
+            <w:r>
+              <w:rPr>
+                <w:sz w:val="19"/>
+              </w:rPr>
+              <w:t>Переходник SOIC-14 → DIP-14</w:t>
+            </w:r>
+          </w:p>
+        </w:tc>
+        <w:tc>
+          <w:tcPr>
+            <w:tcW w:type="dxa" w:w="1134"/>
+            <w:vAlign w:val="center"/>
+            <w:tcMar>
+              <w:top w:w="85" w:type="dxa"/>
+              <w:left w:w="85" w:type="dxa"/>
+              <w:bottom w:w="85" w:type="dxa"/>
+              <w:right w:w="85" w:type="dxa"/>
+            </w:tcMar>
+            <w:shd w:fill="FFFFFF"/>
+          </w:tcPr>
+          <w:p>
+            <w:pPr>
+              <w:spacing w:after="0" w:before="0" w:line="240" w:lineRule="auto"/>
+              <w:jc w:val="center"/>
+            </w:pPr>
+            <w:r>
+              <w:rPr>
+                <w:sz w:val="19"/>
+              </w:rPr>
+              <w:t>1</w:t>
+            </w:r>
+          </w:p>
+        </w:tc>
+        <w:tc>
+          <w:tcPr>
+            <w:tcW w:type="dxa" w:w="5669"/>
+            <w:vAlign w:val="center"/>
+            <w:tcMar>
+              <w:top w:w="85" w:type="dxa"/>
+              <w:left w:w="85" w:type="dxa"/>
+              <w:bottom w:w="85" w:type="dxa"/>
+              <w:right w:w="85" w:type="dxa"/>
+            </w:tcMar>
+            <w:shd w:fill="FFFFFF"/>
+          </w:tcPr>
+          <w:p>
+            <w:pPr>
+              <w:spacing w:after="0" w:before="0" w:line="240" w:lineRule="auto"/>
+            </w:pPr>
+            <w:r>
+              <w:rPr>
+                <w:sz w:val="19"/>
+              </w:rPr>
+              <w:t>Площадки SOIC 1,27 мм, узкий корпус; вывести все 14 контактов</w:t>
+            </w:r>
+          </w:p>
+        </w:tc>
+      </w:tr>
+      <w:tr>
+        <w:trPr>
+          <w:cantSplit/>
+        </w:trPr>
+        <w:tc>
+          <w:tcPr>
+            <w:tcW w:type="dxa" w:w="2551"/>
+            <w:vAlign w:val="center"/>
+            <w:tcMar>
+              <w:top w:w="85" w:type="dxa"/>
+              <w:left w:w="85" w:type="dxa"/>
+              <w:bottom w:w="85" w:type="dxa"/>
+              <w:right w:w="85" w:type="dxa"/>
+            </w:tcMar>
+            <w:shd w:fill="F5F7F8"/>
+          </w:tcPr>
+          <w:p>
+            <w:pPr>
+              <w:spacing w:after="0" w:before="0" w:line="240" w:lineRule="auto"/>
+            </w:pPr>
+            <w:r>
+              <w:rPr>
+                <w:sz w:val="19"/>
+              </w:rPr>
+              <w:t>Паяльная макетная плата</w:t>
+            </w:r>
+          </w:p>
+        </w:tc>
+        <w:tc>
+          <w:tcPr>
+            <w:tcW w:type="dxa" w:w="1134"/>
+            <w:vAlign w:val="center"/>
+            <w:tcMar>
+              <w:top w:w="85" w:type="dxa"/>
+              <w:left w:w="85" w:type="dxa"/>
+              <w:bottom w:w="85" w:type="dxa"/>
+              <w:right w:w="85" w:type="dxa"/>
+            </w:tcMar>
+            <w:shd w:fill="F5F7F8"/>
+          </w:tcPr>
+          <w:p>
+            <w:pPr>
+              <w:spacing w:after="0" w:before="0" w:line="240" w:lineRule="auto"/>
+              <w:jc w:val="center"/>
+            </w:pPr>
+            <w:r>
+              <w:rPr>
+                <w:sz w:val="19"/>
+              </w:rPr>
+              <w:t>1</w:t>
+            </w:r>
+          </w:p>
+        </w:tc>
+        <w:tc>
+          <w:tcPr>
+            <w:tcW w:type="dxa" w:w="5669"/>
+            <w:vAlign w:val="center"/>
+            <w:tcMar>
+              <w:top w:w="85" w:type="dxa"/>
+              <w:left w:w="85" w:type="dxa"/>
+              <w:bottom w:w="85" w:type="dxa"/>
+              <w:right w:w="85" w:type="dxa"/>
+            </w:tcMar>
+            <w:shd w:fill="F5F7F8"/>
+          </w:tcPr>
+          <w:p>
+            <w:pPr>
+              <w:spacing w:after="0" w:before="0" w:line="240" w:lineRule="auto"/>
+            </w:pPr>
+            <w:r>
+              <w:rPr>
+                <w:sz w:val="19"/>
+              </w:rPr>
+              <w:t>Отдельные площадки, шаг 2,54 мм; ориентир 7 × 9 см, размер подтвердить по габаритам MKP</w:t>
+            </w:r>
+          </w:p>
+        </w:tc>
+      </w:tr>
+      <w:tr>
+        <w:trPr>
+          <w:cantSplit/>
+        </w:trPr>
+        <w:tc>
+          <w:tcPr>
+            <w:tcW w:type="dxa" w:w="2551"/>
+            <w:vAlign w:val="center"/>
+            <w:tcMar>
+              <w:top w:w="85" w:type="dxa"/>
+              <w:left w:w="85" w:type="dxa"/>
+              <w:bottom w:w="85" w:type="dxa"/>
+              <w:right w:w="85" w:type="dxa"/>
+            </w:tcMar>
+            <w:shd w:fill="FFFFFF"/>
+          </w:tcPr>
+          <w:p>
+            <w:pPr>
+              <w:spacing w:after="0" w:before="0" w:line="240" w:lineRule="auto"/>
+            </w:pPr>
+            <w:r>
+              <w:rPr>
+                <w:sz w:val="19"/>
+              </w:rPr>
+              <w:t>Штыри 2,54 мм</w:t>
+            </w:r>
+          </w:p>
+        </w:tc>
+        <w:tc>
+          <w:tcPr>
+            <w:tcW w:type="dxa" w:w="1134"/>
+            <w:vAlign w:val="center"/>
+            <w:tcMar>
+              <w:top w:w="85" w:type="dxa"/>
+              <w:left w:w="85" w:type="dxa"/>
+              <w:bottom w:w="85" w:type="dxa"/>
+              <w:right w:w="85" w:type="dxa"/>
+            </w:tcMar>
+            <w:shd w:fill="FFFFFF"/>
+          </w:tcPr>
+          <w:p>
+            <w:pPr>
+              <w:spacing w:after="0" w:before="0" w:line="240" w:lineRule="auto"/>
+              <w:jc w:val="center"/>
+            </w:pPr>
+            <w:r>
+              <w:rPr>
+                <w:sz w:val="19"/>
+              </w:rPr>
+              <w:t>33 контакта</w:t>
+            </w:r>
+          </w:p>
+        </w:tc>
+        <w:tc>
+          <w:tcPr>
+            <w:tcW w:type="dxa" w:w="5669"/>
+            <w:vAlign w:val="center"/>
+            <w:tcMar>
+              <w:top w:w="85" w:type="dxa"/>
+              <w:left w:w="85" w:type="dxa"/>
+              <w:bottom w:w="85" w:type="dxa"/>
+              <w:right w:w="85" w:type="dxa"/>
+            </w:tcMar>
+            <w:shd w:fill="FFFFFF"/>
+          </w:tcPr>
+          <w:p>
+            <w:pPr>
+              <w:spacing w:after="0" w:before="0" w:line="240" w:lineRule="auto"/>
+            </w:pPr>
+            <w:r>
+              <w:rPr>
+                <w:sz w:val="19"/>
+              </w:rPr>
+              <w:t>14 на переходник, 6 на J1/J2/J3, 5 на JP_TEST/JP_ADC, 8 на TP0–TP7; подходит одна отрезаемая линейка 1 × 40</w:t>
+            </w:r>
+          </w:p>
+        </w:tc>
+      </w:tr>
+      <w:tr>
+        <w:trPr>
+          <w:cantSplit/>
+        </w:trPr>
+        <w:tc>
+          <w:tcPr>
+            <w:tcW w:type="dxa" w:w="2551"/>
+            <w:vAlign w:val="center"/>
+            <w:tcMar>
+              <w:top w:w="85" w:type="dxa"/>
+              <w:left w:w="85" w:type="dxa"/>
+              <w:bottom w:w="85" w:type="dxa"/>
+              <w:right w:w="85" w:type="dxa"/>
+            </w:tcMar>
+            <w:shd w:fill="F5F7F8"/>
+          </w:tcPr>
+          <w:p>
+            <w:pPr>
+              <w:spacing w:after="0" w:before="0" w:line="240" w:lineRule="auto"/>
+            </w:pPr>
+            <w:r>
+              <w:rPr>
+                <w:sz w:val="19"/>
+              </w:rPr>
+              <w:t>Колпачки перемычек 2,54 мм</w:t>
+            </w:r>
+          </w:p>
+        </w:tc>
+        <w:tc>
+          <w:tcPr>
+            <w:tcW w:type="dxa" w:w="1134"/>
+            <w:vAlign w:val="center"/>
+            <w:tcMar>
+              <w:top w:w="85" w:type="dxa"/>
+              <w:left w:w="85" w:type="dxa"/>
+              <w:bottom w:w="85" w:type="dxa"/>
+              <w:right w:w="85" w:type="dxa"/>
+            </w:tcMar>
+            <w:shd w:fill="F5F7F8"/>
+          </w:tcPr>
+          <w:p>
+            <w:pPr>
+              <w:spacing w:after="0" w:before="0" w:line="240" w:lineRule="auto"/>
+              <w:jc w:val="center"/>
+            </w:pPr>
+            <w:r>
+              <w:rPr>
+                <w:sz w:val="19"/>
+              </w:rPr>
+              <w:t>2</w:t>
+            </w:r>
+          </w:p>
+        </w:tc>
+        <w:tc>
+          <w:tcPr>
+            <w:tcW w:type="dxa" w:w="5669"/>
+            <w:vAlign w:val="center"/>
+            <w:tcMar>
+              <w:top w:w="85" w:type="dxa"/>
+              <w:left w:w="85" w:type="dxa"/>
+              <w:bottom w:w="85" w:type="dxa"/>
+              <w:right w:w="85" w:type="dxa"/>
+            </w:tcMar>
+            <w:shd w:fill="F5F7F8"/>
+          </w:tcPr>
+          <w:p>
+            <w:pPr>
+              <w:spacing w:after="0" w:before="0" w:line="240" w:lineRule="auto"/>
+            </w:pPr>
+            <w:r>
+              <w:rPr>
+                <w:sz w:val="19"/>
+              </w:rPr>
+              <w:t>Один выбирает TEST/ZERO; второй для JP_ADC, до допуска хранится снятым</w:t>
+            </w:r>
+          </w:p>
+        </w:tc>
+      </w:tr>
+      <w:tr>
+        <w:trPr>
+          <w:cantSplit/>
+        </w:trPr>
+        <w:tc>
+          <w:tcPr>
+            <w:tcW w:type="dxa" w:w="2551"/>
+            <w:vAlign w:val="center"/>
+            <w:tcMar>
+              <w:top w:w="85" w:type="dxa"/>
+              <w:left w:w="85" w:type="dxa"/>
+              <w:bottom w:w="85" w:type="dxa"/>
+              <w:right w:w="85" w:type="dxa"/>
+            </w:tcMar>
+            <w:shd w:fill="FFFFFF"/>
+          </w:tcPr>
+          <w:p>
+            <w:pPr>
+              <w:spacing w:after="0" w:before="0" w:line="240" w:lineRule="auto"/>
+            </w:pPr>
+            <w:r>
+              <w:rPr>
+                <w:sz w:val="19"/>
+              </w:rPr>
+              <w:t>Ответные двухконтактные разъёмы с проводами</w:t>
+            </w:r>
+          </w:p>
+        </w:tc>
+        <w:tc>
+          <w:tcPr>
+            <w:tcW w:type="dxa" w:w="1134"/>
+            <w:vAlign w:val="center"/>
+            <w:tcMar>
+              <w:top w:w="85" w:type="dxa"/>
+              <w:left w:w="85" w:type="dxa"/>
+              <w:bottom w:w="85" w:type="dxa"/>
+              <w:right w:w="85" w:type="dxa"/>
+            </w:tcMar>
+            <w:shd w:fill="FFFFFF"/>
+          </w:tcPr>
+          <w:p>
+            <w:pPr>
+              <w:spacing w:after="0" w:before="0" w:line="240" w:lineRule="auto"/>
+              <w:jc w:val="center"/>
+            </w:pPr>
+            <w:r>
+              <w:rPr>
+                <w:sz w:val="19"/>
+              </w:rPr>
+              <w:t>3 пары</w:t>
+            </w:r>
+          </w:p>
+        </w:tc>
+        <w:tc>
+          <w:tcPr>
+            <w:tcW w:type="dxa" w:w="5669"/>
+            <w:vAlign w:val="center"/>
+            <w:tcMar>
+              <w:top w:w="85" w:type="dxa"/>
+              <w:left w:w="85" w:type="dxa"/>
+              <w:bottom w:w="85" w:type="dxa"/>
+              <w:right w:w="85" w:type="dxa"/>
+            </w:tcMar>
+            <w:shd w:fill="FFFFFF"/>
+          </w:tcPr>
+          <w:p>
+            <w:pPr>
+              <w:spacing w:after="0" w:before="0" w:line="240" w:lineRule="auto"/>
+            </w:pPr>
+            <w:r>
+              <w:rPr>
+                <w:sz w:val="19"/>
+              </w:rPr>
+              <w:t>Для J1, J2, J3; должны подходить к выбранным штырям, например гнёзда Dupont с корпусами 1 × 2</w:t>
+            </w:r>
+          </w:p>
+        </w:tc>
+      </w:tr>
+      <w:tr>
+        <w:trPr>
+          <w:cantSplit/>
+        </w:trPr>
+        <w:tc>
+          <w:tcPr>
+            <w:tcW w:type="dxa" w:w="2551"/>
+            <w:vAlign w:val="center"/>
+            <w:tcMar>
+              <w:top w:w="85" w:type="dxa"/>
+              <w:left w:w="85" w:type="dxa"/>
+              <w:bottom w:w="85" w:type="dxa"/>
+              <w:right w:w="85" w:type="dxa"/>
+            </w:tcMar>
+            <w:shd w:fill="F5F7F8"/>
+          </w:tcPr>
+          <w:p>
+            <w:pPr>
+              <w:spacing w:after="0" w:before="0" w:line="240" w:lineRule="auto"/>
+            </w:pPr>
+            <w:r>
+              <w:rPr>
+                <w:sz w:val="19"/>
+              </w:rPr>
+              <w:t>Монтажные площадки для 0805 и 1206</w:t>
+            </w:r>
+          </w:p>
+        </w:tc>
+        <w:tc>
+          <w:tcPr>
+            <w:tcW w:type="dxa" w:w="1134"/>
+            <w:vAlign w:val="center"/>
+            <w:tcMar>
+              <w:top w:w="85" w:type="dxa"/>
+              <w:left w:w="85" w:type="dxa"/>
+              <w:bottom w:w="85" w:type="dxa"/>
+              <w:right w:w="85" w:type="dxa"/>
+            </w:tcMar>
+            <w:shd w:fill="F5F7F8"/>
+          </w:tcPr>
+          <w:p>
+            <w:pPr>
+              <w:spacing w:after="0" w:before="0" w:line="240" w:lineRule="auto"/>
+              <w:jc w:val="center"/>
+            </w:pPr>
+            <w:r>
+              <w:rPr>
+                <w:sz w:val="19"/>
+              </w:rPr>
+              <w:t>По месту</w:t>
+            </w:r>
+          </w:p>
+        </w:tc>
+        <w:tc>
+          <w:tcPr>
+            <w:tcW w:type="dxa" w:w="5669"/>
+            <w:vAlign w:val="center"/>
+            <w:tcMar>
+              <w:top w:w="85" w:type="dxa"/>
+              <w:left w:w="85" w:type="dxa"/>
+              <w:bottom w:w="85" w:type="dxa"/>
+              <w:right w:w="85" w:type="dxa"/>
+            </w:tcMar>
+            <w:shd w:fill="F5F7F8"/>
+          </w:tcPr>
+          <w:p>
+            <w:pPr>
+              <w:spacing w:after="0" w:before="0" w:line="240" w:lineRule="auto"/>
+            </w:pPr>
+            <w:r>
+              <w:rPr>
+                <w:sz w:val="19"/>
+              </w:rPr>
+              <w:t>Для C5/C6/C7, если на основной плате нет подходящих площадок; C6/C7 разместить близко к U1</w:t>
+            </w:r>
+          </w:p>
+        </w:tc>
+      </w:tr>
+      <w:tr>
+        <w:trPr>
+          <w:cantSplit/>
+        </w:trPr>
+        <w:tc>
+          <w:tcPr>
+            <w:tcW w:type="dxa" w:w="2551"/>
+            <w:vAlign w:val="center"/>
+            <w:tcMar>
+              <w:top w:w="85" w:type="dxa"/>
+              <w:left w:w="85" w:type="dxa"/>
+              <w:bottom w:w="85" w:type="dxa"/>
+              <w:right w:w="85" w:type="dxa"/>
+            </w:tcMar>
+            <w:shd w:fill="FFFFFF"/>
+          </w:tcPr>
+          <w:p>
+            <w:pPr>
+              <w:spacing w:after="0" w:before="0" w:line="240" w:lineRule="auto"/>
+            </w:pPr>
+            <w:r>
+              <w:rPr>
+                <w:sz w:val="19"/>
+              </w:rPr>
+              <w:t>Тонкий изолированный монтажный провод</w:t>
+            </w:r>
+          </w:p>
+        </w:tc>
+        <w:tc>
+          <w:tcPr>
+            <w:tcW w:type="dxa" w:w="1134"/>
+            <w:vAlign w:val="center"/>
+            <w:tcMar>
+              <w:top w:w="85" w:type="dxa"/>
+              <w:left w:w="85" w:type="dxa"/>
+              <w:bottom w:w="85" w:type="dxa"/>
+              <w:right w:w="85" w:type="dxa"/>
+            </w:tcMar>
+            <w:shd w:fill="FFFFFF"/>
+          </w:tcPr>
+          <w:p>
+            <w:pPr>
+              <w:spacing w:after="0" w:before="0" w:line="240" w:lineRule="auto"/>
+              <w:jc w:val="center"/>
+            </w:pPr>
+            <w:r>
+              <w:rPr>
+                <w:sz w:val="19"/>
+              </w:rPr>
+              <w:t>Запас 1–2 м</w:t>
+            </w:r>
+          </w:p>
+        </w:tc>
+        <w:tc>
+          <w:tcPr>
+            <w:tcW w:type="dxa" w:w="5669"/>
+            <w:vAlign w:val="center"/>
+            <w:tcMar>
+              <w:top w:w="85" w:type="dxa"/>
+              <w:left w:w="85" w:type="dxa"/>
+              <w:bottom w:w="85" w:type="dxa"/>
+              <w:right w:w="85" w:type="dxa"/>
+            </w:tcMar>
+            <w:shd w:fill="FFFFFF"/>
+          </w:tcPr>
+          <w:p>
+            <w:pPr>
+              <w:spacing w:after="0" w:before="0" w:line="240" w:lineRule="auto"/>
+            </w:pPr>
+            <w:r>
+              <w:rPr>
+                <w:sz w:val="19"/>
+              </w:rPr>
+              <w:t>Ориентир 0,12…0,2 мм²; проводники короткие, особенно у ОУ и фильтра</w:t>
+            </w:r>
+          </w:p>
+        </w:tc>
+      </w:tr>
+      <w:tr>
+        <w:trPr>
+          <w:cantSplit/>
+        </w:trPr>
+        <w:tc>
+          <w:tcPr>
+            <w:tcW w:type="dxa" w:w="2551"/>
+            <w:vAlign w:val="center"/>
+            <w:tcMar>
+              <w:top w:w="85" w:type="dxa"/>
+              <w:left w:w="85" w:type="dxa"/>
+              <w:bottom w:w="85" w:type="dxa"/>
+              <w:right w:w="85" w:type="dxa"/>
+            </w:tcMar>
+            <w:shd w:fill="F5F7F8"/>
+          </w:tcPr>
+          <w:p>
+            <w:pPr>
+              <w:spacing w:after="0" w:before="0" w:line="240" w:lineRule="auto"/>
+            </w:pPr>
+            <w:r>
+              <w:rPr>
+                <w:sz w:val="19"/>
+              </w:rPr>
+              <w:t>Припой, флюс, средство очистки, оплётка</w:t>
+            </w:r>
+          </w:p>
+        </w:tc>
+        <w:tc>
+          <w:tcPr>
+            <w:tcW w:type="dxa" w:w="1134"/>
+            <w:vAlign w:val="center"/>
+            <w:tcMar>
+              <w:top w:w="85" w:type="dxa"/>
+              <w:left w:w="85" w:type="dxa"/>
+              <w:bottom w:w="85" w:type="dxa"/>
+              <w:right w:w="85" w:type="dxa"/>
+            </w:tcMar>
+            <w:shd w:fill="F5F7F8"/>
+          </w:tcPr>
+          <w:p>
+            <w:pPr>
+              <w:spacing w:after="0" w:before="0" w:line="240" w:lineRule="auto"/>
+              <w:jc w:val="center"/>
+            </w:pPr>
+            <w:r>
+              <w:rPr>
+                <w:sz w:val="19"/>
+              </w:rPr>
+              <w:t>По наличию</w:t>
+            </w:r>
+          </w:p>
+        </w:tc>
+        <w:tc>
+          <w:tcPr>
+            <w:tcW w:type="dxa" w:w="5669"/>
+            <w:vAlign w:val="center"/>
+            <w:tcMar>
+              <w:top w:w="85" w:type="dxa"/>
+              <w:left w:w="85" w:type="dxa"/>
+              <w:bottom w:w="85" w:type="dxa"/>
+              <w:right w:w="85" w:type="dxa"/>
+            </w:tcMar>
+            <w:shd w:fill="F5F7F8"/>
+          </w:tcPr>
+          <w:p>
+            <w:pPr>
+              <w:spacing w:after="0" w:before="0" w:line="240" w:lineRule="auto"/>
+            </w:pPr>
+            <w:r>
+              <w:rPr>
+                <w:sz w:val="19"/>
+              </w:rPr>
+              <w:t>После пайки убрать остатки загрязнений; не замачивать детали вопреки их паспорту</w:t>
+            </w:r>
+          </w:p>
+        </w:tc>
+      </w:tr>
+      <w:tr>
+        <w:trPr>
+          <w:cantSplit/>
+        </w:trPr>
+        <w:tc>
+          <w:tcPr>
+            <w:tcW w:type="dxa" w:w="2551"/>
+            <w:vAlign w:val="center"/>
+            <w:tcMar>
+              <w:top w:w="85" w:type="dxa"/>
+              <w:left w:w="85" w:type="dxa"/>
+              <w:bottom w:w="85" w:type="dxa"/>
+              <w:right w:w="85" w:type="dxa"/>
+            </w:tcMar>
+            <w:shd w:fill="FFFFFF"/>
+          </w:tcPr>
+          <w:p>
+            <w:pPr>
+              <w:spacing w:after="0" w:before="0" w:line="240" w:lineRule="auto"/>
+            </w:pPr>
+            <w:r>
+              <w:rPr>
+                <w:sz w:val="19"/>
+              </w:rPr>
+              <w:t>Пинцет, маленькая отвёртка, кусачки, лупа, измерительные крючки</w:t>
+            </w:r>
+          </w:p>
+        </w:tc>
+        <w:tc>
+          <w:tcPr>
+            <w:tcW w:type="dxa" w:w="1134"/>
+            <w:vAlign w:val="center"/>
+            <w:tcMar>
+              <w:top w:w="85" w:type="dxa"/>
+              <w:left w:w="85" w:type="dxa"/>
+              <w:bottom w:w="85" w:type="dxa"/>
+              <w:right w:w="85" w:type="dxa"/>
+            </w:tcMar>
+            <w:shd w:fill="FFFFFF"/>
+          </w:tcPr>
+          <w:p>
+            <w:pPr>
+              <w:spacing w:after="0" w:before="0" w:line="240" w:lineRule="auto"/>
+              <w:jc w:val="center"/>
+            </w:pPr>
+            <w:r>
+              <w:rPr>
+                <w:sz w:val="19"/>
+              </w:rPr>
+              <w:t>По наличию</w:t>
+            </w:r>
+          </w:p>
+        </w:tc>
+        <w:tc>
+          <w:tcPr>
+            <w:tcW w:type="dxa" w:w="5669"/>
+            <w:vAlign w:val="center"/>
+            <w:tcMar>
+              <w:top w:w="85" w:type="dxa"/>
+              <w:left w:w="85" w:type="dxa"/>
+              <w:bottom w:w="85" w:type="dxa"/>
+              <w:right w:w="85" w:type="dxa"/>
+            </w:tcMar>
+            <w:shd w:fill="FFFFFF"/>
+          </w:tcPr>
+          <w:p>
+            <w:pPr>
+              <w:spacing w:after="0" w:before="0" w:line="240" w:lineRule="auto"/>
+            </w:pPr>
+            <w:r>
+              <w:rPr>
+                <w:sz w:val="19"/>
+              </w:rPr>
+              <w:t>Для SMD-пайки, регулировки RV1, осмотра и подключения к контрольным точкам</w:t>
+            </w:r>
+          </w:p>
+        </w:tc>
+      </w:tr>
+      <w:tr>
+        <w:trPr>
+          <w:cantSplit/>
+        </w:trPr>
+        <w:tc>
+          <w:tcPr>
+            <w:tcW w:type="dxa" w:w="2551"/>
+            <w:vAlign w:val="center"/>
+            <w:tcMar>
+              <w:top w:w="85" w:type="dxa"/>
+              <w:left w:w="85" w:type="dxa"/>
+              <w:bottom w:w="85" w:type="dxa"/>
+              <w:right w:w="85" w:type="dxa"/>
+            </w:tcMar>
+            <w:shd w:fill="F5F7F8"/>
+          </w:tcPr>
+          <w:p>
+            <w:pPr>
+              <w:spacing w:after="0" w:before="0" w:line="240" w:lineRule="auto"/>
+            </w:pPr>
+            <w:r>
+              <w:rPr>
+                <w:sz w:val="19"/>
+              </w:rPr>
+              <w:t>Стойки, крепёж, термоусадка</w:t>
+            </w:r>
+          </w:p>
+        </w:tc>
+        <w:tc>
+          <w:tcPr>
+            <w:tcW w:type="dxa" w:w="1134"/>
+            <w:vAlign w:val="center"/>
+            <w:tcMar>
+              <w:top w:w="85" w:type="dxa"/>
+              <w:left w:w="85" w:type="dxa"/>
+              <w:bottom w:w="85" w:type="dxa"/>
+              <w:right w:w="85" w:type="dxa"/>
+            </w:tcMar>
+            <w:shd w:fill="F5F7F8"/>
+          </w:tcPr>
+          <w:p>
+            <w:pPr>
+              <w:spacing w:after="0" w:before="0" w:line="240" w:lineRule="auto"/>
+              <w:jc w:val="center"/>
+            </w:pPr>
+            <w:r>
+              <w:rPr>
+                <w:sz w:val="19"/>
+              </w:rPr>
+              <w:t>По месту</w:t>
+            </w:r>
+          </w:p>
+        </w:tc>
+        <w:tc>
+          <w:tcPr>
+            <w:tcW w:type="dxa" w:w="5669"/>
+            <w:vAlign w:val="center"/>
+            <w:tcMar>
+              <w:top w:w="85" w:type="dxa"/>
+              <w:left w:w="85" w:type="dxa"/>
+              <w:bottom w:w="85" w:type="dxa"/>
+              <w:right w:w="85" w:type="dxa"/>
+            </w:tcMar>
+            <w:shd w:fill="F5F7F8"/>
+          </w:tcPr>
+          <w:p>
+            <w:pPr>
+              <w:spacing w:after="0" w:before="0" w:line="240" w:lineRule="auto"/>
+            </w:pPr>
+            <w:r>
+              <w:rPr>
+                <w:sz w:val="19"/>
+              </w:rPr>
+              <w:t>Для фиксации и изоляции низковольтного макета; не заявляют защиту от зажигания</w:t>
+            </w:r>
+          </w:p>
+        </w:tc>
+      </w:tr>
+    </w:tbl>
+    <w:p>
+      <w:pPr>
+        <w:spacing w:after="0"/>
+      </w:pPr>
+    </w:p>
+    <w:p>
+      <w:r>
+        <w:t>Можно взять запасную микросхему и переходник, а мелкие детали покупать упаковками. Запас не включён в обязательные количества. Если вместо штырей для J1–J3 выбраны клеммники, убрать соответствующие шесть штырей и ответные гнёзда из заказа. Монтажное расположение ещё предстоит разработать по реальным габаритам.</w:t>
+      </w:r>
+    </w:p>
+    <w:p>
+      <w:r>
+        <w:rPr>
+          <w:b/>
+        </w:rPr>
+        <w:t>Для будущего датчика отдельно.</w:t>
+      </w:r>
+      <w:r>
+        <w:t xml:space="preserve"> Разъём BNC, кабель и материалы электрода не требуются для местного TEST. Тип, окончательную длину, ёмкость и изоляцию будущего датчика ещё нужно определить. Этот перечень полон для учебного P1, но не для окончательного мотортестера с датчиком. Обозначение 50 Ом у будущего коаксиального кабеля само по себе не требует входного терминатора 50 Ом.</w:t>
+      </w:r>
+    </w:p>
+    <w:p>
+      <w:r>
+        <w:t>OPA140, защита P0, высокоомные резисторы и двуполярный преобразователь пока не входят в заказ P1. Стоимость, точные товары и сроки доставки этой редакцией не проверены; бюджет проекта сохраняется до 100 000 KZT.</w:t>
       </w:r>
     </w:p>
     <w:p>
@@ -2253,7 +5176,7 @@
     </w:p>
     <w:p>
       <w:r>
-        <w:t>В P1 две активные RC-секции Sallen–Key: резисторы, конденсаторы и ОУ-повторитель [4]. Вместе они дают фильтр четвёртого порядка и сильнее ослабляют высокие частоты, чем одна RC-цепь. Новые номиналы дают частоту −3 дБ двух идеальных секций около 3,086 кГц. Это небольшое изменение относительно r1 сохраняет задачу фильтра около 3 кГц; произвольно быстрые фронты он не передаёт.</w:t>
+        <w:t>В P1 две активные RC-секции Sallen–Key: резисторы, конденсаторы и ОУ-повторитель [4]. Вместе они дают фильтр четвёртого порядка и сильнее ослабляют высокие частоты, чем одна RC-цепь. Номинально полная идеальная цепь достигает уровня полумощности, около −3 дБ, на 3,084 кГц. С допусками r3 расчётные углы дают примерно 2,898…3,279 кГц. Это расчёт при номинальной паразитной ёмкости SUM, а не измеренная полоса.</w:t>
       </w:r>
     </w:p>
     <w:tbl>
@@ -2652,7 +5575,7 @@
     </w:p>
     <w:p>
       <w:r>
-        <w:t>ОУ помогает задавать форму фильтра и развязывает его от следующей нагрузки. Соотношения ёмкостей задают характер реакции каждой секции. Вторая реагирует на фронт заметнее, поэтому полный фильтр может дать краткий выброс. Номинал 3 кГц не означает, что на 3001 Гц сигнал исчезает.</w:t>
+        <w:t>ОУ помогает задавать форму фильтра и развязывает его от следующей нагрузки. Соотношения ёмкостей задают реакцию секций. При допусках 5% возможна небольшая приподнятая область АЧХ: в проверенных углах модели максимум около +0,59 дБ. Фильтр также может дать краткий выброс после фронта. Номинал 3 кГц не означает, что на 3001 Гц сигнал исчезает.</w:t>
       </w:r>
     </w:p>
     <w:p>
@@ -2687,7 +5610,7 @@
     </w:p>
     <w:p>
       <w:r>
-        <w:t>TLV9064 получает питание V_A на выводе 4 и AGND на выводе 11. Между ними возле корпуса устанавливаются C6 100 нФ и C7 1 мкФ. Короткая местная цепь питания помогает отдавать быстрые изменения тока, не заставляя их идти по длинным проводам. Поэтому расположение этих конденсаторов имеет значение.</w:t>
+        <w:t>TLV9064QDRQ1 получает питание V_A на выводе 4 и AGND на выводе 11. Между ними возле корпуса устанавливаются C6 100 нФ и C7 1 мкФ. Короткая местная цепь питания помогает отдавать быстрые изменения тока, не заставляя их идти по длинным проводам. Поэтому расположение этих конденсаторов имеет значение.</w:t>
       </w:r>
     </w:p>
     <w:p>
@@ -3171,6 +6094,346 @@
       </w:r>
     </w:p>
     <w:p>
+      <w:r>
+        <w:t>В перебранных углах r3 с фиксированными R по 1%, RV1 до 20% и питанием 3,2…3,4 В верхний TEST составил 0,627…0,922 В. Это расчётный разброс, а не допуск измерения. Для R12 расчётный ток 0,317…0,343 мА, максимальная мощность около 1,17 мВт; номинал 0,25 Вт выбран с большим запасом по мощности.</w:t>
+      </w:r>
+    </w:p>
+    <w:p>
+      <w:pPr>
+        <w:pStyle w:val="Heading1"/>
+        <w:pageBreakBefore/>
+      </w:pPr>
+      <w:r>
+        <w:t>10 Полная схема входа и питания</w:t>
+      </w:r>
+    </w:p>
+    <w:p>
+      <w:r>
+        <w:t>На следующих трёх страницах приведены все шесть фрагментов электрического чертежа P1-LV r3. Одинаковые имена узлов означают соединение. Все постоянные R — 1%, 0,25 Вт; C1a/C1b/C2/C3/C4 — MKP 5%, 50 В; C5 — C0G 5%, не менее 25 В. U1 — одна TLV9064QDRQ1, разделённая на секции A–D.</w:t>
+      </w:r>
+    </w:p>
+    <w:p>
+      <w:pPr>
+        <w:keepNext/>
+        <w:jc w:val="center"/>
+      </w:pPr>
+      <w:r>
+        <w:drawing>
+          <wp:inline xmlns:a="http://schemas.openxmlformats.org/drawingml/2006/main" xmlns:pic="http://schemas.openxmlformats.org/drawingml/2006/picture">
+            <wp:extent cx="5760000" cy="2419956"/>
+            <wp:docPr id="7" name="Picture 7" descr="P1 r3 входные резисторы и буфер U1A"/>
+            <wp:cNvGraphicFramePr>
+              <a:graphicFrameLocks noChangeAspect="1"/>
+            </wp:cNvGraphicFramePr>
+            <a:graphic>
+              <a:graphicData uri="http://schemas.openxmlformats.org/drawingml/2006/picture">
+                <pic:pic>
+                  <pic:nvPicPr>
+                    <pic:cNvPr id="0" name="p1-schematic-input.png"/>
+                    <pic:cNvPicPr/>
+                  </pic:nvPicPr>
+                  <pic:blipFill>
+                    <a:blip r:embed="rId17"/>
+                    <a:stretch>
+                      <a:fillRect/>
+                    </a:stretch>
+                  </pic:blipFill>
+                  <pic:spPr>
+                    <a:xfrm>
+                      <a:off x="0" y="0"/>
+                      <a:ext cx="5760000" cy="2419956"/>
+                    </a:xfrm>
+                    <a:prstGeom prst="rect"/>
+                  </pic:spPr>
+                </pic:pic>
+              </a:graphicData>
+            </a:graphic>
+          </wp:inline>
+        </w:drawing>
+      </w:r>
+    </w:p>
+    <w:p>
+      <w:pPr>
+        <w:pStyle w:val="Caption"/>
+      </w:pPr>
+      <w:r>
+        <w:t>Рисунок 7. P1 r3 входные резисторы и буфер U1A.</w:t>
+      </w:r>
+    </w:p>
+    <w:p>
+      <w:pPr>
+        <w:keepNext/>
+        <w:jc w:val="center"/>
+      </w:pPr>
+      <w:r>
+        <w:drawing>
+          <wp:inline xmlns:a="http://schemas.openxmlformats.org/drawingml/2006/main" xmlns:pic="http://schemas.openxmlformats.org/drawingml/2006/picture">
+            <wp:extent cx="5760000" cy="2393766"/>
+            <wp:docPr id="8" name="Picture 8" descr="P1 r3 общее питание U1 и контрольные точки"/>
+            <wp:cNvGraphicFramePr>
+              <a:graphicFrameLocks noChangeAspect="1"/>
+            </wp:cNvGraphicFramePr>
+            <a:graphic>
+              <a:graphicData uri="http://schemas.openxmlformats.org/drawingml/2006/picture">
+                <pic:pic>
+                  <pic:nvPicPr>
+                    <pic:cNvPr id="0" name="p1-schematic-power.png"/>
+                    <pic:cNvPicPr/>
+                  </pic:nvPicPr>
+                  <pic:blipFill>
+                    <a:blip r:embed="rId18"/>
+                    <a:stretch>
+                      <a:fillRect/>
+                    </a:stretch>
+                  </pic:blipFill>
+                  <pic:spPr>
+                    <a:xfrm>
+                      <a:off x="0" y="0"/>
+                      <a:ext cx="5760000" cy="2393766"/>
+                    </a:xfrm>
+                    <a:prstGeom prst="rect"/>
+                  </pic:spPr>
+                </pic:pic>
+              </a:graphicData>
+            </a:graphic>
+          </wp:inline>
+        </w:drawing>
+      </w:r>
+    </w:p>
+    <w:p>
+      <w:pPr>
+        <w:pStyle w:val="Caption"/>
+      </w:pPr>
+      <w:r>
+        <w:t>Рисунок 8. P1 r3 общее питание U1 и контрольные точки.</w:t>
+      </w:r>
+    </w:p>
+    <w:p>
+      <w:r>
+        <w:t>Это расчётные соединения без выполненного CAD/ERC и физической приёмки. JP_ADC снята; датчик зажигания сюда не подключается. Положение деталей на рисунке не определяет монтаж на макетной плате.</w:t>
+      </w:r>
+    </w:p>
+    <w:p>
+      <w:pPr>
+        <w:pStyle w:val="Heading1"/>
+        <w:pageBreakBefore/>
+      </w:pPr>
+      <w:r>
+        <w:t>10 Полная схема фильтра</w:t>
+      </w:r>
+    </w:p>
+    <w:p>
+      <w:r>
+        <w:t>Питание всех секций U1 общее: вывод 4 к V_A, вывод 11 к AGND. На рисунках фильтра оно не повторяется. C1a и C1b подключены параллельно; C3 идёт от X2 к LP2, а не к земле.</w:t>
+      </w:r>
+    </w:p>
+    <w:p>
+      <w:pPr>
+        <w:keepNext/>
+        <w:jc w:val="center"/>
+      </w:pPr>
+      <w:r>
+        <w:drawing>
+          <wp:inline xmlns:a="http://schemas.openxmlformats.org/drawingml/2006/main" xmlns:pic="http://schemas.openxmlformats.org/drawingml/2006/picture">
+            <wp:extent cx="5760000" cy="2924114"/>
+            <wp:docPr id="9" name="Picture 9" descr="P1 r3 первая секция фильтра U1B"/>
+            <wp:cNvGraphicFramePr>
+              <a:graphicFrameLocks noChangeAspect="1"/>
+            </wp:cNvGraphicFramePr>
+            <a:graphic>
+              <a:graphicData uri="http://schemas.openxmlformats.org/drawingml/2006/picture">
+                <pic:pic>
+                  <pic:nvPicPr>
+                    <pic:cNvPr id="0" name="p1-schematic-filter1.png"/>
+                    <pic:cNvPicPr/>
+                  </pic:nvPicPr>
+                  <pic:blipFill>
+                    <a:blip r:embed="rId19"/>
+                    <a:stretch>
+                      <a:fillRect/>
+                    </a:stretch>
+                  </pic:blipFill>
+                  <pic:spPr>
+                    <a:xfrm>
+                      <a:off x="0" y="0"/>
+                      <a:ext cx="5760000" cy="2924114"/>
+                    </a:xfrm>
+                    <a:prstGeom prst="rect"/>
+                  </pic:spPr>
+                </pic:pic>
+              </a:graphicData>
+            </a:graphic>
+          </wp:inline>
+        </w:drawing>
+      </w:r>
+    </w:p>
+    <w:p>
+      <w:pPr>
+        <w:pStyle w:val="Caption"/>
+      </w:pPr>
+      <w:r>
+        <w:t>Рисунок 9. P1 r3 первая секция фильтра U1B.</w:t>
+      </w:r>
+    </w:p>
+    <w:p>
+      <w:pPr>
+        <w:keepNext/>
+        <w:jc w:val="center"/>
+      </w:pPr>
+      <w:r>
+        <w:drawing>
+          <wp:inline xmlns:a="http://schemas.openxmlformats.org/drawingml/2006/main" xmlns:pic="http://schemas.openxmlformats.org/drawingml/2006/picture">
+            <wp:extent cx="5760000" cy="2892468"/>
+            <wp:docPr id="10" name="Picture 10" descr="P1 r3 вторая секция фильтра U1C"/>
+            <wp:cNvGraphicFramePr>
+              <a:graphicFrameLocks noChangeAspect="1"/>
+            </wp:cNvGraphicFramePr>
+            <a:graphic>
+              <a:graphicData uri="http://schemas.openxmlformats.org/drawingml/2006/picture">
+                <pic:pic>
+                  <pic:nvPicPr>
+                    <pic:cNvPr id="0" name="p1-schematic-filter2.png"/>
+                    <pic:cNvPicPr/>
+                  </pic:nvPicPr>
+                  <pic:blipFill>
+                    <a:blip r:embed="rId20"/>
+                    <a:stretch>
+                      <a:fillRect/>
+                    </a:stretch>
+                  </pic:blipFill>
+                  <pic:spPr>
+                    <a:xfrm>
+                      <a:off x="0" y="0"/>
+                      <a:ext cx="5760000" cy="2892468"/>
+                    </a:xfrm>
+                    <a:prstGeom prst="rect"/>
+                  </pic:spPr>
+                </pic:pic>
+              </a:graphicData>
+            </a:graphic>
+          </wp:inline>
+        </w:drawing>
+      </w:r>
+    </w:p>
+    <w:p>
+      <w:pPr>
+        <w:pStyle w:val="Caption"/>
+      </w:pPr>
+      <w:r>
+        <w:t>Рисунок 10. P1 r3 вторая секция фильтра U1C.</w:t>
+      </w:r>
+    </w:p>
+    <w:p>
+      <w:pPr>
+        <w:pStyle w:val="Heading1"/>
+        <w:pageBreakBefore/>
+      </w:pPr>
+      <w:r>
+        <w:t>10 Полная схема TEST и выхода</w:t>
+      </w:r>
+    </w:p>
+    <w:p>
+      <w:r>
+        <w:t>В TEST/ZERO внешний J1 остаётся пустым. JP_ADC отсутствует до отдельного допуска. Указанная нумерация — электрические контакты; расположение на будущей монтажной плате предстоит выбрать и проверить.</w:t>
+      </w:r>
+    </w:p>
+    <w:p>
+      <w:pPr>
+        <w:keepNext/>
+        <w:jc w:val="center"/>
+      </w:pPr>
+      <w:r>
+        <w:drawing>
+          <wp:inline xmlns:a="http://schemas.openxmlformats.org/drawingml/2006/main" xmlns:pic="http://schemas.openxmlformats.org/drawingml/2006/picture">
+            <wp:extent cx="5760000" cy="3176193"/>
+            <wp:docPr id="11" name="Picture 11" descr="P1 r3 местный источник TEST и выбор нуля"/>
+            <wp:cNvGraphicFramePr>
+              <a:graphicFrameLocks noChangeAspect="1"/>
+            </wp:cNvGraphicFramePr>
+            <a:graphic>
+              <a:graphicData uri="http://schemas.openxmlformats.org/drawingml/2006/picture">
+                <pic:pic>
+                  <pic:nvPicPr>
+                    <pic:cNvPr id="0" name="p1-schematic-test.png"/>
+                    <pic:cNvPicPr/>
+                  </pic:nvPicPr>
+                  <pic:blipFill>
+                    <a:blip r:embed="rId21"/>
+                    <a:stretch>
+                      <a:fillRect/>
+                    </a:stretch>
+                  </pic:blipFill>
+                  <pic:spPr>
+                    <a:xfrm>
+                      <a:off x="0" y="0"/>
+                      <a:ext cx="5760000" cy="3176193"/>
+                    </a:xfrm>
+                    <a:prstGeom prst="rect"/>
+                  </pic:spPr>
+                </pic:pic>
+              </a:graphicData>
+            </a:graphic>
+          </wp:inline>
+        </w:drawing>
+      </w:r>
+    </w:p>
+    <w:p>
+      <w:pPr>
+        <w:pStyle w:val="Caption"/>
+      </w:pPr>
+      <w:r>
+        <w:t>Рисунок 11. P1 r3 местный источник TEST и выбор нуля.</w:t>
+      </w:r>
+    </w:p>
+    <w:p>
+      <w:pPr>
+        <w:keepNext/>
+        <w:jc w:val="center"/>
+      </w:pPr>
+      <w:r>
+        <w:drawing>
+          <wp:inline xmlns:a="http://schemas.openxmlformats.org/drawingml/2006/main" xmlns:pic="http://schemas.openxmlformats.org/drawingml/2006/picture">
+            <wp:extent cx="5760000" cy="3141818"/>
+            <wp:docPr id="12" name="Picture 12" descr="P1 r3 выход к АЦП и вспомогательный повторитель U1D"/>
+            <wp:cNvGraphicFramePr>
+              <a:graphicFrameLocks noChangeAspect="1"/>
+            </wp:cNvGraphicFramePr>
+            <a:graphic>
+              <a:graphicData uri="http://schemas.openxmlformats.org/drawingml/2006/picture">
+                <pic:pic>
+                  <pic:nvPicPr>
+                    <pic:cNvPr id="0" name="p1-schematic-output.png"/>
+                    <pic:cNvPicPr/>
+                  </pic:nvPicPr>
+                  <pic:blipFill>
+                    <a:blip r:embed="rId22"/>
+                    <a:stretch>
+                      <a:fillRect/>
+                    </a:stretch>
+                  </pic:blipFill>
+                  <pic:spPr>
+                    <a:xfrm>
+                      <a:off x="0" y="0"/>
+                      <a:ext cx="5760000" cy="3141818"/>
+                    </a:xfrm>
+                    <a:prstGeom prst="rect"/>
+                  </pic:spPr>
+                </pic:pic>
+              </a:graphicData>
+            </a:graphic>
+          </wp:inline>
+        </w:drawing>
+      </w:r>
+    </w:p>
+    <w:p>
+      <w:pPr>
+        <w:pStyle w:val="Caption"/>
+      </w:pPr>
+      <w:r>
+        <w:t>Рисунок 12. P1 r3 выход к АЦП и вспомогательный повторитель U1D.</w:t>
+      </w:r>
+    </w:p>
+    <w:p>
       <w:pPr>
         <w:pStyle w:val="Heading1"/>
         <w:pageBreakBefore/>
@@ -3181,7 +6444,7 @@
     </w:p>
     <w:p>
       <w:r>
-        <w:t>Эти таблицы относятся к TLV9064IDR в SOIC-14, виду сверху по паспорту [1]. Сначала найдите ключ первого вывода. На реальном переходнике следует сверить дорожки; вид снизу зеркален. Сигнальные названия ниже соответствуют расчётной схеме, а не номерам контактов неизвестной макетной платы.</w:t>
+        <w:t>Эти таблицы относятся к TLV9064QDRQ1 в SOIC-14 D, виду сверху по паспорту [1]. Распиновка совпадает с прежней TLV9064IDR, поэтому топология сохранена. Сначала найдите ключ первого вывода. На реальном переходнике следует сверить дорожки; вид снизу зеркален. Сигнальные названия ниже соответствуют расчётной схеме, а не номерам контактов неизвестной макетной платы.</w:t>
       </w:r>
     </w:p>
     <w:tbl>
@@ -6501,7 +9764,7 @@
               <w:rPr>
                 <w:sz w:val="19"/>
               </w:rPr>
-              <w:t>33 кОм · 5%*</w:t>
+              <w:t>33 кОм · 1%</w:t>
             </w:r>
           </w:p>
         </w:tc>
@@ -6707,7 +9970,7 @@
               <w:rPr>
                 <w:sz w:val="19"/>
               </w:rPr>
-              <w:t>1 кОм · 5%*</w:t>
+              <w:t>1 кОм · 1%</w:t>
             </w:r>
           </w:p>
         </w:tc>
@@ -6810,7 +10073,7 @@
               <w:rPr>
                 <w:sz w:val="19"/>
               </w:rPr>
-              <w:t>10 кОм · 5%*</w:t>
+              <w:t>10 кОм · 1%</w:t>
             </w:r>
           </w:p>
         </w:tc>
@@ -6974,7 +10237,7 @@
     </w:p>
     <w:p>
       <w:r>
-        <w:t>*R10–R12 отбираются по разделу 6б; готовые 1% тех же номиналов также подходят. RV1 — 10 кОм, многооборотный линейный, до 20%; он не входит в 12 постоянных резисторов.</w:t>
+        <w:t>Все постоянные R — 1%, 0,25 Вт. RV1 — 10 кОм, многооборотный линейный, до 20%; он не входит в 12 постоянных резисторов. Типы и допуски всех конденсаторов приведены в полном перечне раздела 6в.</w:t>
       </w:r>
     </w:p>
     <w:p>
@@ -6989,7 +10252,7 @@
     </w:p>
     <w:p>
       <w:r>
-        <w:t>На схеме P1 обозначения U1A…U1D относятся к одной TLV9064. У P0 нумерация другая: U1 — OPA140, U2 — TLV9064. Смешивать номера деталей разных вариантов нельзя.</w:t>
+        <w:t>На схеме P1 обозначения U1A…U1D относятся к одной TLV9064QDRQ1. У P0 нумерация другая: U1 — OPA140, U2 — TLV9064. Смешивать номера деталей разных вариантов нельзя.</w:t>
       </w:r>
     </w:p>
     <w:p>
@@ -7065,7 +10328,7 @@
         <w:drawing>
           <wp:inline xmlns:a="http://schemas.openxmlformats.org/drawingml/2006/main" xmlns:pic="http://schemas.openxmlformats.org/drawingml/2006/picture">
             <wp:extent cx="5760000" cy="4212000"/>
-            <wp:docPr id="7" name="Picture 7" descr="Функциональные узлы расчётного высокоомного P0"/>
+            <wp:docPr id="13" name="Picture 13" descr="Функциональные узлы расчётного высокоомного P0"/>
             <wp:cNvGraphicFramePr>
               <a:graphicFrameLocks noChangeAspect="1"/>
             </wp:cNvGraphicFramePr>
@@ -7077,7 +10340,7 @@
                     <pic:cNvPicPr/>
                   </pic:nvPicPr>
                   <pic:blipFill>
-                    <a:blip r:embed="rId17"/>
+                    <a:blip r:embed="rId23"/>
                     <a:stretch>
                       <a:fillRect/>
                     </a:stretch>
@@ -7101,7 +10364,7 @@
         <w:pStyle w:val="Caption"/>
       </w:pPr>
       <w:r>
-        <w:t>Рисунок 7. Функциональные узлы расчётного высокоомного P0.</w:t>
+        <w:t>Рисунок 13. Функциональные узлы расчётного высокоомного P0.</w:t>
       </w:r>
     </w:p>
     <w:p>
@@ -7174,7 +10437,7 @@
     </w:p>
     <w:p>
       <w:r>
-        <w:t>После усиления идут две секции Sallen–Key той же топологии и выход 330 Ом / 1 нФ. У P0 они занимают U2C/U2D и сохраняют собственные номиналы: по 4,87 кОм и по 2,03 кОм. Связи деталей приведены в отдельном netlist P0; новые номиналы P1 r2 и его номера выводов сюда не переносятся.</w:t>
+        <w:t>После усиления идут две секции Sallen–Key той же топологии и выход 330 Ом / 1 нФ. У P0 они занимают U2C/U2D и сохраняют собственные номиналы: по 4,87 кОм и по 2,03 кОм. Связи деталей приведены в отдельном netlist P0; номиналы и допуски P1 r3 и его номера выводов сюда не переносятся.</w:t>
       </w:r>
     </w:p>
     <w:p>
@@ -7260,7 +10523,7 @@
         <w:t>Подготовка деталей и монтажа.</w:t>
       </w:r>
       <w:r>
-        <w:t xml:space="preserve"> Сверяем конкретные модели, корпус TLV9064, допуски и диэлектрики. R10–R12 с допуском 5% отбираем до пайки по разделу 6б. Переносим соединения в редактируемую электрическую схему, проверяем выводы и соединения, затем готовим монтаж. Формальная электрическая проверка схемы называется ERC; она обнаруживает часть ошибок соединений, но не доказывает правильную аналоговую характеристику.</w:t>
+        <w:t xml:space="preserve"> Сверяем TLV9064QDRQ1, переходник, все постоянные R 1%, MKP 5% и отдельный C5 C0G по разделам 6а–6г. Записываем конкретные серии и габариты. Переносим соединения в редактируемую электрическую схему, проверяем выводы и соединения, затем готовим монтаж. Формальная электрическая проверка схемы называется ERC; она обнаруживает часть ошибок соединений, но не доказывает правильную аналоговую характеристику.</w:t>
       </w:r>
     </w:p>
     <w:p>
@@ -8072,12 +11335,12 @@
     </w:p>
     <w:p>
       <w:r>
-        <w:t>Первое действие — выбрать доступные детали по подробному списку materials-ru.md и проверить их паспорта. Не требуется сразу покупать датчик, кабель, ±15 В или компоненты P0. Сначала определяется состав одного P1-LV и способ его аккуратного монтажа.</w:t>
+        <w:t>Первое действие — сверить имеющиеся детали с полным списком разделов 6в–6г и записать маркировки, размеры и шаг выводов. Полная схема и карта соединений находятся в разделе 10. Для одного P1-LV достаточно этого перечня; закупка компонентов P0 не требуется.</w:t>
       </w:r>
     </w:p>
     <w:p>
       <w:r>
-        <w:t>Для продолжения понадобятся точные товары TLV9064IDR и переходника, доступные резисторы и конденсаторы, сверка найденной инструкции с вашим RICHMETERS 102 и сведения о конкретной STM32-плате. Для R10–R12 запишите результаты отбора. После этого можно выпускать монтажное руководство с расположением контактов и конкретным питанием.</w:t>
+        <w:t>Для продолжения нужны точные товары TLV9064QDRQ1 и переходника, серии R1–R4 с TCR, габариты MKP, паспорт C5 и сведения о конкретной STM32-плате. Инструкцию RICHMETERS 102 следует сверить с экземпляром. После этого можно выпускать монтажное руководство с расположением контактов и конкретным питанием. Электрическая схема сама по себе не определяет, в какое отверстие макетной платы паять каждый вывод.</w:t>
       </w:r>
     </w:p>
     <w:p>
@@ -8985,9 +12248,20 @@
     </w:p>
     <w:p>
       <w:r>
-        <w:t xml:space="preserve">1. TI TLV9064, SBOS839N Rev N. Корпус, выводы, питание и условия работы ОУ. </w:t>
+        <w:t xml:space="preserve">1. TI TLV9064-Q1, SBOS966H Rev H. Для выбранной TLV9064QDRQ1: SOIC-14 D, выводы, питание и условия работы; рис. 7-5 и таблица 7-4. </w:t>
       </w:r>
-      <w:hyperlink r:id="rId18">
+      <w:hyperlink r:id="rId24">
+        <w:r>
+          <w:rPr>
+            <w:color w:val="006A76"/>
+          </w:rPr>
+          <w:t>Открыть источник</w:t>
+        </w:r>
+      </w:hyperlink>
+      <w:r>
+        <w:t xml:space="preserve"> Точный артикул: </w:t>
+      </w:r>
+      <w:hyperlink r:id="rId25">
         <w:r>
           <w:rPr>
             <w:color w:val="006A76"/>
@@ -9000,7 +12274,7 @@
       <w:r>
         <w:t xml:space="preserve">2. TI OPA140, SBOS498F. Основания выбора высокоомного буфера и требования к питанию. </w:t>
       </w:r>
-      <w:hyperlink r:id="rId19">
+      <w:hyperlink r:id="rId26">
         <w:r>
           <w:rPr>
             <w:color w:val="006A76"/>
@@ -9013,7 +12287,7 @@
       <w:r>
         <w:t xml:space="preserve">3. ST STM32F103x8/xB, DS5319 Rev 20. АЦП, опора, аналоговый вход и электрические условия. </w:t>
       </w:r>
-      <w:hyperlink r:id="rId20">
+      <w:hyperlink r:id="rId27">
         <w:r>
           <w:rPr>
             <w:color w:val="006A76"/>
@@ -9026,7 +12300,7 @@
       <w:r>
         <w:t xml:space="preserve">4. TI Analysis of the Sallen Key Architecture, SLOA024B. Принцип активного фильтра. </w:t>
       </w:r>
-      <w:hyperlink r:id="rId21">
+      <w:hyperlink r:id="rId28">
         <w:r>
           <w:rPr>
             <w:color w:val="006A76"/>
@@ -9039,7 +12313,7 @@
       <w:r>
         <w:t xml:space="preserve">5. ST AN2834. Влияние источника, выборки, питания и опоры на АЦП. </w:t>
       </w:r>
-      <w:hyperlink r:id="rId22">
+      <w:hyperlink r:id="rId29">
         <w:r>
           <w:rPr>
             <w:color w:val="006A76"/>
@@ -9052,7 +12326,7 @@
       <w:r>
         <w:t xml:space="preserve">6. TI SLVAEX7A. Подпитка цепей при разных состояниях питания. </w:t>
       </w:r>
-      <w:hyperlink r:id="rId23">
+      <w:hyperlink r:id="rId30">
         <w:r>
           <w:rPr>
             <w:color w:val="006A76"/>
@@ -9065,7 +12339,7 @@
       <w:r>
         <w:t xml:space="preserve">7. Motor Master DiSco2. Официальное описание режимов осциллографа. </w:t>
       </w:r>
-      <w:hyperlink r:id="rId24">
+      <w:hyperlink r:id="rId31">
         <w:r>
           <w:rPr>
             <w:color w:val="006A76"/>
@@ -9078,7 +12352,20 @@
       <w:r>
         <w:t xml:space="preserve">8. RM101/RM102 User Manual. Пределы и погрешность измерения сопротивления; публичная копия инструкции. Применимость к конкретному прибору пользователя требуется сверить. </w:t>
       </w:r>
-      <w:hyperlink r:id="rId25">
+      <w:hyperlink r:id="rId32">
+        <w:r>
+          <w:rPr>
+            <w:color w:val="006A76"/>
+          </w:rPr>
+          <w:t>Открыть источник</w:t>
+        </w:r>
+      </w:hyperlink>
+    </w:p>
+    <w:p>
+      <w:r>
+        <w:t xml:space="preserve">9. Murata. Зависимость ёмкости керамических конденсаторов от постоянного напряжения и различие диэлектриков. </w:t>
+      </w:r>
+      <w:hyperlink r:id="rId33">
         <w:r>
           <w:rPr>
             <w:color w:val="006A76"/>
@@ -9734,7 +13021,7 @@
       <w:rPr>
         <w:sz w:val="18"/>
       </w:rPr>
-      <w:t xml:space="preserve">Редакция 2   •   </w:t>
+      <w:t xml:space="preserve">Редакция 3   •   </w:t>
     </w:r>
     <w:fldSimple w:instr="PAGE"/>
   </w:p>

</xml_diff>